<commit_message>
Szuperteszt kódolása, illetve dokumentálása
</commit_message>
<xml_diff>
--- a/FejlesztőisablonWIP.docx
+++ b/FejlesztőisablonWIP.docx
@@ -141,7 +141,7 @@
               </wp:anchor>
             </w:drawing>
           </mc:Choice>
-          <mc:Fallback xmlns:a="http://schemas.openxmlformats.org/drawingml/2006/main" xmlns:pic="http://schemas.openxmlformats.org/drawingml/2006/picture" xmlns:a14="http://schemas.microsoft.com/office/drawing/2010/main">
+          <mc:Fallback xmlns:a14="http://schemas.microsoft.com/office/drawing/2010/main" xmlns:pic="http://schemas.openxmlformats.org/drawingml/2006/picture" xmlns:a="http://schemas.openxmlformats.org/drawingml/2006/main">
             <w:pict>
               <v:shape id="Derékszögű háromszög 7" style="position:absolute;margin-left:0;margin-top:-70.65pt;width:190.5pt;height:190.5pt;rotation:90;z-index:251660288;visibility:visible;mso-wrap-style:square;mso-width-percent:0;mso-wrap-distance-left:9pt;mso-wrap-distance-top:0;mso-wrap-distance-right:9pt;mso-wrap-distance-bottom:0;mso-position-horizontal:left;mso-position-horizontal-relative:page;mso-position-vertical:absolute;mso-position-vertical-relative:text;mso-width-percent:0;mso-width-relative:margin;v-text-anchor:middle" coordsize="2419350,2419350" o:spid="_x0000_s1026" fillcolor="#ed7d31 [3205]" stroked="f" strokeweight="1pt" path="m,2419350l,c806450,806450,-382154,2206666,2419350,2419350l,2419350xe" o:gfxdata="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" w14:anchorId="022CF62E">
                 <v:stroke joinstyle="miter"/>
@@ -1114,7 +1114,7 @@
               </wp:anchor>
             </w:drawing>
           </mc:Choice>
-          <mc:Fallback xmlns:a="http://schemas.openxmlformats.org/drawingml/2006/main" xmlns:pic="http://schemas.openxmlformats.org/drawingml/2006/picture" xmlns:a14="http://schemas.microsoft.com/office/drawing/2010/main">
+          <mc:Fallback xmlns:a14="http://schemas.microsoft.com/office/drawing/2010/main" xmlns:pic="http://schemas.openxmlformats.org/drawingml/2006/picture" xmlns:a="http://schemas.openxmlformats.org/drawingml/2006/main">
             <w:pict>
               <v:shape id="Derékszögű háromszög 7" style="position:absolute;margin-left:-86.55pt;margin-top:-71.05pt;width:190.5pt;height:190.5pt;rotation:90;z-index:251662336;visibility:visible;mso-wrap-style:square;mso-width-percent:0;mso-wrap-distance-left:9pt;mso-wrap-distance-top:0;mso-wrap-distance-right:9pt;mso-wrap-distance-bottom:0;mso-position-horizontal:absolute;mso-position-horizontal-relative:text;mso-position-vertical:absolute;mso-position-vertical-relative:text;mso-width-percent:0;mso-width-relative:margin;v-text-anchor:middle" coordsize="2419350,2419350" o:spid="_x0000_s1026" fillcolor="#ed7d31 [3205]" stroked="f" strokeweight="1pt" path="m,2419350l,c806450,806450,-382154,2206666,2419350,2419350l,2419350xe" o:gfxdata="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" w14:anchorId="76C634DC">
                 <v:stroke joinstyle="miter"/>
@@ -1149,7 +1149,15 @@
         <w:t xml:space="preserve">A </w:t>
       </w:r>
       <w:r>
-        <w:t>weboldalt, csak a regisztráció, illetve az adminok által jóváhagyást követően lehet használni</w:t>
+        <w:t xml:space="preserve">weboldalt, csak a regisztráció, illetve az </w:t>
+      </w:r>
+      <w:proofErr w:type="spellStart"/>
+      <w:r>
+        <w:t>adminok</w:t>
+      </w:r>
+      <w:proofErr w:type="spellEnd"/>
+      <w:r>
+        <w:t xml:space="preserve"> által jóváhagyást követően lehet használni</w:t>
       </w:r>
       <w:r>
         <w:t xml:space="preserve">. </w:t>
@@ -1158,7 +1166,15 @@
         <w:t>A szükséges adatok: Felhasználónév, Lakcím, Email, Jelszó, Jelszó megint</w:t>
       </w:r>
       <w:r>
-        <w:t xml:space="preserve">. A Jelszót nem rögzítjük, egy úgynevezett HASH technikával titkosítjuk, melyet egy </w:t>
+        <w:t xml:space="preserve">. A Jelszót nem rögzítjük, egy úgynevezett HASH technikával </w:t>
+      </w:r>
+      <w:proofErr w:type="spellStart"/>
+      <w:r>
+        <w:t>titkosítjuk</w:t>
+      </w:r>
+      <w:proofErr w:type="spellEnd"/>
+      <w:r>
+        <w:t xml:space="preserve">, melyet egy </w:t>
       </w:r>
       <w:r>
         <w:t>modul generál, és azt tároljuk el</w:t>
@@ -1317,7 +1333,7 @@
               </wp:anchor>
             </w:drawing>
           </mc:Choice>
-          <mc:Fallback xmlns:a="http://schemas.openxmlformats.org/drawingml/2006/main" xmlns:pic="http://schemas.openxmlformats.org/drawingml/2006/picture" xmlns:a14="http://schemas.microsoft.com/office/drawing/2010/main">
+          <mc:Fallback xmlns:a14="http://schemas.microsoft.com/office/drawing/2010/main" xmlns:pic="http://schemas.openxmlformats.org/drawingml/2006/picture" xmlns:a="http://schemas.openxmlformats.org/drawingml/2006/main">
             <w:pict>
               <v:shape id="Derékszögű háromszög 7" style="position:absolute;margin-left:0;margin-top:-71.15pt;width:190.5pt;height:190.5pt;rotation:90;z-index:251664384;visibility:visible;mso-wrap-style:square;mso-width-percent:0;mso-wrap-distance-left:9pt;mso-wrap-distance-top:0;mso-wrap-distance-right:9pt;mso-wrap-distance-bottom:0;mso-position-horizontal:left;mso-position-horizontal-relative:page;mso-position-vertical:absolute;mso-position-vertical-relative:text;mso-width-percent:0;mso-width-relative:margin;v-text-anchor:middle" coordsize="2419350,2419350" o:spid="_x0000_s1026" fillcolor="#ed7d31 [3205]" stroked="f" strokeweight="1pt" path="m,2419350l,c806450,806450,-382154,2206666,2419350,2419350l,2419350xe" o:gfxdata="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" w14:anchorId="2E1CBD0A">
                 <v:stroke joinstyle="miter"/>
@@ -1383,6 +1399,7 @@
         <w:spacing w:before="0" w:beforeAutospacing="0" w:after="0" w:afterAutospacing="0"/>
         <w:ind w:left="720"/>
       </w:pPr>
+      <w:proofErr w:type="gramStart"/>
       <w:r>
         <w:rPr>
           <w:rFonts w:hAnsi="Symbol"/>
@@ -1396,10 +1413,25 @@
         <w:rPr>
           <w:rStyle w:val="Kiemels2"/>
         </w:rPr>
-        <w:t>Minimum:</w:t>
-      </w:r>
-      <w:r>
-        <w:t xml:space="preserve"> 1–2 magos, 1 GHz-es processzor</w:t>
+        <w:t>Minimum</w:t>
+      </w:r>
+      <w:proofErr w:type="gramEnd"/>
+      <w:r>
+        <w:rPr>
+          <w:rStyle w:val="Kiemels2"/>
+        </w:rPr>
+        <w:t>:</w:t>
+      </w:r>
+      <w:r>
+        <w:t xml:space="preserve"> 1–2 magos, 1 </w:t>
+      </w:r>
+      <w:proofErr w:type="spellStart"/>
+      <w:r>
+        <w:t>GHz</w:t>
+      </w:r>
+      <w:proofErr w:type="spellEnd"/>
+      <w:r>
+        <w:t>-es processzor</w:t>
       </w:r>
     </w:p>
     <w:p>
@@ -1408,6 +1440,7 @@
         <w:spacing w:before="0" w:beforeAutospacing="0" w:after="0" w:afterAutospacing="0"/>
         <w:ind w:left="720"/>
       </w:pPr>
+      <w:proofErr w:type="gramStart"/>
       <w:r>
         <w:rPr>
           <w:rFonts w:hAnsi="Symbol"/>
@@ -1421,10 +1454,25 @@
         <w:rPr>
           <w:rStyle w:val="Kiemels2"/>
         </w:rPr>
-        <w:t>Ajánlott:</w:t>
-      </w:r>
-      <w:r>
-        <w:t xml:space="preserve"> 2–4 magos, modern CPU (pl. Intel i3 vagy AMD Ryzen 3)</w:t>
+        <w:t>Ajánlott</w:t>
+      </w:r>
+      <w:proofErr w:type="gramEnd"/>
+      <w:r>
+        <w:rPr>
+          <w:rStyle w:val="Kiemels2"/>
+        </w:rPr>
+        <w:t>:</w:t>
+      </w:r>
+      <w:r>
+        <w:t xml:space="preserve"> 2–4 magos, modern CPU (pl. Intel i3 vagy AMD </w:t>
+      </w:r>
+      <w:proofErr w:type="spellStart"/>
+      <w:r>
+        <w:t>Ryzen</w:t>
+      </w:r>
+      <w:proofErr w:type="spellEnd"/>
+      <w:r>
+        <w:t xml:space="preserve"> 3)</w:t>
       </w:r>
     </w:p>
     <w:p>
@@ -1457,6 +1505,7 @@
         <w:spacing w:before="0" w:beforeAutospacing="0" w:after="0" w:afterAutospacing="0"/>
         <w:ind w:left="720"/>
       </w:pPr>
+      <w:proofErr w:type="gramStart"/>
       <w:r>
         <w:rPr>
           <w:rFonts w:hAnsi="Symbol"/>
@@ -1470,7 +1519,14 @@
         <w:rPr>
           <w:rStyle w:val="Kiemels2"/>
         </w:rPr>
-        <w:t>Minimum:</w:t>
+        <w:t>Minimum</w:t>
+      </w:r>
+      <w:proofErr w:type="gramEnd"/>
+      <w:r>
+        <w:rPr>
+          <w:rStyle w:val="Kiemels2"/>
+        </w:rPr>
+        <w:t>:</w:t>
       </w:r>
       <w:r>
         <w:t xml:space="preserve"> 2 GB RAM</w:t>
@@ -1482,6 +1538,7 @@
         <w:spacing w:before="0" w:beforeAutospacing="0" w:after="0" w:afterAutospacing="0"/>
         <w:ind w:left="720"/>
       </w:pPr>
+      <w:proofErr w:type="gramStart"/>
       <w:r>
         <w:rPr>
           <w:rFonts w:hAnsi="Symbol"/>
@@ -1495,7 +1552,14 @@
         <w:rPr>
           <w:rStyle w:val="Kiemels2"/>
         </w:rPr>
-        <w:t>Ajánlott:</w:t>
+        <w:t>Ajánlott</w:t>
+      </w:r>
+      <w:proofErr w:type="gramEnd"/>
+      <w:r>
+        <w:rPr>
+          <w:rStyle w:val="Kiemels2"/>
+        </w:rPr>
+        <w:t>:</w:t>
       </w:r>
       <w:r>
         <w:t xml:space="preserve"> 4–8 GB RAM</w:t>
@@ -1530,6 +1594,7 @@
         <w:spacing w:before="0" w:beforeAutospacing="0" w:after="0" w:afterAutospacing="0"/>
         <w:ind w:left="720"/>
       </w:pPr>
+      <w:proofErr w:type="gramStart"/>
       <w:r>
         <w:rPr>
           <w:rFonts w:hAnsi="Symbol"/>
@@ -1543,7 +1608,14 @@
         <w:rPr>
           <w:rStyle w:val="Kiemels2"/>
         </w:rPr>
-        <w:t>Minimum:</w:t>
+        <w:t>Minimum</w:t>
+      </w:r>
+      <w:proofErr w:type="gramEnd"/>
+      <w:r>
+        <w:rPr>
+          <w:rStyle w:val="Kiemels2"/>
+        </w:rPr>
+        <w:t>:</w:t>
       </w:r>
       <w:r>
         <w:t xml:space="preserve"> 10 GB szabad hely</w:t>
@@ -1555,6 +1627,7 @@
         <w:spacing w:before="0" w:beforeAutospacing="0" w:after="0" w:afterAutospacing="0"/>
         <w:ind w:left="720"/>
       </w:pPr>
+      <w:proofErr w:type="gramStart"/>
       <w:r>
         <w:rPr>
           <w:rFonts w:hAnsi="Symbol"/>
@@ -1568,7 +1641,14 @@
         <w:rPr>
           <w:rStyle w:val="Kiemels2"/>
         </w:rPr>
-        <w:t>Ajánlott:</w:t>
+        <w:t>Ajánlott</w:t>
+      </w:r>
+      <w:proofErr w:type="gramEnd"/>
+      <w:r>
+        <w:rPr>
+          <w:rStyle w:val="Kiemels2"/>
+        </w:rPr>
+        <w:t>:</w:t>
       </w:r>
       <w:r>
         <w:t xml:space="preserve"> SSD meghajtó legalább 50 GB szabad hellyel</w:t>
@@ -1677,7 +1757,15 @@
         <w:t>B</w:t>
       </w:r>
       <w:r>
-        <w:t>öngésző (pl.: Chrome, FireFox)</w:t>
+        <w:t xml:space="preserve">öngésző (pl.: Chrome, </w:t>
+      </w:r>
+      <w:proofErr w:type="spellStart"/>
+      <w:r>
+        <w:t>FireFox</w:t>
+      </w:r>
+      <w:proofErr w:type="spellEnd"/>
+      <w:r>
+        <w:t>)</w:t>
       </w:r>
     </w:p>
     <w:p>
@@ -1710,7 +1798,15 @@
         <w:t xml:space="preserve">Egy weboldal futtatásához alapvetően nem kell túl erős hardver – különösen akkor, ha csak fejlesztésre vagy kisebb forgalmú kiszolgálásra használjuk. </w:t>
       </w:r>
       <w:r>
-        <w:t>Az operációs rendszer biztosítja azt az alapvető környezetet, ahol a webszerver, adatbázis és egyéb szoftverek futnak. Például Windows, Linux vagy macOS. Ez futtatja a XAMPP-ot és kezeli a rendszer erőforrásait.</w:t>
+        <w:t xml:space="preserve">Az operációs rendszer biztosítja azt az alapvető környezetet, ahol a webszerver, adatbázis és egyéb szoftverek futnak. Például Windows, Linux vagy </w:t>
+      </w:r>
+      <w:proofErr w:type="spellStart"/>
+      <w:r>
+        <w:t>macOS</w:t>
+      </w:r>
+      <w:proofErr w:type="spellEnd"/>
+      <w:r>
+        <w:t>. Ez futtatja a XAMPP-ot és kezeli a rendszer erőforrásait.</w:t>
       </w:r>
       <w:r>
         <w:t xml:space="preserve"> A XAMPP egy olyan csomag, amely tartalmazza a legfontosabb szerverkomponenseket, amik szükségesek a weboldal futtatásához, tehát lehetővé teszi, hogy helyben (lokálisan) futtassuk és teszteljük a weboldalt. A böngésző egy kliensprogram, am</w:t>
@@ -1725,7 +1821,15 @@
         <w:t>Maga a</w:t>
       </w:r>
       <w:r>
-        <w:t xml:space="preserve"> böngésző kérést küld a szervernek (pl. a XAMPP által futtatott Apache-nak), majd megjeleníti a válaszként kapott HTML, CSS és JavaScript tartalmat.</w:t>
+        <w:t xml:space="preserve"> böngésző kérést küld a szervernek (pl. a XAMPP által futtatott </w:t>
+      </w:r>
+      <w:proofErr w:type="spellStart"/>
+      <w:r>
+        <w:t>Apache-nak</w:t>
+      </w:r>
+      <w:proofErr w:type="spellEnd"/>
+      <w:r>
+        <w:t>), majd megjeleníti a válaszként kapott HTML, CSS és JavaScript tartalmat.</w:t>
       </w:r>
     </w:p>
     <w:p>
@@ -1881,7 +1985,7 @@
               </wp:anchor>
             </w:drawing>
           </mc:Choice>
-          <mc:Fallback xmlns:a="http://schemas.openxmlformats.org/drawingml/2006/main" xmlns:pic="http://schemas.openxmlformats.org/drawingml/2006/picture" xmlns:a14="http://schemas.microsoft.com/office/drawing/2010/main">
+          <mc:Fallback xmlns:a14="http://schemas.microsoft.com/office/drawing/2010/main" xmlns:pic="http://schemas.openxmlformats.org/drawingml/2006/picture" xmlns:a="http://schemas.openxmlformats.org/drawingml/2006/main">
             <w:pict>
               <v:shape id="Derékszögű háromszög 7" style="position:absolute;margin-left:0;margin-top:-71.1pt;width:190.5pt;height:190.5pt;rotation:90;z-index:251666432;visibility:visible;mso-wrap-style:square;mso-width-percent:0;mso-wrap-distance-left:9pt;mso-wrap-distance-top:0;mso-wrap-distance-right:9pt;mso-wrap-distance-bottom:0;mso-position-horizontal:left;mso-position-horizontal-relative:page;mso-position-vertical:absolute;mso-position-vertical-relative:text;mso-width-percent:0;mso-width-relative:margin;v-text-anchor:middle" coordsize="2419350,2419350" o:spid="_x0000_s1026" fillcolor="#ed7d31 [3205]" stroked="f" strokeweight="1pt" path="m,2419350l,c806450,806450,-382154,2206666,2419350,2419350l,2419350xe" o:gfxdata="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" w14:anchorId="2FA07425">
                 <v:stroke joinstyle="miter"/>
@@ -2030,25 +2134,49 @@
         <w:rPr>
           <w:lang w:val="en-US"/>
         </w:rPr>
-        <w:t>Visual Studio Code</w:t>
-      </w:r>
+        <w:t xml:space="preserve">Visual Studio </w:t>
+      </w:r>
+      <w:proofErr w:type="gramStart"/>
       <w:r>
         <w:rPr>
           <w:lang w:val="en-US"/>
         </w:rPr>
+        <w:t>Code</w:t>
+      </w:r>
+      <w:r>
+        <w:rPr>
+          <w:lang w:val="en-US"/>
+        </w:rPr>
         <w:t>(</w:t>
       </w:r>
+      <w:proofErr w:type="spellStart"/>
+      <w:proofErr w:type="gramEnd"/>
       <w:r>
         <w:rPr>
           <w:lang w:val="en-US"/>
         </w:rPr>
         <w:t>Fejlesztői</w:t>
       </w:r>
+      <w:proofErr w:type="spellEnd"/>
       <w:r>
         <w:rPr>
           <w:lang w:val="en-US"/>
         </w:rPr>
-        <w:t xml:space="preserve"> Környezet)</w:t>
+        <w:t xml:space="preserve"> </w:t>
+      </w:r>
+      <w:proofErr w:type="spellStart"/>
+      <w:r>
+        <w:rPr>
+          <w:lang w:val="en-US"/>
+        </w:rPr>
+        <w:t>Környezet</w:t>
+      </w:r>
+      <w:proofErr w:type="spellEnd"/>
+      <w:r>
+        <w:rPr>
+          <w:lang w:val="en-US"/>
+        </w:rPr>
+        <w:t>)</w:t>
       </w:r>
     </w:p>
     <w:p>
@@ -2077,13 +2205,47 @@
         <w:t xml:space="preserve">.1 </w:t>
       </w:r>
       <w:r>
-        <w:t>Visual Studio Code</w:t>
+        <w:t xml:space="preserve">Visual </w:t>
+      </w:r>
+      <w:proofErr w:type="spellStart"/>
+      <w:r>
+        <w:t>Studio</w:t>
+      </w:r>
+      <w:proofErr w:type="spellEnd"/>
+      <w:r>
+        <w:t xml:space="preserve"> </w:t>
+      </w:r>
+      <w:proofErr w:type="spellStart"/>
+      <w:r>
+        <w:t>Code</w:t>
       </w:r>
       <w:bookmarkEnd w:id="3"/>
-    </w:p>
-    <w:p>
-      <w:r>
-        <w:t xml:space="preserve">A Visual Studio Code(VSC) egy </w:t>
+      <w:proofErr w:type="spellEnd"/>
+    </w:p>
+    <w:p>
+      <w:r>
+        <w:t xml:space="preserve">A Visual </w:t>
+      </w:r>
+      <w:proofErr w:type="spellStart"/>
+      <w:r>
+        <w:t>Studio</w:t>
+      </w:r>
+      <w:proofErr w:type="spellEnd"/>
+      <w:r>
+        <w:t xml:space="preserve"> </w:t>
+      </w:r>
+      <w:proofErr w:type="spellStart"/>
+      <w:proofErr w:type="gramStart"/>
+      <w:r>
+        <w:t>Code</w:t>
+      </w:r>
+      <w:proofErr w:type="spellEnd"/>
+      <w:r>
+        <w:t>(</w:t>
+      </w:r>
+      <w:proofErr w:type="gramEnd"/>
+      <w:r>
+        <w:t xml:space="preserve">VSC) egy </w:t>
       </w:r>
       <w:r>
         <w:t xml:space="preserve">fejlesztői </w:t>
@@ -2091,13 +2253,59 @@
       <w:r>
         <w:t>környezet(</w:t>
       </w:r>
+      <w:proofErr w:type="spellStart"/>
       <w:r>
         <w:rPr>
           <w:rFonts w:eastAsia="Times New Roman" w:cs="Times New Roman"/>
           <w:color w:val="0D0D0D" w:themeColor="text1" w:themeTint="F2"/>
           <w:szCs w:val="24"/>
         </w:rPr>
-        <w:t>Integrated Development Environment (IDE)</w:t>
+        <w:t>Integrated</w:t>
+      </w:r>
+      <w:proofErr w:type="spellEnd"/>
+      <w:r>
+        <w:rPr>
+          <w:rFonts w:eastAsia="Times New Roman" w:cs="Times New Roman"/>
+          <w:color w:val="0D0D0D" w:themeColor="text1" w:themeTint="F2"/>
+          <w:szCs w:val="24"/>
+        </w:rPr>
+        <w:t xml:space="preserve"> </w:t>
+      </w:r>
+      <w:proofErr w:type="spellStart"/>
+      <w:r>
+        <w:rPr>
+          <w:rFonts w:eastAsia="Times New Roman" w:cs="Times New Roman"/>
+          <w:color w:val="0D0D0D" w:themeColor="text1" w:themeTint="F2"/>
+          <w:szCs w:val="24"/>
+        </w:rPr>
+        <w:t>Development</w:t>
+      </w:r>
+      <w:proofErr w:type="spellEnd"/>
+      <w:r>
+        <w:rPr>
+          <w:rFonts w:eastAsia="Times New Roman" w:cs="Times New Roman"/>
+          <w:color w:val="0D0D0D" w:themeColor="text1" w:themeTint="F2"/>
+          <w:szCs w:val="24"/>
+        </w:rPr>
+        <w:t xml:space="preserve"> </w:t>
+      </w:r>
+      <w:proofErr w:type="spellStart"/>
+      <w:r>
+        <w:rPr>
+          <w:rFonts w:eastAsia="Times New Roman" w:cs="Times New Roman"/>
+          <w:color w:val="0D0D0D" w:themeColor="text1" w:themeTint="F2"/>
+          <w:szCs w:val="24"/>
+        </w:rPr>
+        <w:t>Environment</w:t>
+      </w:r>
+      <w:proofErr w:type="spellEnd"/>
+      <w:r>
+        <w:rPr>
+          <w:rFonts w:eastAsia="Times New Roman" w:cs="Times New Roman"/>
+          <w:color w:val="0D0D0D" w:themeColor="text1" w:themeTint="F2"/>
+          <w:szCs w:val="24"/>
+        </w:rPr>
+        <w:t xml:space="preserve"> (IDE)</w:t>
       </w:r>
       <w:r>
         <w:t>)</w:t>
@@ -2115,7 +2323,15 @@
         <w:t xml:space="preserve"> </w:t>
       </w:r>
       <w:r>
-        <w:t>mi a HTML5, CSS3, JavaScript-et használtuk, illetve az EJS-t. Ebben a környe</w:t>
+        <w:t>mi a HTML5, CSS3, JavaScript-</w:t>
+      </w:r>
+      <w:proofErr w:type="spellStart"/>
+      <w:r>
+        <w:t>et</w:t>
+      </w:r>
+      <w:proofErr w:type="spellEnd"/>
+      <w:r>
+        <w:t xml:space="preserve"> használtuk, illetve az EJS-t. Ebben a környe</w:t>
       </w:r>
       <w:r>
         <w:t>zetben használtuk, illetve fejlesztettünk.</w:t>
@@ -2123,6 +2339,9 @@
     </w:p>
     <w:p>
       <w:r>
+        <w:rPr>
+          <w:noProof/>
+        </w:rPr>
         <w:drawing>
           <wp:inline distT="0" distB="0" distL="0" distR="0" wp14:anchorId="7A2A8CAF" wp14:editId="41076B85">
             <wp:extent cx="5579745" cy="3000375"/>
@@ -2196,8 +2415,13 @@
         <w:t>A</w:t>
       </w:r>
       <w:r>
-        <w:t xml:space="preserve"> XAMPP egy program, melyben adatbázist lehet működtetni</w:t>
-      </w:r>
+        <w:t xml:space="preserve"> XAMPP egy program, melyben adatbázist lehet </w:t>
+      </w:r>
+      <w:proofErr w:type="gramStart"/>
+      <w:r>
+        <w:t>működtetni</w:t>
+      </w:r>
+      <w:proofErr w:type="gramEnd"/>
       <w:r>
         <w:t xml:space="preserve"> amit mi is használtunk. Ehhez az SQL adatbáziskezelő nyelvet használtuk</w:t>
       </w:r>
@@ -2205,7 +2429,23 @@
         <w:t>.</w:t>
       </w:r>
       <w:r>
-        <w:t xml:space="preserve"> Továbbá, fejlesztés alatt az Apache szervert is használtuk, amely a PHP MyAdmin felületet biztosította, mely grafikus adatbázis kezelő oldal.</w:t>
+        <w:t xml:space="preserve"> Továbbá, fejlesztés alatt az </w:t>
+      </w:r>
+      <w:proofErr w:type="spellStart"/>
+      <w:r>
+        <w:t>Apache</w:t>
+      </w:r>
+      <w:proofErr w:type="spellEnd"/>
+      <w:r>
+        <w:t xml:space="preserve"> szervert is használtuk, amely a PHP </w:t>
+      </w:r>
+      <w:proofErr w:type="spellStart"/>
+      <w:r>
+        <w:t>MyAdmin</w:t>
+      </w:r>
+      <w:proofErr w:type="spellEnd"/>
+      <w:r>
+        <w:t xml:space="preserve"> felületet biztosította, mely grafikus adatbázis kezelő oldal.</w:t>
       </w:r>
     </w:p>
     <w:p>
@@ -2416,7 +2656,7 @@
               </wp:anchor>
             </w:drawing>
           </mc:Choice>
-          <mc:Fallback xmlns:a="http://schemas.openxmlformats.org/drawingml/2006/main" xmlns:pic="http://schemas.openxmlformats.org/drawingml/2006/picture" xmlns:a14="http://schemas.microsoft.com/office/drawing/2010/main">
+          <mc:Fallback xmlns:a14="http://schemas.microsoft.com/office/drawing/2010/main" xmlns:pic="http://schemas.openxmlformats.org/drawingml/2006/picture" xmlns:a="http://schemas.openxmlformats.org/drawingml/2006/main">
             <w:pict>
               <v:shape id="Derékszögű háromszög 7" style="position:absolute;margin-left:0;margin-top:-71.35pt;width:190.5pt;height:190.5pt;rotation:90;z-index:251668480;visibility:visible;mso-wrap-style:square;mso-width-percent:0;mso-wrap-distance-left:9pt;mso-wrap-distance-top:0;mso-wrap-distance-right:9pt;mso-wrap-distance-bottom:0;mso-position-horizontal:left;mso-position-horizontal-relative:page;mso-position-vertical:absolute;mso-position-vertical-relative:text;mso-width-percent:0;mso-width-relative:margin;v-text-anchor:middle" coordsize="2419350,2419350" o:spid="_x0000_s1026" fillcolor="#ed7d31 [3205]" stroked="f" strokeweight="1pt" path="m,2419350l,c806450,806450,-382154,2206666,2419350,2419350l,2419350xe" o:gfxdata="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" w14:anchorId="09313364">
                 <v:stroke joinstyle="miter"/>
@@ -2550,10 +2790,23 @@
         <w:t>Az adatbázis 7 db táblát tartalmaz: Felhasználó, Rendelés, Főétel, Köret, Szósz, Desszert, Üdítő</w:t>
       </w:r>
       <w:r>
-        <w:t xml:space="preserve">. Az utóbbi 5 a weboldalon szereplő kategóriákat írja le. A Rendelés az egy kapcsoló tábla, de egy rendelést tartalmaz </w:t>
-      </w:r>
-      <w:r>
-        <w:t xml:space="preserve">id-k szerint. A Felhasználó meg egy felhasználó </w:t>
+        <w:t xml:space="preserve">. Az utóbbi 5 a weboldalon szereplő kategóriákat írja le. A Rendelés az egy </w:t>
+      </w:r>
+      <w:proofErr w:type="gramStart"/>
+      <w:r>
+        <w:t>kapcsoló tábla</w:t>
+      </w:r>
+      <w:proofErr w:type="gramEnd"/>
+      <w:r>
+        <w:t xml:space="preserve">, de egy rendelést tartalmaz </w:t>
+      </w:r>
+      <w:proofErr w:type="spellStart"/>
+      <w:r>
+        <w:t>id</w:t>
+      </w:r>
+      <w:proofErr w:type="spellEnd"/>
+      <w:r>
+        <w:t xml:space="preserve">-k szerint. A Felhasználó meg egy felhasználó </w:t>
       </w:r>
       <w:r>
         <w:t>megadott információit, szerepkörét, és profiljának a helyzetét tartalmazza.</w:t>
@@ -2566,9 +2819,11 @@
       <w:r>
         <w:t xml:space="preserve"> adatbázis neve: </w:t>
       </w:r>
+      <w:proofErr w:type="spellStart"/>
       <w:r>
         <w:t>dozsa_csarda_adatbazis</w:t>
       </w:r>
+      <w:proofErr w:type="spellEnd"/>
     </w:p>
     <w:p>
       <w:pPr>
@@ -2770,11 +3025,19 @@
         </w:rPr>
         <w:tab/>
       </w:r>
-      <w:r>
-        <w:rPr>
-          <w:rFonts w:eastAsia="Times New Roman" w:cs="Times New Roman"/>
-        </w:rPr>
-        <w:t>id: A felhasználó azonosítóját tartalmazza</w:t>
+      <w:proofErr w:type="spellStart"/>
+      <w:r>
+        <w:rPr>
+          <w:rFonts w:eastAsia="Times New Roman" w:cs="Times New Roman"/>
+        </w:rPr>
+        <w:t>id</w:t>
+      </w:r>
+      <w:proofErr w:type="spellEnd"/>
+      <w:r>
+        <w:rPr>
+          <w:rFonts w:eastAsia="Times New Roman" w:cs="Times New Roman"/>
+        </w:rPr>
+        <w:t>: A felhasználó azonosítóját tartalmazza</w:t>
       </w:r>
       <w:r>
         <w:rPr>
@@ -2821,7 +3084,21 @@
           <w:rFonts w:eastAsia="Times New Roman" w:cs="Times New Roman"/>
         </w:rPr>
         <w:tab/>
-        <w:t>jelszó: A felhasználó jelszavát, Hash-elve/titkosítva tartalmazza</w:t>
+        <w:t xml:space="preserve">jelszó: A felhasználó jelszavát, </w:t>
+      </w:r>
+      <w:proofErr w:type="spellStart"/>
+      <w:r>
+        <w:rPr>
+          <w:rFonts w:eastAsia="Times New Roman" w:cs="Times New Roman"/>
+        </w:rPr>
+        <w:t>Hash</w:t>
+      </w:r>
+      <w:proofErr w:type="spellEnd"/>
+      <w:r>
+        <w:rPr>
+          <w:rFonts w:eastAsia="Times New Roman" w:cs="Times New Roman"/>
+        </w:rPr>
+        <w:t>-elve/titkosítva tartalmazza</w:t>
       </w:r>
     </w:p>
     <w:p>
@@ -2868,7 +3145,35 @@
         <w:rPr>
           <w:rFonts w:eastAsia="Times New Roman" w:cs="Times New Roman"/>
         </w:rPr>
-        <w:t>(admin, user)</w:t>
+        <w:t>(</w:t>
+      </w:r>
+      <w:proofErr w:type="spellStart"/>
+      <w:r>
+        <w:rPr>
+          <w:rFonts w:eastAsia="Times New Roman" w:cs="Times New Roman"/>
+        </w:rPr>
+        <w:t>admin</w:t>
+      </w:r>
+      <w:proofErr w:type="spellEnd"/>
+      <w:r>
+        <w:rPr>
+          <w:rFonts w:eastAsia="Times New Roman" w:cs="Times New Roman"/>
+        </w:rPr>
+        <w:t xml:space="preserve">, </w:t>
+      </w:r>
+      <w:proofErr w:type="spellStart"/>
+      <w:r>
+        <w:rPr>
+          <w:rFonts w:eastAsia="Times New Roman" w:cs="Times New Roman"/>
+        </w:rPr>
+        <w:t>user</w:t>
+      </w:r>
+      <w:proofErr w:type="spellEnd"/>
+      <w:r>
+        <w:rPr>
+          <w:rFonts w:eastAsia="Times New Roman" w:cs="Times New Roman"/>
+        </w:rPr>
+        <w:t>)</w:t>
       </w:r>
     </w:p>
     <w:p>
@@ -2964,11 +3269,19 @@
         </w:rPr>
         <w:tab/>
       </w:r>
-      <w:r>
-        <w:rPr>
-          <w:rFonts w:eastAsia="Times New Roman" w:cs="Times New Roman"/>
-        </w:rPr>
-        <w:t>id: A rendelés azonosítóját tartalmazza</w:t>
+      <w:proofErr w:type="spellStart"/>
+      <w:r>
+        <w:rPr>
+          <w:rFonts w:eastAsia="Times New Roman" w:cs="Times New Roman"/>
+        </w:rPr>
+        <w:t>id</w:t>
+      </w:r>
+      <w:proofErr w:type="spellEnd"/>
+      <w:r>
+        <w:rPr>
+          <w:rFonts w:eastAsia="Times New Roman" w:cs="Times New Roman"/>
+        </w:rPr>
+        <w:t>: A rendelés azonosítóját tartalmazza</w:t>
       </w:r>
       <w:r>
         <w:rPr>
@@ -2990,11 +3303,19 @@
         </w:rPr>
         <w:tab/>
       </w:r>
-      <w:r>
-        <w:rPr>
-          <w:rFonts w:eastAsia="Times New Roman" w:cs="Times New Roman"/>
-        </w:rPr>
-        <w:t>főétel_id: A Főétel azonosítóját tartalmazza</w:t>
+      <w:proofErr w:type="spellStart"/>
+      <w:r>
+        <w:rPr>
+          <w:rFonts w:eastAsia="Times New Roman" w:cs="Times New Roman"/>
+        </w:rPr>
+        <w:t>főétel_id</w:t>
+      </w:r>
+      <w:proofErr w:type="spellEnd"/>
+      <w:r>
+        <w:rPr>
+          <w:rFonts w:eastAsia="Times New Roman" w:cs="Times New Roman"/>
+        </w:rPr>
+        <w:t>: A Főétel azonosítóját tartalmazza</w:t>
       </w:r>
       <w:r>
         <w:rPr>
@@ -3015,7 +3336,20 @@
           <w:rFonts w:eastAsia="Times New Roman" w:cs="Times New Roman"/>
         </w:rPr>
         <w:tab/>
-        <w:t>köret_id: A Köret azonosítóját tartalmazza</w:t>
+      </w:r>
+      <w:proofErr w:type="spellStart"/>
+      <w:r>
+        <w:rPr>
+          <w:rFonts w:eastAsia="Times New Roman" w:cs="Times New Roman"/>
+        </w:rPr>
+        <w:t>köret_id</w:t>
+      </w:r>
+      <w:proofErr w:type="spellEnd"/>
+      <w:r>
+        <w:rPr>
+          <w:rFonts w:eastAsia="Times New Roman" w:cs="Times New Roman"/>
+        </w:rPr>
+        <w:t>: A Köret azonosítóját tartalmazza</w:t>
       </w:r>
       <w:r>
         <w:rPr>
@@ -3037,11 +3371,19 @@
         </w:rPr>
         <w:tab/>
       </w:r>
-      <w:r>
-        <w:rPr>
-          <w:rFonts w:eastAsia="Times New Roman" w:cs="Times New Roman"/>
-        </w:rPr>
-        <w:t>szosz_id: A Szósz azonosítóját tartalmazza</w:t>
+      <w:proofErr w:type="spellStart"/>
+      <w:r>
+        <w:rPr>
+          <w:rFonts w:eastAsia="Times New Roman" w:cs="Times New Roman"/>
+        </w:rPr>
+        <w:t>szosz_id</w:t>
+      </w:r>
+      <w:proofErr w:type="spellEnd"/>
+      <w:r>
+        <w:rPr>
+          <w:rFonts w:eastAsia="Times New Roman" w:cs="Times New Roman"/>
+        </w:rPr>
+        <w:t>: A Szósz azonosítóját tartalmazza</w:t>
       </w:r>
       <w:r>
         <w:rPr>
@@ -3063,11 +3405,19 @@
         </w:rPr>
         <w:tab/>
       </w:r>
-      <w:r>
-        <w:rPr>
-          <w:rFonts w:eastAsia="Times New Roman" w:cs="Times New Roman"/>
-        </w:rPr>
-        <w:t>üditő_id: Az Üdítő azonosítóját tartalmazza</w:t>
+      <w:proofErr w:type="spellStart"/>
+      <w:r>
+        <w:rPr>
+          <w:rFonts w:eastAsia="Times New Roman" w:cs="Times New Roman"/>
+        </w:rPr>
+        <w:t>üditő_id</w:t>
+      </w:r>
+      <w:proofErr w:type="spellEnd"/>
+      <w:r>
+        <w:rPr>
+          <w:rFonts w:eastAsia="Times New Roman" w:cs="Times New Roman"/>
+        </w:rPr>
+        <w:t>: Az Üdítő azonosítóját tartalmazza</w:t>
       </w:r>
       <w:r>
         <w:rPr>
@@ -3089,11 +3439,19 @@
         </w:rPr>
         <w:tab/>
       </w:r>
-      <w:r>
-        <w:rPr>
-          <w:rFonts w:eastAsia="Times New Roman" w:cs="Times New Roman"/>
-        </w:rPr>
-        <w:t>fel_id: A felhasználó azonosítóját tartalmazza</w:t>
+      <w:proofErr w:type="spellStart"/>
+      <w:r>
+        <w:rPr>
+          <w:rFonts w:eastAsia="Times New Roman" w:cs="Times New Roman"/>
+        </w:rPr>
+        <w:t>fel_id</w:t>
+      </w:r>
+      <w:proofErr w:type="spellEnd"/>
+      <w:r>
+        <w:rPr>
+          <w:rFonts w:eastAsia="Times New Roman" w:cs="Times New Roman"/>
+        </w:rPr>
+        <w:t>: A felhasználó azonosítóját tartalmazza</w:t>
       </w:r>
       <w:r>
         <w:rPr>
@@ -3114,7 +3472,20 @@
           <w:rFonts w:eastAsia="Times New Roman" w:cs="Times New Roman"/>
         </w:rPr>
         <w:tab/>
-        <w:t>desszert_id: A Desszert azonosítóját tartalmazza</w:t>
+      </w:r>
+      <w:proofErr w:type="spellStart"/>
+      <w:r>
+        <w:rPr>
+          <w:rFonts w:eastAsia="Times New Roman" w:cs="Times New Roman"/>
+        </w:rPr>
+        <w:t>desszert_id</w:t>
+      </w:r>
+      <w:proofErr w:type="spellEnd"/>
+      <w:r>
+        <w:rPr>
+          <w:rFonts w:eastAsia="Times New Roman" w:cs="Times New Roman"/>
+        </w:rPr>
+        <w:t>: A Desszert azonosítóját tartalmazza</w:t>
       </w:r>
       <w:r>
         <w:rPr>
@@ -3158,11 +3529,19 @@
         </w:rPr>
         <w:tab/>
       </w:r>
-      <w:r>
-        <w:rPr>
-          <w:rFonts w:eastAsia="Times New Roman" w:cs="Times New Roman"/>
-        </w:rPr>
-        <w:t>id: A Főétel azonosítóját tartalmazza</w:t>
+      <w:proofErr w:type="spellStart"/>
+      <w:r>
+        <w:rPr>
+          <w:rFonts w:eastAsia="Times New Roman" w:cs="Times New Roman"/>
+        </w:rPr>
+        <w:t>id</w:t>
+      </w:r>
+      <w:proofErr w:type="spellEnd"/>
+      <w:r>
+        <w:rPr>
+          <w:rFonts w:eastAsia="Times New Roman" w:cs="Times New Roman"/>
+        </w:rPr>
+        <w:t>: A Főétel azonosítóját tartalmazza</w:t>
       </w:r>
       <w:r>
         <w:rPr>
@@ -3272,7 +3651,20 @@
           <w:rFonts w:eastAsia="Times New Roman" w:cs="Times New Roman"/>
         </w:rPr>
         <w:tab/>
-        <w:t>id: A Köret azonosítóját tartalmazza</w:t>
+      </w:r>
+      <w:proofErr w:type="spellStart"/>
+      <w:r>
+        <w:rPr>
+          <w:rFonts w:eastAsia="Times New Roman" w:cs="Times New Roman"/>
+        </w:rPr>
+        <w:t>id</w:t>
+      </w:r>
+      <w:proofErr w:type="spellEnd"/>
+      <w:r>
+        <w:rPr>
+          <w:rFonts w:eastAsia="Times New Roman" w:cs="Times New Roman"/>
+        </w:rPr>
+        <w:t>: A Köret azonosítóját tartalmazza</w:t>
       </w:r>
       <w:r>
         <w:rPr>
@@ -3555,7 +3947,20 @@
           <w:rFonts w:eastAsia="Times New Roman" w:cs="Times New Roman"/>
         </w:rPr>
         <w:tab/>
-        <w:t xml:space="preserve">id: A </w:t>
+      </w:r>
+      <w:proofErr w:type="spellStart"/>
+      <w:r>
+        <w:rPr>
+          <w:rFonts w:eastAsia="Times New Roman" w:cs="Times New Roman"/>
+        </w:rPr>
+        <w:t>id</w:t>
+      </w:r>
+      <w:proofErr w:type="spellEnd"/>
+      <w:r>
+        <w:rPr>
+          <w:rFonts w:eastAsia="Times New Roman" w:cs="Times New Roman"/>
+        </w:rPr>
+        <w:t xml:space="preserve">: A </w:t>
       </w:r>
       <w:r>
         <w:rPr>
@@ -3687,7 +4092,20 @@
           <w:rFonts w:eastAsia="Times New Roman" w:cs="Times New Roman"/>
         </w:rPr>
         <w:tab/>
-        <w:t>id: A</w:t>
+      </w:r>
+      <w:proofErr w:type="spellStart"/>
+      <w:r>
+        <w:rPr>
+          <w:rFonts w:eastAsia="Times New Roman" w:cs="Times New Roman"/>
+        </w:rPr>
+        <w:t>id</w:t>
+      </w:r>
+      <w:proofErr w:type="spellEnd"/>
+      <w:r>
+        <w:rPr>
+          <w:rFonts w:eastAsia="Times New Roman" w:cs="Times New Roman"/>
+        </w:rPr>
+        <w:t>: A</w:t>
       </w:r>
       <w:r>
         <w:rPr>
@@ -3846,7 +4264,20 @@
           <w:rFonts w:eastAsia="Times New Roman" w:cs="Times New Roman"/>
         </w:rPr>
         <w:tab/>
-        <w:t>id: A Desszert azonosítóját tartalmazza</w:t>
+      </w:r>
+      <w:proofErr w:type="spellStart"/>
+      <w:r>
+        <w:rPr>
+          <w:rFonts w:eastAsia="Times New Roman" w:cs="Times New Roman"/>
+        </w:rPr>
+        <w:t>id</w:t>
+      </w:r>
+      <w:proofErr w:type="spellEnd"/>
+      <w:r>
+        <w:rPr>
+          <w:rFonts w:eastAsia="Times New Roman" w:cs="Times New Roman"/>
+        </w:rPr>
+        <w:t>: A Desszert azonosítóját tartalmazza</w:t>
       </w:r>
       <w:r>
         <w:rPr>
@@ -4233,7 +4664,21 @@
         <w:rPr>
           <w:rFonts w:eastAsia="Times New Roman" w:cs="Times New Roman"/>
         </w:rPr>
-        <w:t>- Server.js - A szerver indítója fájlja (Indító parancs: Node Server.js)</w:t>
+        <w:t xml:space="preserve">- Server.js - A szerver indítója fájlja (Indító parancs: </w:t>
+      </w:r>
+      <w:proofErr w:type="spellStart"/>
+      <w:r>
+        <w:rPr>
+          <w:rFonts w:eastAsia="Times New Roman" w:cs="Times New Roman"/>
+        </w:rPr>
+        <w:t>Node</w:t>
+      </w:r>
+      <w:proofErr w:type="spellEnd"/>
+      <w:r>
+        <w:rPr>
+          <w:rFonts w:eastAsia="Times New Roman" w:cs="Times New Roman"/>
+        </w:rPr>
+        <w:t xml:space="preserve"> Server.js)</w:t>
       </w:r>
     </w:p>
     <w:p>
@@ -4247,13 +4692,41 @@
         <w:rPr>
           <w:rFonts w:eastAsia="Times New Roman" w:cs="Times New Roman"/>
         </w:rPr>
-        <w:t xml:space="preserve">- routes/apiRoutes.js - A szerver végpontjait, (API) tartalmazza, </w:t>
-      </w:r>
-      <w:r>
-        <w:rPr>
-          <w:rFonts w:eastAsia="Times New Roman" w:cs="Times New Roman"/>
-        </w:rPr>
-        <w:t xml:space="preserve">az express </w:t>
+        <w:t xml:space="preserve">- </w:t>
+      </w:r>
+      <w:proofErr w:type="spellStart"/>
+      <w:r>
+        <w:rPr>
+          <w:rFonts w:eastAsia="Times New Roman" w:cs="Times New Roman"/>
+        </w:rPr>
+        <w:t>routes</w:t>
+      </w:r>
+      <w:proofErr w:type="spellEnd"/>
+      <w:r>
+        <w:rPr>
+          <w:rFonts w:eastAsia="Times New Roman" w:cs="Times New Roman"/>
+        </w:rPr>
+        <w:t xml:space="preserve">/apiRoutes.js - A szerver végpontjait, (API) tartalmazza, </w:t>
+      </w:r>
+      <w:r>
+        <w:rPr>
+          <w:rFonts w:eastAsia="Times New Roman" w:cs="Times New Roman"/>
+        </w:rPr>
+        <w:t xml:space="preserve">az </w:t>
+      </w:r>
+      <w:proofErr w:type="spellStart"/>
+      <w:r>
+        <w:rPr>
+          <w:rFonts w:eastAsia="Times New Roman" w:cs="Times New Roman"/>
+        </w:rPr>
+        <w:t>express</w:t>
+      </w:r>
+      <w:proofErr w:type="spellEnd"/>
+      <w:r>
+        <w:rPr>
+          <w:rFonts w:eastAsia="Times New Roman" w:cs="Times New Roman"/>
+        </w:rPr>
+        <w:t xml:space="preserve"> </w:t>
       </w:r>
       <w:r>
         <w:tab/>
@@ -4273,6 +4746,7 @@
       <w:r>
         <w:tab/>
       </w:r>
+      <w:proofErr w:type="gramStart"/>
       <w:r>
         <w:tab/>
       </w:r>
@@ -4280,7 +4754,28 @@
         <w:rPr>
           <w:rFonts w:eastAsia="Times New Roman" w:cs="Times New Roman"/>
         </w:rPr>
-        <w:t xml:space="preserve">  illetve a controllerek felhasználásával</w:t>
+        <w:t xml:space="preserve">  illetve</w:t>
+      </w:r>
+      <w:proofErr w:type="gramEnd"/>
+      <w:r>
+        <w:rPr>
+          <w:rFonts w:eastAsia="Times New Roman" w:cs="Times New Roman"/>
+        </w:rPr>
+        <w:t xml:space="preserve"> a </w:t>
+      </w:r>
+      <w:proofErr w:type="spellStart"/>
+      <w:r>
+        <w:rPr>
+          <w:rFonts w:eastAsia="Times New Roman" w:cs="Times New Roman"/>
+        </w:rPr>
+        <w:t>controllerek</w:t>
+      </w:r>
+      <w:proofErr w:type="spellEnd"/>
+      <w:r>
+        <w:rPr>
+          <w:rFonts w:eastAsia="Times New Roman" w:cs="Times New Roman"/>
+        </w:rPr>
+        <w:t xml:space="preserve"> felhasználásával</w:t>
       </w:r>
     </w:p>
     <w:p>
@@ -4328,7 +4823,21 @@
         <w:rPr>
           <w:rFonts w:eastAsia="Times New Roman" w:cs="Times New Roman"/>
         </w:rPr>
-        <w:t xml:space="preserve"> – A Profilhoz kapcsodó API-k útvonalát tartalmazza</w:t>
+        <w:t xml:space="preserve"> – A Profilhoz </w:t>
+      </w:r>
+      <w:proofErr w:type="spellStart"/>
+      <w:r>
+        <w:rPr>
+          <w:rFonts w:eastAsia="Times New Roman" w:cs="Times New Roman"/>
+        </w:rPr>
+        <w:t>kapcsodó</w:t>
+      </w:r>
+      <w:proofErr w:type="spellEnd"/>
+      <w:r>
+        <w:rPr>
+          <w:rFonts w:eastAsia="Times New Roman" w:cs="Times New Roman"/>
+        </w:rPr>
+        <w:t xml:space="preserve"> API-k útvonalát tartalmazza</w:t>
       </w:r>
     </w:p>
     <w:p>
@@ -4342,7 +4851,21 @@
         <w:rPr>
           <w:rFonts w:eastAsia="Times New Roman" w:cs="Times New Roman"/>
         </w:rPr>
-        <w:t xml:space="preserve">- models/foodModel.js - A szerver adatait tartalmazza, később adatbázissal </w:t>
+        <w:t xml:space="preserve">- </w:t>
+      </w:r>
+      <w:proofErr w:type="spellStart"/>
+      <w:r>
+        <w:rPr>
+          <w:rFonts w:eastAsia="Times New Roman" w:cs="Times New Roman"/>
+        </w:rPr>
+        <w:t>models</w:t>
+      </w:r>
+      <w:proofErr w:type="spellEnd"/>
+      <w:r>
+        <w:rPr>
+          <w:rFonts w:eastAsia="Times New Roman" w:cs="Times New Roman"/>
+        </w:rPr>
+        <w:t xml:space="preserve">/foodModel.js - A szerver adatait tartalmazza, később adatbázissal </w:t>
       </w:r>
       <w:r>
         <w:tab/>
@@ -4403,7 +4926,21 @@
         <w:rPr>
           <w:rFonts w:eastAsia="Times New Roman" w:cs="Times New Roman"/>
         </w:rPr>
-        <w:t xml:space="preserve">- controllers/foodController.js - A szerver vezérlője, tartalmazza a </w:t>
+        <w:t xml:space="preserve">- </w:t>
+      </w:r>
+      <w:proofErr w:type="spellStart"/>
+      <w:r>
+        <w:rPr>
+          <w:rFonts w:eastAsia="Times New Roman" w:cs="Times New Roman"/>
+        </w:rPr>
+        <w:t>controllers</w:t>
+      </w:r>
+      <w:proofErr w:type="spellEnd"/>
+      <w:r>
+        <w:rPr>
+          <w:rFonts w:eastAsia="Times New Roman" w:cs="Times New Roman"/>
+        </w:rPr>
+        <w:t xml:space="preserve">/foodController.js - A szerver vezérlője, tartalmazza a </w:t>
       </w:r>
       <w:r>
         <w:tab/>
@@ -4468,7 +5005,35 @@
         <w:rPr>
           <w:rFonts w:eastAsia="Times New Roman" w:cs="Times New Roman"/>
         </w:rPr>
-        <w:t>pageController.js – A pageRoutes – hoz a controller, az oldalak közötti</w:t>
+        <w:t xml:space="preserve">pageController.js – A </w:t>
+      </w:r>
+      <w:proofErr w:type="spellStart"/>
+      <w:r>
+        <w:rPr>
+          <w:rFonts w:eastAsia="Times New Roman" w:cs="Times New Roman"/>
+        </w:rPr>
+        <w:t>pageRoutes</w:t>
+      </w:r>
+      <w:proofErr w:type="spellEnd"/>
+      <w:r>
+        <w:rPr>
+          <w:rFonts w:eastAsia="Times New Roman" w:cs="Times New Roman"/>
+        </w:rPr>
+        <w:t xml:space="preserve"> – hoz a </w:t>
+      </w:r>
+      <w:proofErr w:type="spellStart"/>
+      <w:r>
+        <w:rPr>
+          <w:rFonts w:eastAsia="Times New Roman" w:cs="Times New Roman"/>
+        </w:rPr>
+        <w:t>controller</w:t>
+      </w:r>
+      <w:proofErr w:type="spellEnd"/>
+      <w:r>
+        <w:rPr>
+          <w:rFonts w:eastAsia="Times New Roman" w:cs="Times New Roman"/>
+        </w:rPr>
+        <w:t>, az oldalak közötti</w:t>
       </w:r>
       <w:r>
         <w:rPr>
@@ -4488,7 +5053,35 @@
         <w:rPr>
           <w:rFonts w:eastAsia="Times New Roman" w:cs="Times New Roman"/>
         </w:rPr>
-        <w:t>/userController.js – A userRoutes és a userModel-hez tartozó kontroller, ami a feltöltést, illetve a profilhoz tartozó lekérdezéseket biztosítja</w:t>
+        <w:t xml:space="preserve">/userController.js – A </w:t>
+      </w:r>
+      <w:proofErr w:type="spellStart"/>
+      <w:r>
+        <w:rPr>
+          <w:rFonts w:eastAsia="Times New Roman" w:cs="Times New Roman"/>
+        </w:rPr>
+        <w:t>userRoutes</w:t>
+      </w:r>
+      <w:proofErr w:type="spellEnd"/>
+      <w:r>
+        <w:rPr>
+          <w:rFonts w:eastAsia="Times New Roman" w:cs="Times New Roman"/>
+        </w:rPr>
+        <w:t xml:space="preserve"> és a </w:t>
+      </w:r>
+      <w:proofErr w:type="spellStart"/>
+      <w:r>
+        <w:rPr>
+          <w:rFonts w:eastAsia="Times New Roman" w:cs="Times New Roman"/>
+        </w:rPr>
+        <w:t>userModel-hez</w:t>
+      </w:r>
+      <w:proofErr w:type="spellEnd"/>
+      <w:r>
+        <w:rPr>
+          <w:rFonts w:eastAsia="Times New Roman" w:cs="Times New Roman"/>
+        </w:rPr>
+        <w:t xml:space="preserve"> tartozó kontroller, ami a feltöltést, illetve a profilhoz tartozó lekérdezéseket biztosítja</w:t>
       </w:r>
     </w:p>
     <w:p>
@@ -4502,19 +5095,61 @@
         <w:rPr>
           <w:rFonts w:eastAsia="Times New Roman" w:cs="Times New Roman"/>
         </w:rPr>
-        <w:t>- config/db.js – A</w:t>
-      </w:r>
-      <w:r>
-        <w:rPr>
-          <w:rFonts w:eastAsia="Times New Roman" w:cs="Times New Roman"/>
-        </w:rPr>
-        <w:t>z adatbázis használatát illetve</w:t>
-      </w:r>
-      <w:r>
-        <w:rPr>
-          <w:rFonts w:eastAsia="Times New Roman" w:cs="Times New Roman"/>
-        </w:rPr>
-        <w:t xml:space="preserve"> kezelését tartalmazza, amit az npm </w:t>
+        <w:t xml:space="preserve">- </w:t>
+      </w:r>
+      <w:proofErr w:type="spellStart"/>
+      <w:r>
+        <w:rPr>
+          <w:rFonts w:eastAsia="Times New Roman" w:cs="Times New Roman"/>
+        </w:rPr>
+        <w:t>config</w:t>
+      </w:r>
+      <w:proofErr w:type="spellEnd"/>
+      <w:r>
+        <w:rPr>
+          <w:rFonts w:eastAsia="Times New Roman" w:cs="Times New Roman"/>
+        </w:rPr>
+        <w:t>/db.js – A</w:t>
+      </w:r>
+      <w:r>
+        <w:rPr>
+          <w:rFonts w:eastAsia="Times New Roman" w:cs="Times New Roman"/>
+        </w:rPr>
+        <w:t xml:space="preserve">z adatbázis </w:t>
+      </w:r>
+      <w:proofErr w:type="gramStart"/>
+      <w:r>
+        <w:rPr>
+          <w:rFonts w:eastAsia="Times New Roman" w:cs="Times New Roman"/>
+        </w:rPr>
+        <w:t>használatát</w:t>
+      </w:r>
+      <w:proofErr w:type="gramEnd"/>
+      <w:r>
+        <w:rPr>
+          <w:rFonts w:eastAsia="Times New Roman" w:cs="Times New Roman"/>
+        </w:rPr>
+        <w:t xml:space="preserve"> illetve</w:t>
+      </w:r>
+      <w:r>
+        <w:rPr>
+          <w:rFonts w:eastAsia="Times New Roman" w:cs="Times New Roman"/>
+        </w:rPr>
+        <w:t xml:space="preserve"> kezelését tartalmazza, amit az </w:t>
+      </w:r>
+      <w:proofErr w:type="spellStart"/>
+      <w:r>
+        <w:rPr>
+          <w:rFonts w:eastAsia="Times New Roman" w:cs="Times New Roman"/>
+        </w:rPr>
+        <w:t>npm</w:t>
+      </w:r>
+      <w:proofErr w:type="spellEnd"/>
+      <w:r>
+        <w:rPr>
+          <w:rFonts w:eastAsia="Times New Roman" w:cs="Times New Roman"/>
+        </w:rPr>
+        <w:t xml:space="preserve"> </w:t>
       </w:r>
     </w:p>
     <w:p>
@@ -4528,7 +5163,21 @@
           <w:rFonts w:eastAsia="Times New Roman" w:cs="Times New Roman"/>
         </w:rPr>
         <w:tab/>
-        <w:t>mysql2 module biztosít.</w:t>
+        <w:t xml:space="preserve">mysql2 </w:t>
+      </w:r>
+      <w:proofErr w:type="spellStart"/>
+      <w:r>
+        <w:rPr>
+          <w:rFonts w:eastAsia="Times New Roman" w:cs="Times New Roman"/>
+        </w:rPr>
+        <w:t>module</w:t>
+      </w:r>
+      <w:proofErr w:type="spellEnd"/>
+      <w:r>
+        <w:rPr>
+          <w:rFonts w:eastAsia="Times New Roman" w:cs="Times New Roman"/>
+        </w:rPr>
+        <w:t xml:space="preserve"> biztosít.</w:t>
       </w:r>
     </w:p>
     <w:p>
@@ -4544,17 +5193,33 @@
         <w:tab/>
         <w:t xml:space="preserve">- </w:t>
       </w:r>
+      <w:proofErr w:type="spellStart"/>
       <w:r>
         <w:rPr>
           <w:rFonts w:eastAsia="Times New Roman" w:cs="Times New Roman"/>
         </w:rPr>
         <w:t>config</w:t>
       </w:r>
-      <w:r>
-        <w:rPr>
-          <w:rFonts w:eastAsia="Times New Roman" w:cs="Times New Roman"/>
-        </w:rPr>
-        <w:t>/database.sql – Az adatbázis leírását, kódját tartalmazza.</w:t>
+      <w:proofErr w:type="spellEnd"/>
+      <w:r>
+        <w:rPr>
+          <w:rFonts w:eastAsia="Times New Roman" w:cs="Times New Roman"/>
+        </w:rPr>
+        <w:t>/</w:t>
+      </w:r>
+      <w:proofErr w:type="spellStart"/>
+      <w:r>
+        <w:rPr>
+          <w:rFonts w:eastAsia="Times New Roman" w:cs="Times New Roman"/>
+        </w:rPr>
+        <w:t>database.sql</w:t>
+      </w:r>
+      <w:proofErr w:type="spellEnd"/>
+      <w:r>
+        <w:rPr>
+          <w:rFonts w:eastAsia="Times New Roman" w:cs="Times New Roman"/>
+        </w:rPr>
+        <w:t xml:space="preserve"> – Az adatbázis leírását, kódját tartalmazza.</w:t>
       </w:r>
     </w:p>
     <w:p>
@@ -4570,17 +5235,39 @@
         <w:tab/>
         <w:t xml:space="preserve">- </w:t>
       </w:r>
-      <w:r>
-        <w:rPr>
-          <w:rFonts w:eastAsia="Times New Roman" w:cs="Times New Roman"/>
-        </w:rPr>
-        <w:t>seed/</w:t>
-      </w:r>
-      <w:r>
-        <w:rPr>
-          <w:rFonts w:eastAsia="Times New Roman" w:cs="Times New Roman"/>
-        </w:rPr>
-        <w:t>seedFood.js – Az adatbázis alap adatait tartalmazza, mely ha lefut, feltölti őket</w:t>
+      <w:proofErr w:type="spellStart"/>
+      <w:r>
+        <w:rPr>
+          <w:rFonts w:eastAsia="Times New Roman" w:cs="Times New Roman"/>
+        </w:rPr>
+        <w:t>seed</w:t>
+      </w:r>
+      <w:proofErr w:type="spellEnd"/>
+      <w:r>
+        <w:rPr>
+          <w:rFonts w:eastAsia="Times New Roman" w:cs="Times New Roman"/>
+        </w:rPr>
+        <w:t>/</w:t>
+      </w:r>
+      <w:r>
+        <w:rPr>
+          <w:rFonts w:eastAsia="Times New Roman" w:cs="Times New Roman"/>
+        </w:rPr>
+        <w:t xml:space="preserve">seedFood.js – Az adatbázis alap adatait tartalmazza, </w:t>
+      </w:r>
+      <w:proofErr w:type="gramStart"/>
+      <w:r>
+        <w:rPr>
+          <w:rFonts w:eastAsia="Times New Roman" w:cs="Times New Roman"/>
+        </w:rPr>
+        <w:t>mely</w:t>
+      </w:r>
+      <w:proofErr w:type="gramEnd"/>
+      <w:r>
+        <w:rPr>
+          <w:rFonts w:eastAsia="Times New Roman" w:cs="Times New Roman"/>
+        </w:rPr>
+        <w:t xml:space="preserve"> ha lefut, feltölti őket</w:t>
       </w:r>
     </w:p>
     <w:p>
@@ -4594,8 +5281,23 @@
           <w:rFonts w:eastAsia="Times New Roman" w:cs="Times New Roman"/>
         </w:rPr>
         <w:tab/>
-        <w:t>.env</w:t>
-      </w:r>
+      </w:r>
+      <w:proofErr w:type="gramStart"/>
+      <w:r>
+        <w:rPr>
+          <w:rFonts w:eastAsia="Times New Roman" w:cs="Times New Roman"/>
+        </w:rPr>
+        <w:t>.</w:t>
+      </w:r>
+      <w:proofErr w:type="spellStart"/>
+      <w:r>
+        <w:rPr>
+          <w:rFonts w:eastAsia="Times New Roman" w:cs="Times New Roman"/>
+        </w:rPr>
+        <w:t>env</w:t>
+      </w:r>
+      <w:proofErr w:type="spellEnd"/>
+      <w:proofErr w:type="gramEnd"/>
       <w:r>
         <w:rPr>
           <w:rFonts w:eastAsia="Times New Roman" w:cs="Times New Roman"/>
@@ -4627,7 +5329,91 @@
           <w:rFonts w:eastAsia="Times New Roman" w:cs="Times New Roman"/>
         </w:rPr>
         <w:tab/>
-        <w:t>-node_modules – az npm csomagkezelő-höz szükséges, az npm init parancsal, automatikusan legenerálja</w:t>
+        <w:t>-</w:t>
+      </w:r>
+      <w:proofErr w:type="spellStart"/>
+      <w:r>
+        <w:rPr>
+          <w:rFonts w:eastAsia="Times New Roman" w:cs="Times New Roman"/>
+        </w:rPr>
+        <w:t>node_modules</w:t>
+      </w:r>
+      <w:proofErr w:type="spellEnd"/>
+      <w:r>
+        <w:rPr>
+          <w:rFonts w:eastAsia="Times New Roman" w:cs="Times New Roman"/>
+        </w:rPr>
+        <w:t xml:space="preserve"> – az </w:t>
+      </w:r>
+      <w:proofErr w:type="spellStart"/>
+      <w:r>
+        <w:rPr>
+          <w:rFonts w:eastAsia="Times New Roman" w:cs="Times New Roman"/>
+        </w:rPr>
+        <w:t>npm</w:t>
+      </w:r>
+      <w:proofErr w:type="spellEnd"/>
+      <w:r>
+        <w:rPr>
+          <w:rFonts w:eastAsia="Times New Roman" w:cs="Times New Roman"/>
+        </w:rPr>
+        <w:t xml:space="preserve"> csomagkezelő-</w:t>
+      </w:r>
+      <w:proofErr w:type="spellStart"/>
+      <w:r>
+        <w:rPr>
+          <w:rFonts w:eastAsia="Times New Roman" w:cs="Times New Roman"/>
+        </w:rPr>
+        <w:t>höz</w:t>
+      </w:r>
+      <w:proofErr w:type="spellEnd"/>
+      <w:r>
+        <w:rPr>
+          <w:rFonts w:eastAsia="Times New Roman" w:cs="Times New Roman"/>
+        </w:rPr>
+        <w:t xml:space="preserve"> szükséges, az </w:t>
+      </w:r>
+      <w:proofErr w:type="spellStart"/>
+      <w:r>
+        <w:rPr>
+          <w:rFonts w:eastAsia="Times New Roman" w:cs="Times New Roman"/>
+        </w:rPr>
+        <w:t>npm</w:t>
+      </w:r>
+      <w:proofErr w:type="spellEnd"/>
+      <w:r>
+        <w:rPr>
+          <w:rFonts w:eastAsia="Times New Roman" w:cs="Times New Roman"/>
+        </w:rPr>
+        <w:t xml:space="preserve"> </w:t>
+      </w:r>
+      <w:proofErr w:type="spellStart"/>
+      <w:r>
+        <w:rPr>
+          <w:rFonts w:eastAsia="Times New Roman" w:cs="Times New Roman"/>
+        </w:rPr>
+        <w:t>init</w:t>
+      </w:r>
+      <w:proofErr w:type="spellEnd"/>
+      <w:r>
+        <w:rPr>
+          <w:rFonts w:eastAsia="Times New Roman" w:cs="Times New Roman"/>
+        </w:rPr>
+        <w:t xml:space="preserve"> </w:t>
+      </w:r>
+      <w:proofErr w:type="spellStart"/>
+      <w:r>
+        <w:rPr>
+          <w:rFonts w:eastAsia="Times New Roman" w:cs="Times New Roman"/>
+        </w:rPr>
+        <w:t>parancsal</w:t>
+      </w:r>
+      <w:proofErr w:type="spellEnd"/>
+      <w:r>
+        <w:rPr>
+          <w:rFonts w:eastAsia="Times New Roman" w:cs="Times New Roman"/>
+        </w:rPr>
+        <w:t>, automatikusan legenerálja</w:t>
       </w:r>
     </w:p>
     <w:p>
@@ -4868,7 +5654,17 @@
     <w:p/>
     <w:p>
       <w:r>
-        <w:t>(A Views illetve a Public mappák nem a Backend részei)</w:t>
+        <w:t xml:space="preserve">(A </w:t>
+      </w:r>
+      <w:proofErr w:type="spellStart"/>
+      <w:proofErr w:type="gramStart"/>
+      <w:r>
+        <w:t>Views</w:t>
+      </w:r>
+      <w:proofErr w:type="spellEnd"/>
+      <w:proofErr w:type="gramEnd"/>
+      <w:r>
+        <w:t xml:space="preserve"> illetve a Public mappák nem a Backend részei)</w:t>
       </w:r>
     </w:p>
     <w:p>
@@ -5022,7 +5818,15 @@
         <w:t>-</w:t>
       </w:r>
       <w:r>
-        <w:t xml:space="preserve"> apiRoutes:</w:t>
+        <w:t xml:space="preserve"> </w:t>
+      </w:r>
+      <w:proofErr w:type="spellStart"/>
+      <w:r>
+        <w:t>apiRoutes</w:t>
+      </w:r>
+      <w:proofErr w:type="spellEnd"/>
+      <w:r>
+        <w:t>:</w:t>
       </w:r>
     </w:p>
     <w:p>
@@ -5030,7 +5834,20 @@
         <w:ind w:left="1843"/>
       </w:pPr>
       <w:r>
-        <w:t>- get(’/’)</w:t>
+        <w:t xml:space="preserve">- </w:t>
+      </w:r>
+      <w:proofErr w:type="spellStart"/>
+      <w:proofErr w:type="gramStart"/>
+      <w:r>
+        <w:t>get</w:t>
+      </w:r>
+      <w:proofErr w:type="spellEnd"/>
+      <w:r>
+        <w:t>(</w:t>
+      </w:r>
+      <w:proofErr w:type="gramEnd"/>
+      <w:r>
+        <w:t>’/’)</w:t>
       </w:r>
     </w:p>
     <w:p>
@@ -5038,7 +5855,15 @@
         <w:ind w:left="1843"/>
       </w:pPr>
       <w:r>
-        <w:t>- get(’/login’)</w:t>
+        <w:t xml:space="preserve">- </w:t>
+      </w:r>
+      <w:proofErr w:type="spellStart"/>
+      <w:r>
+        <w:t>get</w:t>
+      </w:r>
+      <w:proofErr w:type="spellEnd"/>
+      <w:r>
+        <w:t>(’/login’)</w:t>
       </w:r>
     </w:p>
     <w:p>
@@ -5046,7 +5871,23 @@
         <w:ind w:left="1843"/>
       </w:pPr>
       <w:r>
-        <w:t>- get(’/registration’)</w:t>
+        <w:t xml:space="preserve">- </w:t>
+      </w:r>
+      <w:proofErr w:type="spellStart"/>
+      <w:r>
+        <w:t>get</w:t>
+      </w:r>
+      <w:proofErr w:type="spellEnd"/>
+      <w:r>
+        <w:t>(’/</w:t>
+      </w:r>
+      <w:proofErr w:type="spellStart"/>
+      <w:r>
+        <w:t>registration</w:t>
+      </w:r>
+      <w:proofErr w:type="spellEnd"/>
+      <w:r>
+        <w:t>’)</w:t>
       </w:r>
     </w:p>
     <w:p>
@@ -5054,7 +5895,15 @@
         <w:ind w:left="1843"/>
       </w:pPr>
       <w:r>
-        <w:t>- post(’order’)</w:t>
+        <w:t>- post(’</w:t>
+      </w:r>
+      <w:proofErr w:type="spellStart"/>
+      <w:r>
+        <w:t>order</w:t>
+      </w:r>
+      <w:proofErr w:type="spellEnd"/>
+      <w:r>
+        <w:t>’)</w:t>
       </w:r>
     </w:p>
     <w:p>
@@ -5062,8 +5911,13 @@
         <w:tab/>
         <w:t xml:space="preserve">- </w:t>
       </w:r>
-      <w:r>
-        <w:t>pageRoutes:</w:t>
+      <w:proofErr w:type="spellStart"/>
+      <w:r>
+        <w:t>pageRoutes</w:t>
+      </w:r>
+      <w:proofErr w:type="spellEnd"/>
+      <w:r>
+        <w:t>:</w:t>
       </w:r>
     </w:p>
     <w:p>
@@ -5071,7 +5925,20 @@
         <w:ind w:left="1843"/>
       </w:pPr>
       <w:r>
-        <w:t>- get(’/’)</w:t>
+        <w:t xml:space="preserve">- </w:t>
+      </w:r>
+      <w:proofErr w:type="spellStart"/>
+      <w:proofErr w:type="gramStart"/>
+      <w:r>
+        <w:t>get</w:t>
+      </w:r>
+      <w:proofErr w:type="spellEnd"/>
+      <w:r>
+        <w:t>(</w:t>
+      </w:r>
+      <w:proofErr w:type="gramEnd"/>
+      <w:r>
+        <w:t>’/’)</w:t>
       </w:r>
     </w:p>
     <w:p>
@@ -5079,13 +5946,37 @@
         <w:ind w:left="1843"/>
       </w:pPr>
       <w:r>
-        <w:t>- get(’/profile’)</w:t>
+        <w:t xml:space="preserve">- </w:t>
+      </w:r>
+      <w:proofErr w:type="spellStart"/>
+      <w:r>
+        <w:t>get</w:t>
+      </w:r>
+      <w:proofErr w:type="spellEnd"/>
+      <w:r>
+        <w:t>(’/</w:t>
+      </w:r>
+      <w:proofErr w:type="spellStart"/>
+      <w:r>
+        <w:t>profile</w:t>
+      </w:r>
+      <w:proofErr w:type="spellEnd"/>
+      <w:r>
+        <w:t>’)</w:t>
       </w:r>
     </w:p>
     <w:p>
       <w:r>
         <w:tab/>
-        <w:t>- userRoutes:</w:t>
+        <w:t xml:space="preserve">- </w:t>
+      </w:r>
+      <w:proofErr w:type="spellStart"/>
+      <w:r>
+        <w:t>userRoutes</w:t>
+      </w:r>
+      <w:proofErr w:type="spellEnd"/>
+      <w:r>
+        <w:t>:</w:t>
       </w:r>
     </w:p>
     <w:p>
@@ -5093,7 +5984,15 @@
         <w:ind w:left="1843"/>
       </w:pPr>
       <w:r>
-        <w:t>- post(’/feltoltes’)</w:t>
+        <w:t>- post(’/</w:t>
+      </w:r>
+      <w:proofErr w:type="spellStart"/>
+      <w:r>
+        <w:t>feltoltes</w:t>
+      </w:r>
+      <w:proofErr w:type="spellEnd"/>
+      <w:r>
+        <w:t>’)</w:t>
       </w:r>
     </w:p>
     <w:p>
@@ -5109,20 +6008,57 @@
         <w:ind w:left="1843"/>
       </w:pPr>
       <w:r>
-        <w:t>- delete(’/delete’)</w:t>
+        <w:t xml:space="preserve">- </w:t>
+      </w:r>
+      <w:proofErr w:type="spellStart"/>
+      <w:r>
+        <w:t>delete</w:t>
+      </w:r>
+      <w:proofErr w:type="spellEnd"/>
+      <w:r>
+        <w:t>(’/</w:t>
+      </w:r>
+      <w:proofErr w:type="spellStart"/>
+      <w:r>
+        <w:t>delete</w:t>
+      </w:r>
+      <w:proofErr w:type="spellEnd"/>
+      <w:r>
+        <w:t>’)</w:t>
       </w:r>
     </w:p>
     <w:p/>
     <w:p/>
     <w:p>
       <w:r>
-        <w:t>A Backend végpontjai(API) tesztelésére a</w:t>
-      </w:r>
-      <w:r>
-        <w:t xml:space="preserve"> Jest</w:t>
-      </w:r>
-      <w:r>
-        <w:t xml:space="preserve"> SuperTest-et használtuk,</w:t>
+        <w:t xml:space="preserve">A Backend </w:t>
+      </w:r>
+      <w:proofErr w:type="gramStart"/>
+      <w:r>
+        <w:t>végpontjai(</w:t>
+      </w:r>
+      <w:proofErr w:type="gramEnd"/>
+      <w:r>
+        <w:t>API) tesztelésére a</w:t>
+      </w:r>
+      <w:r>
+        <w:t xml:space="preserve"> </w:t>
+      </w:r>
+      <w:proofErr w:type="spellStart"/>
+      <w:r>
+        <w:t>Jest</w:t>
+      </w:r>
+      <w:proofErr w:type="spellEnd"/>
+      <w:r>
+        <w:t xml:space="preserve"> </w:t>
+      </w:r>
+      <w:proofErr w:type="spellStart"/>
+      <w:r>
+        <w:t>SuperTest-et</w:t>
+      </w:r>
+      <w:proofErr w:type="spellEnd"/>
+      <w:r>
+        <w:t xml:space="preserve"> használtuk,</w:t>
       </w:r>
       <w:r>
         <w:t xml:space="preserve"> illetve a manuális teszt során, a Postman programban teszteltük, amíg a frontend nem lett hozzá készen.</w:t>
@@ -5653,14 +6589,22 @@
     </w:p>
     <w:p>
       <w:pPr>
-        <w:pageBreakBefore/>
+        <w:rPr>
+          <w:rFonts w:eastAsia="Times New Roman" w:cs="Times New Roman"/>
+          <w:szCs w:val="24"/>
+        </w:rPr>
+      </w:pPr>
+      <w:proofErr w:type="spellStart"/>
+      <w:r>
         <w:rPr>
           <w:rFonts w:eastAsia="Times New Roman" w:cs="Times New Roman"/>
           <w:b/>
           <w:bCs/>
           <w:szCs w:val="24"/>
         </w:rPr>
-      </w:pPr>
+        <w:t>SuperTest</w:t>
+      </w:r>
+      <w:proofErr w:type="spellEnd"/>
       <w:r>
         <w:rPr>
           <w:rFonts w:eastAsia="Times New Roman" w:cs="Times New Roman"/>
@@ -5668,8 +6612,7 @@
           <w:bCs/>
           <w:szCs w:val="24"/>
         </w:rPr>
-        <w:lastRenderedPageBreak/>
-        <w:t>SuperTest:</w:t>
+        <w:t>:</w:t>
       </w:r>
       <w:r>
         <w:rPr>
@@ -5699,13 +6642,21 @@
           <w:rFonts w:eastAsia="Times New Roman" w:cs="Times New Roman"/>
           <w:szCs w:val="24"/>
         </w:rPr>
-        <w:t xml:space="preserve"> tartalmazza</w:t>
-      </w:r>
+        <w:t xml:space="preserve"> </w:t>
+      </w:r>
+      <w:proofErr w:type="gramStart"/>
       <w:r>
         <w:rPr>
           <w:rFonts w:eastAsia="Times New Roman" w:cs="Times New Roman"/>
           <w:szCs w:val="24"/>
         </w:rPr>
+        <w:t>tartalmazza</w:t>
+      </w:r>
+      <w:r>
+        <w:rPr>
+          <w:rFonts w:eastAsia="Times New Roman" w:cs="Times New Roman"/>
+          <w:szCs w:val="24"/>
+        </w:rPr>
         <w:t xml:space="preserve"> </w:t>
       </w:r>
       <w:r>
@@ -5727,13 +6678,37 @@
           <w:rFonts w:eastAsia="Times New Roman" w:cs="Times New Roman"/>
           <w:szCs w:val="24"/>
         </w:rPr>
-        <w:t xml:space="preserve">y csomag, amit az npm csomagkezelővel lehet feltelepíteni, mely lehetővé teszi az API-k automatikus tesztelését, úgynevezett Unit teszteket lehet </w:t>
-      </w:r>
+        <w:t>y</w:t>
+      </w:r>
+      <w:proofErr w:type="gramEnd"/>
       <w:r>
         <w:rPr>
           <w:rFonts w:eastAsia="Times New Roman" w:cs="Times New Roman"/>
           <w:szCs w:val="24"/>
         </w:rPr>
+        <w:t xml:space="preserve"> csomag, amit az </w:t>
+      </w:r>
+      <w:proofErr w:type="spellStart"/>
+      <w:r>
+        <w:rPr>
+          <w:rFonts w:eastAsia="Times New Roman" w:cs="Times New Roman"/>
+          <w:szCs w:val="24"/>
+        </w:rPr>
+        <w:t>npm</w:t>
+      </w:r>
+      <w:proofErr w:type="spellEnd"/>
+      <w:r>
+        <w:rPr>
+          <w:rFonts w:eastAsia="Times New Roman" w:cs="Times New Roman"/>
+          <w:szCs w:val="24"/>
+        </w:rPr>
+        <w:t xml:space="preserve"> csomagkezelővel lehet feltelepíteni, mely lehetővé teszi az API-k automatikus tesztelését, úgynevezett Unit teszteket lehet </w:t>
+      </w:r>
+      <w:r>
+        <w:rPr>
+          <w:rFonts w:eastAsia="Times New Roman" w:cs="Times New Roman"/>
+          <w:szCs w:val="24"/>
+        </w:rPr>
         <w:t>vele írni.</w:t>
       </w:r>
       <w:r>
@@ -5754,6 +6729,7 @@
         <w:rPr>
           <w:noProof/>
         </w:rPr>
+        <w:lastRenderedPageBreak/>
         <w:drawing>
           <wp:inline distT="0" distB="0" distL="0" distR="0" wp14:anchorId="3D2FC15C" wp14:editId="5A6D71F6">
             <wp:extent cx="5486400" cy="3088168"/>
@@ -5824,6 +6800,647 @@
         </w:rPr>
         <w:t xml:space="preserve">A Projektben használt szerepe, és kódrészletek: </w:t>
       </w:r>
+    </w:p>
+    <w:p>
+      <w:pPr>
+        <w:rPr>
+          <w:rFonts w:eastAsia="Times New Roman" w:cs="Times New Roman"/>
+          <w:szCs w:val="24"/>
+        </w:rPr>
+      </w:pPr>
+    </w:p>
+    <w:p>
+      <w:pPr>
+        <w:rPr>
+          <w:rFonts w:eastAsia="Times New Roman" w:cs="Times New Roman"/>
+          <w:b/>
+          <w:bCs/>
+          <w:szCs w:val="24"/>
+        </w:rPr>
+      </w:pPr>
+      <w:r>
+        <w:rPr>
+          <w:rFonts w:eastAsia="Times New Roman" w:cs="Times New Roman"/>
+          <w:b/>
+          <w:bCs/>
+          <w:szCs w:val="24"/>
+        </w:rPr>
+        <w:drawing>
+          <wp:inline distT="0" distB="0" distL="0" distR="0" wp14:anchorId="16E16F7D" wp14:editId="4DAF568B">
+            <wp:extent cx="5579745" cy="4527550"/>
+            <wp:effectExtent l="0" t="0" r="1905" b="6350"/>
+            <wp:docPr id="42" name="Kép 42"/>
+            <wp:cNvGraphicFramePr>
+              <a:graphicFrameLocks xmlns:a="http://schemas.openxmlformats.org/drawingml/2006/main" noChangeAspect="1"/>
+            </wp:cNvGraphicFramePr>
+            <a:graphic xmlns:a="http://schemas.openxmlformats.org/drawingml/2006/main">
+              <a:graphicData uri="http://schemas.openxmlformats.org/drawingml/2006/picture">
+                <pic:pic xmlns:pic="http://schemas.openxmlformats.org/drawingml/2006/picture">
+                  <pic:nvPicPr>
+                    <pic:cNvPr id="1" name=""/>
+                    <pic:cNvPicPr/>
+                  </pic:nvPicPr>
+                  <pic:blipFill>
+                    <a:blip r:embed="rId18"/>
+                    <a:stretch>
+                      <a:fillRect/>
+                    </a:stretch>
+                  </pic:blipFill>
+                  <pic:spPr>
+                    <a:xfrm>
+                      <a:off x="0" y="0"/>
+                      <a:ext cx="5579745" cy="4527550"/>
+                    </a:xfrm>
+                    <a:prstGeom prst="rect">
+                      <a:avLst/>
+                    </a:prstGeom>
+                  </pic:spPr>
+                </pic:pic>
+              </a:graphicData>
+            </a:graphic>
+          </wp:inline>
+        </w:drawing>
+      </w:r>
+    </w:p>
+    <w:p>
+      <w:pPr>
+        <w:rPr>
+          <w:rFonts w:eastAsia="Times New Roman" w:cs="Times New Roman"/>
+          <w:szCs w:val="24"/>
+        </w:rPr>
+      </w:pPr>
+      <w:r>
+        <w:rPr>
+          <w:rFonts w:eastAsia="Times New Roman" w:cs="Times New Roman"/>
+          <w:szCs w:val="24"/>
+        </w:rPr>
+        <w:t xml:space="preserve">Itt </w:t>
+      </w:r>
+      <w:r>
+        <w:rPr>
+          <w:rFonts w:eastAsia="Times New Roman" w:cs="Times New Roman"/>
+          <w:szCs w:val="24"/>
+        </w:rPr>
+        <w:t>az /</w:t>
+      </w:r>
+      <w:proofErr w:type="spellStart"/>
+      <w:r>
+        <w:rPr>
+          <w:rFonts w:eastAsia="Times New Roman" w:cs="Times New Roman"/>
+          <w:szCs w:val="24"/>
+        </w:rPr>
+        <w:t>api</w:t>
+      </w:r>
+      <w:proofErr w:type="spellEnd"/>
+      <w:r>
+        <w:rPr>
+          <w:rFonts w:eastAsia="Times New Roman" w:cs="Times New Roman"/>
+          <w:szCs w:val="24"/>
+        </w:rPr>
+        <w:t xml:space="preserve"> végpontot, egy </w:t>
+      </w:r>
+      <w:proofErr w:type="spellStart"/>
+      <w:r>
+        <w:rPr>
+          <w:rFonts w:eastAsia="Times New Roman" w:cs="Times New Roman"/>
+          <w:szCs w:val="24"/>
+        </w:rPr>
+        <w:t>get</w:t>
+      </w:r>
+      <w:proofErr w:type="spellEnd"/>
+      <w:r>
+        <w:rPr>
+          <w:rFonts w:eastAsia="Times New Roman" w:cs="Times New Roman"/>
+          <w:szCs w:val="24"/>
+        </w:rPr>
+        <w:t xml:space="preserve"> kérést tesztelünk le. A </w:t>
+      </w:r>
+      <w:proofErr w:type="spellStart"/>
+      <w:r>
+        <w:rPr>
+          <w:rFonts w:eastAsia="Times New Roman" w:cs="Times New Roman"/>
+          <w:szCs w:val="24"/>
+        </w:rPr>
+        <w:t>describe</w:t>
+      </w:r>
+      <w:proofErr w:type="spellEnd"/>
+      <w:r>
+        <w:rPr>
+          <w:rFonts w:eastAsia="Times New Roman" w:cs="Times New Roman"/>
+          <w:szCs w:val="24"/>
+        </w:rPr>
+        <w:t xml:space="preserve"> egy </w:t>
+      </w:r>
+      <w:proofErr w:type="spellStart"/>
+      <w:r>
+        <w:rPr>
+          <w:rFonts w:eastAsia="Times New Roman" w:cs="Times New Roman"/>
+          <w:szCs w:val="24"/>
+        </w:rPr>
+        <w:t>api</w:t>
+      </w:r>
+      <w:proofErr w:type="spellEnd"/>
+      <w:r>
+        <w:rPr>
+          <w:rFonts w:eastAsia="Times New Roman" w:cs="Times New Roman"/>
+          <w:szCs w:val="24"/>
+        </w:rPr>
+        <w:t xml:space="preserve"> tesztet mutat, a test, a teszteset, </w:t>
+      </w:r>
+      <w:proofErr w:type="gramStart"/>
+      <w:r>
+        <w:rPr>
+          <w:rFonts w:eastAsia="Times New Roman" w:cs="Times New Roman"/>
+          <w:szCs w:val="24"/>
+        </w:rPr>
+        <w:t>illetve</w:t>
+      </w:r>
+      <w:proofErr w:type="gramEnd"/>
+      <w:r>
+        <w:rPr>
+          <w:rFonts w:eastAsia="Times New Roman" w:cs="Times New Roman"/>
+          <w:szCs w:val="24"/>
+        </w:rPr>
+        <w:t xml:space="preserve"> hogy mit várunk vissza. </w:t>
+      </w:r>
+      <w:r>
+        <w:rPr>
+          <w:rFonts w:eastAsia="Times New Roman" w:cs="Times New Roman"/>
+          <w:szCs w:val="24"/>
+        </w:rPr>
+        <w:t xml:space="preserve">Egy valós függvény adatait, </w:t>
+      </w:r>
+      <w:proofErr w:type="spellStart"/>
+      <w:r>
+        <w:rPr>
+          <w:rFonts w:eastAsia="Times New Roman" w:cs="Times New Roman"/>
+          <w:szCs w:val="24"/>
+        </w:rPr>
+        <w:t>Mock-oljuk</w:t>
+      </w:r>
+      <w:proofErr w:type="spellEnd"/>
+      <w:r>
+        <w:rPr>
+          <w:rFonts w:eastAsia="Times New Roman" w:cs="Times New Roman"/>
+          <w:szCs w:val="24"/>
+        </w:rPr>
+        <w:t xml:space="preserve">, tehát nem </w:t>
+      </w:r>
+      <w:r>
+        <w:rPr>
+          <w:rFonts w:eastAsia="Times New Roman" w:cs="Times New Roman"/>
+          <w:szCs w:val="24"/>
+        </w:rPr>
+        <w:lastRenderedPageBreak/>
+        <w:t xml:space="preserve">valós adatbázis kapcsolat, nem valós adatokkal dolgozunk a tesztelés során. Az </w:t>
+      </w:r>
+      <w:proofErr w:type="spellStart"/>
+      <w:r>
+        <w:rPr>
+          <w:rFonts w:eastAsia="Times New Roman" w:cs="Times New Roman"/>
+          <w:szCs w:val="24"/>
+        </w:rPr>
+        <w:t>except</w:t>
+      </w:r>
+      <w:proofErr w:type="spellEnd"/>
+      <w:r>
+        <w:rPr>
+          <w:rFonts w:eastAsia="Times New Roman" w:cs="Times New Roman"/>
+          <w:szCs w:val="24"/>
+        </w:rPr>
+        <w:t xml:space="preserve">-ek, azok, amiket vissza </w:t>
+      </w:r>
+      <w:proofErr w:type="gramStart"/>
+      <w:r>
+        <w:rPr>
+          <w:rFonts w:eastAsia="Times New Roman" w:cs="Times New Roman"/>
+          <w:szCs w:val="24"/>
+        </w:rPr>
+        <w:t>kell</w:t>
+      </w:r>
+      <w:proofErr w:type="gramEnd"/>
+      <w:r>
+        <w:rPr>
+          <w:rFonts w:eastAsia="Times New Roman" w:cs="Times New Roman"/>
+          <w:szCs w:val="24"/>
+        </w:rPr>
+        <w:t xml:space="preserve"> hogy kapjunk, hogy a tesztünk sikeres legyen. </w:t>
+      </w:r>
+    </w:p>
+    <w:p>
+      <w:pPr>
+        <w:ind w:firstLine="708"/>
+        <w:rPr>
+          <w:rFonts w:eastAsia="Times New Roman" w:cs="Times New Roman"/>
+          <w:szCs w:val="24"/>
+        </w:rPr>
+      </w:pPr>
+      <w:r>
+        <w:rPr>
+          <w:rFonts w:eastAsia="Times New Roman" w:cs="Times New Roman"/>
+          <w:szCs w:val="24"/>
+        </w:rPr>
+        <w:t>Sikeres Teszt:</w:t>
+      </w:r>
+    </w:p>
+    <w:p>
+      <w:pPr>
+        <w:ind w:firstLine="708"/>
+        <w:rPr>
+          <w:rFonts w:eastAsia="Times New Roman" w:cs="Times New Roman"/>
+          <w:szCs w:val="24"/>
+        </w:rPr>
+      </w:pPr>
+      <w:r>
+        <w:rPr>
+          <w:rFonts w:eastAsia="Times New Roman" w:cs="Times New Roman"/>
+          <w:szCs w:val="24"/>
+        </w:rPr>
+        <w:tab/>
+        <w:t>Státuszkód: 200</w:t>
+      </w:r>
+    </w:p>
+    <w:p>
+      <w:pPr>
+        <w:ind w:firstLine="708"/>
+        <w:rPr>
+          <w:rFonts w:eastAsia="Times New Roman" w:cs="Times New Roman"/>
+          <w:szCs w:val="24"/>
+        </w:rPr>
+      </w:pPr>
+      <w:r>
+        <w:rPr>
+          <w:rFonts w:eastAsia="Times New Roman" w:cs="Times New Roman"/>
+          <w:szCs w:val="24"/>
+        </w:rPr>
+        <w:tab/>
+        <w:t>Tartalom: Üres</w:t>
+      </w:r>
+    </w:p>
+    <w:p>
+      <w:pPr>
+        <w:rPr>
+          <w:rFonts w:eastAsia="Times New Roman" w:cs="Times New Roman"/>
+          <w:szCs w:val="24"/>
+        </w:rPr>
+      </w:pPr>
+    </w:p>
+    <w:p>
+      <w:pPr>
+        <w:rPr>
+          <w:rFonts w:eastAsia="Times New Roman" w:cs="Times New Roman"/>
+          <w:szCs w:val="24"/>
+        </w:rPr>
+      </w:pPr>
+      <w:r>
+        <w:rPr>
+          <w:rFonts w:eastAsia="Times New Roman" w:cs="Times New Roman"/>
+          <w:szCs w:val="24"/>
+        </w:rPr>
+        <w:t xml:space="preserve">Ez egy úgynevezett </w:t>
+      </w:r>
+      <w:proofErr w:type="gramStart"/>
+      <w:r>
+        <w:rPr>
+          <w:rFonts w:eastAsia="Times New Roman" w:cs="Times New Roman"/>
+          <w:szCs w:val="24"/>
+        </w:rPr>
+        <w:t>egységteszt(</w:t>
+      </w:r>
+      <w:proofErr w:type="gramEnd"/>
+      <w:r>
+        <w:rPr>
+          <w:rFonts w:eastAsia="Times New Roman" w:cs="Times New Roman"/>
+          <w:szCs w:val="24"/>
+        </w:rPr>
+        <w:t>Unit Test), ami a kódunknak, egy meghatározott, kisebb egységét teszteli automatikusan.</w:t>
+      </w:r>
+    </w:p>
+    <w:p>
+      <w:pPr>
+        <w:rPr>
+          <w:rFonts w:eastAsia="Times New Roman" w:cs="Times New Roman"/>
+          <w:szCs w:val="24"/>
+        </w:rPr>
+      </w:pPr>
+    </w:p>
+    <w:p>
+      <w:pPr>
+        <w:rPr>
+          <w:rFonts w:eastAsia="Times New Roman" w:cs="Times New Roman"/>
+          <w:szCs w:val="24"/>
+        </w:rPr>
+      </w:pPr>
+      <w:r>
+        <w:rPr>
+          <w:rFonts w:eastAsia="Times New Roman" w:cs="Times New Roman"/>
+          <w:szCs w:val="24"/>
+        </w:rPr>
+        <w:t>Tesztelés Indítása:</w:t>
+      </w:r>
+    </w:p>
+    <w:p>
+      <w:pPr>
+        <w:rPr>
+          <w:rFonts w:eastAsia="Times New Roman" w:cs="Times New Roman"/>
+          <w:szCs w:val="24"/>
+        </w:rPr>
+      </w:pPr>
+      <w:r>
+        <w:rPr>
+          <w:rFonts w:eastAsia="Times New Roman" w:cs="Times New Roman"/>
+          <w:szCs w:val="24"/>
+        </w:rPr>
+        <w:tab/>
+      </w:r>
+      <w:r>
+        <w:rPr>
+          <w:rFonts w:eastAsia="Times New Roman" w:cs="Times New Roman"/>
+          <w:szCs w:val="24"/>
+        </w:rPr>
+        <w:t xml:space="preserve">A szerver indítással </w:t>
+      </w:r>
+      <w:proofErr w:type="gramStart"/>
+      <w:r>
+        <w:rPr>
+          <w:rFonts w:eastAsia="Times New Roman" w:cs="Times New Roman"/>
+          <w:szCs w:val="24"/>
+        </w:rPr>
+        <w:t>szemben(</w:t>
+      </w:r>
+      <w:proofErr w:type="spellStart"/>
+      <w:proofErr w:type="gramEnd"/>
+      <w:r>
+        <w:rPr>
+          <w:rFonts w:eastAsia="Times New Roman" w:cs="Times New Roman"/>
+          <w:szCs w:val="24"/>
+        </w:rPr>
+        <w:t>node</w:t>
+      </w:r>
+      <w:proofErr w:type="spellEnd"/>
+      <w:r>
+        <w:rPr>
+          <w:rFonts w:eastAsia="Times New Roman" w:cs="Times New Roman"/>
+          <w:szCs w:val="24"/>
+        </w:rPr>
+        <w:t xml:space="preserve"> server) ezt, az </w:t>
+      </w:r>
+      <w:proofErr w:type="spellStart"/>
+      <w:r>
+        <w:rPr>
+          <w:rFonts w:eastAsia="Times New Roman" w:cs="Times New Roman"/>
+          <w:szCs w:val="24"/>
+        </w:rPr>
+        <w:t>npx</w:t>
+      </w:r>
+      <w:proofErr w:type="spellEnd"/>
+      <w:r>
+        <w:rPr>
+          <w:rFonts w:eastAsia="Times New Roman" w:cs="Times New Roman"/>
+          <w:szCs w:val="24"/>
+        </w:rPr>
+        <w:t>(</w:t>
+      </w:r>
+      <w:proofErr w:type="spellStart"/>
+      <w:r>
+        <w:rPr>
+          <w:rFonts w:eastAsia="Times New Roman" w:cs="Times New Roman"/>
+          <w:szCs w:val="24"/>
+        </w:rPr>
+        <w:t>Node</w:t>
+      </w:r>
+      <w:proofErr w:type="spellEnd"/>
+      <w:r>
+        <w:rPr>
+          <w:rFonts w:eastAsia="Times New Roman" w:cs="Times New Roman"/>
+          <w:szCs w:val="24"/>
+        </w:rPr>
+        <w:t xml:space="preserve"> </w:t>
+      </w:r>
+      <w:proofErr w:type="spellStart"/>
+      <w:r>
+        <w:rPr>
+          <w:rFonts w:eastAsia="Times New Roman" w:cs="Times New Roman"/>
+          <w:szCs w:val="24"/>
+        </w:rPr>
+        <w:t>Package</w:t>
+      </w:r>
+      <w:proofErr w:type="spellEnd"/>
+      <w:r>
+        <w:rPr>
+          <w:rFonts w:eastAsia="Times New Roman" w:cs="Times New Roman"/>
+          <w:szCs w:val="24"/>
+        </w:rPr>
+        <w:t xml:space="preserve"> </w:t>
+      </w:r>
+      <w:proofErr w:type="spellStart"/>
+      <w:r>
+        <w:rPr>
+          <w:rFonts w:eastAsia="Times New Roman" w:cs="Times New Roman"/>
+          <w:szCs w:val="24"/>
+        </w:rPr>
+        <w:t>Executor</w:t>
+      </w:r>
+      <w:proofErr w:type="spellEnd"/>
+      <w:r>
+        <w:rPr>
+          <w:rFonts w:eastAsia="Times New Roman" w:cs="Times New Roman"/>
+          <w:szCs w:val="24"/>
+        </w:rPr>
+        <w:t>)-</w:t>
+      </w:r>
+      <w:proofErr w:type="spellStart"/>
+      <w:r>
+        <w:rPr>
+          <w:rFonts w:eastAsia="Times New Roman" w:cs="Times New Roman"/>
+          <w:szCs w:val="24"/>
+        </w:rPr>
+        <w:t>al</w:t>
+      </w:r>
+      <w:proofErr w:type="spellEnd"/>
+      <w:r>
+        <w:rPr>
+          <w:rFonts w:eastAsia="Times New Roman" w:cs="Times New Roman"/>
+          <w:szCs w:val="24"/>
+        </w:rPr>
+        <w:t xml:space="preserve"> kell elindítani.</w:t>
+      </w:r>
+    </w:p>
+    <w:p>
+      <w:pPr>
+        <w:rPr>
+          <w:rFonts w:eastAsia="Times New Roman" w:cs="Times New Roman"/>
+          <w:szCs w:val="24"/>
+        </w:rPr>
+      </w:pPr>
+      <w:r>
+        <w:rPr>
+          <w:rFonts w:eastAsia="Times New Roman" w:cs="Times New Roman"/>
+          <w:szCs w:val="24"/>
+        </w:rPr>
+        <w:t xml:space="preserve">parancs: </w:t>
+      </w:r>
+      <w:proofErr w:type="spellStart"/>
+      <w:r>
+        <w:rPr>
+          <w:rFonts w:eastAsia="Times New Roman" w:cs="Times New Roman"/>
+          <w:szCs w:val="24"/>
+        </w:rPr>
+        <w:t>npx</w:t>
+      </w:r>
+      <w:proofErr w:type="spellEnd"/>
+      <w:r>
+        <w:rPr>
+          <w:rFonts w:eastAsia="Times New Roman" w:cs="Times New Roman"/>
+          <w:szCs w:val="24"/>
+        </w:rPr>
+        <w:t xml:space="preserve"> </w:t>
+      </w:r>
+      <w:proofErr w:type="spellStart"/>
+      <w:r>
+        <w:rPr>
+          <w:rFonts w:eastAsia="Times New Roman" w:cs="Times New Roman"/>
+          <w:szCs w:val="24"/>
+        </w:rPr>
+        <w:t>jest</w:t>
+      </w:r>
+      <w:proofErr w:type="spellEnd"/>
+      <w:r>
+        <w:rPr>
+          <w:rFonts w:eastAsia="Times New Roman" w:cs="Times New Roman"/>
+          <w:szCs w:val="24"/>
+        </w:rPr>
+        <w:t xml:space="preserve"> </w:t>
+      </w:r>
+      <w:r>
+        <w:rPr>
+          <w:rFonts w:eastAsia="Times New Roman" w:cs="Times New Roman"/>
+          <w:szCs w:val="24"/>
+        </w:rPr>
+        <w:t>--</w:t>
+      </w:r>
+      <w:proofErr w:type="spellStart"/>
+      <w:r>
+        <w:rPr>
+          <w:rFonts w:eastAsia="Times New Roman" w:cs="Times New Roman"/>
+          <w:szCs w:val="24"/>
+        </w:rPr>
+        <w:t>detectOpenHandles</w:t>
+      </w:r>
+      <w:proofErr w:type="spellEnd"/>
+    </w:p>
+    <w:p>
+      <w:pPr>
+        <w:rPr>
+          <w:noProof/>
+        </w:rPr>
+      </w:pPr>
+      <w:r>
+        <w:rPr>
+          <w:rFonts w:eastAsia="Times New Roman" w:cs="Times New Roman"/>
+          <w:szCs w:val="24"/>
+        </w:rPr>
+        <w:t xml:space="preserve">A -- </w:t>
+      </w:r>
+      <w:proofErr w:type="spellStart"/>
+      <w:r>
+        <w:rPr>
+          <w:rFonts w:eastAsia="Times New Roman" w:cs="Times New Roman"/>
+          <w:szCs w:val="24"/>
+        </w:rPr>
+        <w:t>detectOpenHandles</w:t>
+      </w:r>
+      <w:proofErr w:type="spellEnd"/>
+      <w:r>
+        <w:rPr>
+          <w:rFonts w:eastAsia="Times New Roman" w:cs="Times New Roman"/>
+          <w:szCs w:val="24"/>
+        </w:rPr>
+        <w:t>, azért szükséges, mert ha esetleg, a tesztelés nem állna le magától, a parancsra, akkor ez leállítja, miután a teszt visszaadta az eredményt.</w:t>
+      </w:r>
+      <w:r>
+        <w:rPr>
+          <w:noProof/>
+        </w:rPr>
+        <w:t xml:space="preserve"> </w:t>
+      </w:r>
+    </w:p>
+    <w:p>
+      <w:pPr>
+        <w:rPr>
+          <w:noProof/>
+        </w:rPr>
+      </w:pPr>
+    </w:p>
+    <w:p>
+      <w:pPr>
+        <w:rPr>
+          <w:noProof/>
+        </w:rPr>
+      </w:pPr>
+      <w:r>
+        <w:rPr>
+          <w:noProof/>
+        </w:rPr>
+        <w:t>Tesztelési Eredmény:</w:t>
+      </w:r>
+    </w:p>
+    <w:p>
+      <w:pPr>
+        <w:rPr>
+          <w:rFonts w:eastAsia="Times New Roman" w:cs="Times New Roman"/>
+          <w:szCs w:val="24"/>
+        </w:rPr>
+      </w:pPr>
+      <w:r>
+        <w:rPr>
+          <w:rFonts w:eastAsia="Times New Roman" w:cs="Times New Roman"/>
+          <w:szCs w:val="24"/>
+        </w:rPr>
+        <w:drawing>
+          <wp:inline distT="0" distB="0" distL="0" distR="0" wp14:anchorId="74E39104" wp14:editId="593F2A08">
+            <wp:extent cx="4544059" cy="1543265"/>
+            <wp:effectExtent l="0" t="0" r="9525" b="0"/>
+            <wp:docPr id="44" name="Kép 44"/>
+            <wp:cNvGraphicFramePr>
+              <a:graphicFrameLocks xmlns:a="http://schemas.openxmlformats.org/drawingml/2006/main" noChangeAspect="1"/>
+            </wp:cNvGraphicFramePr>
+            <a:graphic xmlns:a="http://schemas.openxmlformats.org/drawingml/2006/main">
+              <a:graphicData uri="http://schemas.openxmlformats.org/drawingml/2006/picture">
+                <pic:pic xmlns:pic="http://schemas.openxmlformats.org/drawingml/2006/picture">
+                  <pic:nvPicPr>
+                    <pic:cNvPr id="1" name=""/>
+                    <pic:cNvPicPr/>
+                  </pic:nvPicPr>
+                  <pic:blipFill>
+                    <a:blip r:embed="rId19"/>
+                    <a:stretch>
+                      <a:fillRect/>
+                    </a:stretch>
+                  </pic:blipFill>
+                  <pic:spPr>
+                    <a:xfrm>
+                      <a:off x="0" y="0"/>
+                      <a:ext cx="4544059" cy="1543265"/>
+                    </a:xfrm>
+                    <a:prstGeom prst="rect">
+                      <a:avLst/>
+                    </a:prstGeom>
+                  </pic:spPr>
+                </pic:pic>
+              </a:graphicData>
+            </a:graphic>
+          </wp:inline>
+        </w:drawing>
+      </w:r>
+    </w:p>
+    <w:p>
+      <w:pPr>
+        <w:rPr>
+          <w:rFonts w:eastAsia="Times New Roman" w:cs="Times New Roman"/>
+          <w:szCs w:val="24"/>
+        </w:rPr>
+      </w:pPr>
     </w:p>
     <w:p>
       <w:pPr>
@@ -6001,7 +7618,7 @@
                     <pic:cNvPicPr/>
                   </pic:nvPicPr>
                   <pic:blipFill>
-                    <a:blip r:embed="rId18">
+                    <a:blip r:embed="rId20">
                       <a:extLst>
                         <a:ext uri="{28A0092B-C50C-407E-A947-70E740481C1C}">
                           <a14:useLocalDpi xmlns:a14="http://schemas.microsoft.com/office/drawing/2010/main" val="0"/>
@@ -6037,7 +7654,21 @@
         <w:rPr>
           <w:rFonts w:eastAsia="Times New Roman" w:cs="Times New Roman"/>
         </w:rPr>
-        <w:t xml:space="preserve"> Backend Szerver kezeli, mikor megváltozik az id egy külön met</w:t>
+        <w:t xml:space="preserve"> Backend Szerver kezeli, mikor megváltozik az </w:t>
+      </w:r>
+      <w:proofErr w:type="spellStart"/>
+      <w:r>
+        <w:rPr>
+          <w:rFonts w:eastAsia="Times New Roman" w:cs="Times New Roman"/>
+        </w:rPr>
+        <w:t>id</w:t>
+      </w:r>
+      <w:proofErr w:type="spellEnd"/>
+      <w:r>
+        <w:rPr>
+          <w:rFonts w:eastAsia="Times New Roman" w:cs="Times New Roman"/>
+        </w:rPr>
+        <w:t xml:space="preserve"> egy külön met</w:t>
       </w:r>
       <w:r>
         <w:rPr>
@@ -6075,7 +7706,63 @@
         <w:rPr>
           <w:rFonts w:eastAsia="Times New Roman" w:cs="Times New Roman"/>
         </w:rPr>
-        <w:t xml:space="preserve"> idHandler metódus, újraosztja az id-t, így, mindig a valós id számát kapjuk az adott terméknek</w:t>
+        <w:t xml:space="preserve"> </w:t>
+      </w:r>
+      <w:proofErr w:type="spellStart"/>
+      <w:r>
+        <w:rPr>
+          <w:rFonts w:eastAsia="Times New Roman" w:cs="Times New Roman"/>
+        </w:rPr>
+        <w:t>idHandler</w:t>
+      </w:r>
+      <w:proofErr w:type="spellEnd"/>
+      <w:r>
+        <w:rPr>
+          <w:rFonts w:eastAsia="Times New Roman" w:cs="Times New Roman"/>
+        </w:rPr>
+        <w:t xml:space="preserve"> metódus, </w:t>
+      </w:r>
+      <w:proofErr w:type="spellStart"/>
+      <w:r>
+        <w:rPr>
+          <w:rFonts w:eastAsia="Times New Roman" w:cs="Times New Roman"/>
+        </w:rPr>
+        <w:t>újraosztja</w:t>
+      </w:r>
+      <w:proofErr w:type="spellEnd"/>
+      <w:r>
+        <w:rPr>
+          <w:rFonts w:eastAsia="Times New Roman" w:cs="Times New Roman"/>
+        </w:rPr>
+        <w:t xml:space="preserve"> az </w:t>
+      </w:r>
+      <w:proofErr w:type="spellStart"/>
+      <w:r>
+        <w:rPr>
+          <w:rFonts w:eastAsia="Times New Roman" w:cs="Times New Roman"/>
+        </w:rPr>
+        <w:t>id</w:t>
+      </w:r>
+      <w:proofErr w:type="spellEnd"/>
+      <w:r>
+        <w:rPr>
+          <w:rFonts w:eastAsia="Times New Roman" w:cs="Times New Roman"/>
+        </w:rPr>
+        <w:t xml:space="preserve">-t, így, mindig a valós </w:t>
+      </w:r>
+      <w:proofErr w:type="spellStart"/>
+      <w:r>
+        <w:rPr>
+          <w:rFonts w:eastAsia="Times New Roman" w:cs="Times New Roman"/>
+        </w:rPr>
+        <w:t>id</w:t>
+      </w:r>
+      <w:proofErr w:type="spellEnd"/>
+      <w:r>
+        <w:rPr>
+          <w:rFonts w:eastAsia="Times New Roman" w:cs="Times New Roman"/>
+        </w:rPr>
+        <w:t xml:space="preserve"> számát kapjuk az adott terméknek</w:t>
       </w:r>
       <w:r>
         <w:rPr>
@@ -6108,7 +7795,15 @@
         <w:jc w:val="left"/>
       </w:pPr>
       <w:r>
-        <w:t>A Frontend azon része egy weboldalnak vagy alkalmazásnak, amit a felhasználó tud látni és interaktálni vele, bele értve a megjelenés, a gombok és maga a tartalom. A weboldal elkészítéséhez</w:t>
+        <w:t xml:space="preserve">A Frontend azon része egy weboldalnak vagy alkalmazásnak, amit a felhasználó tud látni és </w:t>
+      </w:r>
+      <w:proofErr w:type="spellStart"/>
+      <w:r>
+        <w:t>interaktálni</w:t>
+      </w:r>
+      <w:proofErr w:type="spellEnd"/>
+      <w:r>
+        <w:t xml:space="preserve"> vele, bele értve a megjelenés, a gombok és maga a tartalom. A weboldal elkészítéséhez</w:t>
       </w:r>
       <w:r>
         <w:t xml:space="preserve"> a HTML, CSS és JavaScript </w:t>
@@ -6201,7 +7896,15 @@
         <w:t>A frontend, több hónapos munkája után, a kinézetet elkészítettük, és véglegessé formáltuk.</w:t>
       </w:r>
       <w:r>
-        <w:t xml:space="preserve"> A logo-t az egyik csapat tag készítette, az alsó képeket, AI generálta.</w:t>
+        <w:t xml:space="preserve"> A </w:t>
+      </w:r>
+      <w:proofErr w:type="spellStart"/>
+      <w:r>
+        <w:t>logo</w:t>
+      </w:r>
+      <w:proofErr w:type="spellEnd"/>
+      <w:r>
+        <w:t>-t az egyik csapat tag készítette, az alsó képeket, AI generálta.</w:t>
       </w:r>
     </w:p>
     <w:p>
@@ -6243,7 +7946,7 @@
                     <pic:cNvPicPr/>
                   </pic:nvPicPr>
                   <pic:blipFill>
-                    <a:blip r:embed="rId19" cstate="print">
+                    <a:blip r:embed="rId21" cstate="print">
                       <a:extLst>
                         <a:ext uri="{28A0092B-C50C-407E-A947-70E740481C1C}">
                           <a14:useLocalDpi xmlns:a14="http://schemas.microsoft.com/office/drawing/2010/main" val="0"/>
@@ -6303,7 +8006,7 @@
                     <pic:cNvPicPr/>
                   </pic:nvPicPr>
                   <pic:blipFill>
-                    <a:blip r:embed="rId20">
+                    <a:blip r:embed="rId22">
                       <a:extLst>
                         <a:ext uri="{28A0092B-C50C-407E-A947-70E740481C1C}">
                           <a14:useLocalDpi xmlns:a14="http://schemas.microsoft.com/office/drawing/2010/main" val="0"/>
@@ -6355,7 +8058,7 @@
                     <pic:cNvPicPr/>
                   </pic:nvPicPr>
                   <pic:blipFill>
-                    <a:blip r:embed="rId21"/>
+                    <a:blip r:embed="rId23"/>
                     <a:stretch>
                       <a:fillRect/>
                     </a:stretch>
@@ -6558,7 +8261,15 @@
         <w:jc w:val="left"/>
       </w:pPr>
       <w:r>
-        <w:t>A regisztrációs oldal le van kezelve, hogy a felhasználó beteljesítse az új profil készítéséhez elvárt követelményeket, amiket ha megvalósít, a piros színből átvált zöldre, jelezve, hogy az adott követelményt sikeresen megtette.</w:t>
+        <w:t xml:space="preserve">A regisztrációs oldal le van kezelve, hogy a felhasználó beteljesítse az új profil készítéséhez elvárt követelményeket, </w:t>
+      </w:r>
+      <w:proofErr w:type="gramStart"/>
+      <w:r>
+        <w:t>amiket</w:t>
+      </w:r>
+      <w:proofErr w:type="gramEnd"/>
+      <w:r>
+        <w:t xml:space="preserve"> ha megvalósít, a piros színből átvált zöldre, jelezve, hogy az adott követelményt sikeresen megtette.</w:t>
       </w:r>
     </w:p>
     <w:p>
@@ -6603,7 +8314,7 @@
                     <pic:cNvPicPr/>
                   </pic:nvPicPr>
                   <pic:blipFill>
-                    <a:blip r:embed="rId22"/>
+                    <a:blip r:embed="rId24"/>
                     <a:stretch>
                       <a:fillRect/>
                     </a:stretch>
@@ -6857,7 +8568,7 @@
                     <pic:cNvPicPr/>
                   </pic:nvPicPr>
                   <pic:blipFill>
-                    <a:blip r:embed="rId23"/>
+                    <a:blip r:embed="rId25"/>
                     <a:stretch>
                       <a:fillRect/>
                     </a:stretch>
@@ -6899,11 +8610,21 @@
         <w:spacing w:line="259" w:lineRule="auto"/>
         <w:jc w:val="left"/>
       </w:pPr>
+      <w:proofErr w:type="gramStart"/>
       <w:r>
         <w:t>EJS</w:t>
       </w:r>
       <w:r>
-        <w:t>(Embedded JavaScript)</w:t>
+        <w:t>(</w:t>
+      </w:r>
+      <w:proofErr w:type="spellStart"/>
+      <w:proofErr w:type="gramEnd"/>
+      <w:r>
+        <w:t>Embedded</w:t>
+      </w:r>
+      <w:proofErr w:type="spellEnd"/>
+      <w:r>
+        <w:t xml:space="preserve"> JavaScript)</w:t>
       </w:r>
       <w:r>
         <w:t>: Az adatbázisból érkező értékek beágyazását segítette elő.</w:t>
@@ -6940,7 +8661,7 @@
                     <pic:cNvPicPr/>
                   </pic:nvPicPr>
                   <pic:blipFill>
-                    <a:blip r:embed="rId24"/>
+                    <a:blip r:embed="rId26"/>
                     <a:stretch>
                       <a:fillRect/>
                     </a:stretch>
@@ -7031,7 +8752,7 @@
                     <pic:cNvPicPr/>
                   </pic:nvPicPr>
                   <pic:blipFill>
-                    <a:blip r:embed="rId25"/>
+                    <a:blip r:embed="rId27"/>
                     <a:stretch>
                       <a:fillRect/>
                     </a:stretch>
@@ -7066,7 +8787,23 @@
           <w:b/>
           <w:bCs/>
         </w:rPr>
-        <w:t>(EJS értékadás: &lt;%= foodName %&gt;)</w:t>
+        <w:t xml:space="preserve">(EJS értékadás: &lt;%= </w:t>
+      </w:r>
+      <w:proofErr w:type="spellStart"/>
+      <w:r>
+        <w:rPr>
+          <w:b/>
+          <w:bCs/>
+        </w:rPr>
+        <w:t>foodName</w:t>
+      </w:r>
+      <w:proofErr w:type="spellEnd"/>
+      <w:r>
+        <w:rPr>
+          <w:b/>
+          <w:bCs/>
+        </w:rPr>
+        <w:t xml:space="preserve"> %&gt;)</w:t>
       </w:r>
     </w:p>
     <w:p>
@@ -7085,23 +8822,53 @@
         <w:spacing w:line="259" w:lineRule="auto"/>
         <w:jc w:val="left"/>
       </w:pPr>
+      <w:proofErr w:type="spellStart"/>
       <w:r>
         <w:rPr>
           <w:b/>
           <w:bCs/>
         </w:rPr>
         <w:lastRenderedPageBreak/>
-        <w:t>Admin Applikáció</w:t>
-      </w:r>
+        <w:t>Admin</w:t>
+      </w:r>
+      <w:proofErr w:type="spellEnd"/>
       <w:r>
         <w:rPr>
           <w:b/>
           <w:bCs/>
         </w:rPr>
+        <w:t xml:space="preserve"> Applikáció</w:t>
+      </w:r>
+      <w:r>
+        <w:rPr>
+          <w:b/>
+          <w:bCs/>
+        </w:rPr>
         <w:t xml:space="preserve">: </w:t>
       </w:r>
       <w:r>
-        <w:t>Az admin applikáció, Visual Studio(VS)-ben készült C# nyelven, WPF</w:t>
+        <w:t xml:space="preserve">Az </w:t>
+      </w:r>
+      <w:proofErr w:type="spellStart"/>
+      <w:r>
+        <w:t>admin</w:t>
+      </w:r>
+      <w:proofErr w:type="spellEnd"/>
+      <w:r>
+        <w:t xml:space="preserve"> applikáció, Visual </w:t>
+      </w:r>
+      <w:proofErr w:type="spellStart"/>
+      <w:proofErr w:type="gramStart"/>
+      <w:r>
+        <w:t>Studio</w:t>
+      </w:r>
+      <w:proofErr w:type="spellEnd"/>
+      <w:r>
+        <w:t>(</w:t>
+      </w:r>
+      <w:proofErr w:type="gramEnd"/>
+      <w:r>
+        <w:t>VS)-ben készült C# nyelven, WPF</w:t>
       </w:r>
       <w:r>
         <w:t xml:space="preserve"> technikával</w:t>
@@ -7114,7 +8881,14 @@
       </w:r>
       <w:r>
         <w:br/>
-        <w:t xml:space="preserve">Admin applikációnak a feladata, hogy egy újonnan felregisztrált felhasználó fiókját aktiválni lehessen, ez egyfajta moderálási jogkört ad, hogyha </w:t>
+      </w:r>
+      <w:proofErr w:type="spellStart"/>
+      <w:r>
+        <w:t>Admin</w:t>
+      </w:r>
+      <w:proofErr w:type="spellEnd"/>
+      <w:r>
+        <w:t xml:space="preserve"> applikációnak a feladata, hogy egy újonnan felregisztrált felhasználó fiókját aktiválni lehessen, ez egyfajta moderálási jogkört ad, hogyha </w:t>
       </w:r>
       <w:r>
         <w:t xml:space="preserve">valaki </w:t>
@@ -7282,7 +9056,7 @@
               </wp:anchor>
             </w:drawing>
           </mc:Choice>
-          <mc:Fallback xmlns:a="http://schemas.openxmlformats.org/drawingml/2006/main" xmlns:pic="http://schemas.openxmlformats.org/drawingml/2006/picture" xmlns:a14="http://schemas.microsoft.com/office/drawing/2010/main">
+          <mc:Fallback xmlns:a14="http://schemas.microsoft.com/office/drawing/2010/main" xmlns:pic="http://schemas.openxmlformats.org/drawingml/2006/picture" xmlns:a="http://schemas.openxmlformats.org/drawingml/2006/main">
             <w:pict>
               <v:shape id="Derékszögű háromszög 7" style="position:absolute;margin-left:0;margin-top:-71pt;width:190.5pt;height:190.5pt;rotation:90;z-index:251670528;visibility:visible;mso-wrap-style:square;mso-width-percent:0;mso-wrap-distance-left:9pt;mso-wrap-distance-top:0;mso-wrap-distance-right:9pt;mso-wrap-distance-bottom:0;mso-position-horizontal:left;mso-position-horizontal-relative:page;mso-position-vertical:absolute;mso-position-vertical-relative:text;mso-width-percent:0;mso-width-relative:margin;v-text-anchor:middle" coordsize="2419350,2419350" o:spid="_x0000_s1026" fillcolor="#ed7d31 [3205]" stroked="f" strokeweight="1pt" path="m,2419350l,c806450,806450,-382154,2206666,2419350,2419350l,2419350xe" o:gfxdata="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" w14:anchorId="3D992DA4">
                 <v:stroke joinstyle="miter"/>
@@ -7331,7 +9105,15 @@
         <w:t xml:space="preserve"> Manuális Teszt – (</w:t>
       </w:r>
       <w:r>
-        <w:t>http kérés/URL alapján, a POSTMAN alkalmazás segítségével illetve a válaszkódok ellenőrzésével.</w:t>
+        <w:t xml:space="preserve">http kérés/URL alapján, a POSTMAN alkalmazás </w:t>
+      </w:r>
+      <w:proofErr w:type="gramStart"/>
+      <w:r>
+        <w:t>segítségével</w:t>
+      </w:r>
+      <w:proofErr w:type="gramEnd"/>
+      <w:r>
+        <w:t xml:space="preserve"> illetve a válaszkódok ellenőrzésével.</w:t>
       </w:r>
       <w:r>
         <w:t>)</w:t>
@@ -7359,7 +9141,15 @@
         <w:t>(</w:t>
       </w:r>
       <w:r>
-        <w:t>A JEST SuperTest csomagját felhasználva</w:t>
+        <w:t xml:space="preserve">A JEST </w:t>
+      </w:r>
+      <w:proofErr w:type="spellStart"/>
+      <w:r>
+        <w:t>SuperTest</w:t>
+      </w:r>
+      <w:proofErr w:type="spellEnd"/>
+      <w:r>
+        <w:t xml:space="preserve"> csomagját felhasználva</w:t>
       </w:r>
       <w:r>
         <w:t>, pársoros kódrészeket írtunk, a végpontok automatikus tesztelésére. Ezt egy külön indítási módszerrel kell elindítani, és akkor fog lefutni a teszt.</w:t>
@@ -7536,7 +9326,7 @@
               </wp:anchor>
             </w:drawing>
           </mc:Choice>
-          <mc:Fallback xmlns:a="http://schemas.openxmlformats.org/drawingml/2006/main" xmlns:pic="http://schemas.openxmlformats.org/drawingml/2006/picture" xmlns:a14="http://schemas.microsoft.com/office/drawing/2010/main">
+          <mc:Fallback xmlns:a14="http://schemas.microsoft.com/office/drawing/2010/main" xmlns:pic="http://schemas.openxmlformats.org/drawingml/2006/picture" xmlns:a="http://schemas.openxmlformats.org/drawingml/2006/main">
             <w:pict>
               <v:shape id="Derékszögű háromszög 7" style="position:absolute;margin-left:0;margin-top:-71.35pt;width:190.5pt;height:190.5pt;rotation:90;z-index:251672576;visibility:visible;mso-wrap-style:square;mso-width-percent:0;mso-wrap-distance-left:9pt;mso-wrap-distance-top:0;mso-wrap-distance-right:9pt;mso-wrap-distance-bottom:0;mso-position-horizontal:left;mso-position-horizontal-relative:page;mso-position-vertical:absolute;mso-position-vertical-relative:text;mso-width-percent:0;mso-width-relative:margin;v-text-anchor:middle" coordsize="2419350,2419350" o:spid="_x0000_s1026" fillcolor="#ed7d31 [3205]" stroked="f" strokeweight="1pt" path="m,2419350l,c806450,806450,-382154,2206666,2419350,2419350l,2419350xe" o:gfxdata="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" w14:anchorId="0AF53019">
                 <v:stroke joinstyle="miter"/>
@@ -7572,8 +9362,13 @@
     </w:p>
     <w:p/>
     <w:p>
-      <w:r>
-        <w:t>Admin felületen nagyobb jogkör, illetve szebb kinézet</w:t>
+      <w:proofErr w:type="spellStart"/>
+      <w:r>
+        <w:t>Admin</w:t>
+      </w:r>
+      <w:proofErr w:type="spellEnd"/>
+      <w:r>
+        <w:t xml:space="preserve"> felületen nagyobb jogkör, illetve szebb kinézet</w:t>
       </w:r>
     </w:p>
     <w:sectPr>

</xml_diff>

<commit_message>
GET, POST tesztelése, illetve dokumentálása
</commit_message>
<xml_diff>
--- a/FejlesztőisablonWIP.docx
+++ b/FejlesztőisablonWIP.docx
@@ -141,7 +141,7 @@
               </wp:anchor>
             </w:drawing>
           </mc:Choice>
-          <mc:Fallback xmlns:a14="http://schemas.microsoft.com/office/drawing/2010/main" xmlns:pic="http://schemas.openxmlformats.org/drawingml/2006/picture" xmlns:a="http://schemas.openxmlformats.org/drawingml/2006/main">
+          <mc:Fallback xmlns:a="http://schemas.openxmlformats.org/drawingml/2006/main" xmlns:pic="http://schemas.openxmlformats.org/drawingml/2006/picture" xmlns:a14="http://schemas.microsoft.com/office/drawing/2010/main">
             <w:pict>
               <v:shape id="Derékszögű háromszög 7" style="position:absolute;margin-left:0;margin-top:-70.65pt;width:190.5pt;height:190.5pt;rotation:90;z-index:251660288;visibility:visible;mso-wrap-style:square;mso-width-percent:0;mso-wrap-distance-left:9pt;mso-wrap-distance-top:0;mso-wrap-distance-right:9pt;mso-wrap-distance-bottom:0;mso-position-horizontal:left;mso-position-horizontal-relative:page;mso-position-vertical:absolute;mso-position-vertical-relative:text;mso-width-percent:0;mso-width-relative:margin;v-text-anchor:middle" coordsize="2419350,2419350" o:spid="_x0000_s1026" fillcolor="#ed7d31 [3205]" stroked="f" strokeweight="1pt" path="m,2419350l,c806450,806450,-382154,2206666,2419350,2419350l,2419350xe" o:gfxdata="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" w14:anchorId="022CF62E">
                 <v:stroke joinstyle="miter"/>
@@ -1114,7 +1114,7 @@
               </wp:anchor>
             </w:drawing>
           </mc:Choice>
-          <mc:Fallback xmlns:a14="http://schemas.microsoft.com/office/drawing/2010/main" xmlns:pic="http://schemas.openxmlformats.org/drawingml/2006/picture" xmlns:a="http://schemas.openxmlformats.org/drawingml/2006/main">
+          <mc:Fallback xmlns:a="http://schemas.openxmlformats.org/drawingml/2006/main" xmlns:pic="http://schemas.openxmlformats.org/drawingml/2006/picture" xmlns:a14="http://schemas.microsoft.com/office/drawing/2010/main">
             <w:pict>
               <v:shape id="Derékszögű háromszög 7" style="position:absolute;margin-left:-86.55pt;margin-top:-71.05pt;width:190.5pt;height:190.5pt;rotation:90;z-index:251662336;visibility:visible;mso-wrap-style:square;mso-width-percent:0;mso-wrap-distance-left:9pt;mso-wrap-distance-top:0;mso-wrap-distance-right:9pt;mso-wrap-distance-bottom:0;mso-position-horizontal:absolute;mso-position-horizontal-relative:text;mso-position-vertical:absolute;mso-position-vertical-relative:text;mso-width-percent:0;mso-width-relative:margin;v-text-anchor:middle" coordsize="2419350,2419350" o:spid="_x0000_s1026" fillcolor="#ed7d31 [3205]" stroked="f" strokeweight="1pt" path="m,2419350l,c806450,806450,-382154,2206666,2419350,2419350l,2419350xe" o:gfxdata="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" w14:anchorId="76C634DC">
                 <v:stroke joinstyle="miter"/>
@@ -1149,15 +1149,7 @@
         <w:t xml:space="preserve">A </w:t>
       </w:r>
       <w:r>
-        <w:t xml:space="preserve">weboldalt, csak a regisztráció, illetve az </w:t>
-      </w:r>
-      <w:proofErr w:type="spellStart"/>
-      <w:r>
-        <w:t>adminok</w:t>
-      </w:r>
-      <w:proofErr w:type="spellEnd"/>
-      <w:r>
-        <w:t xml:space="preserve"> által jóváhagyást követően lehet használni</w:t>
+        <w:t>weboldalt, csak a regisztráció, illetve az adminok által jóváhagyást követően lehet használni</w:t>
       </w:r>
       <w:r>
         <w:t xml:space="preserve">. </w:t>
@@ -1166,15 +1158,7 @@
         <w:t>A szükséges adatok: Felhasználónév, Lakcím, Email, Jelszó, Jelszó megint</w:t>
       </w:r>
       <w:r>
-        <w:t xml:space="preserve">. A Jelszót nem rögzítjük, egy úgynevezett HASH technikával </w:t>
-      </w:r>
-      <w:proofErr w:type="spellStart"/>
-      <w:r>
-        <w:t>titkosítjuk</w:t>
-      </w:r>
-      <w:proofErr w:type="spellEnd"/>
-      <w:r>
-        <w:t xml:space="preserve">, melyet egy </w:t>
+        <w:t xml:space="preserve">. A Jelszót nem rögzítjük, egy úgynevezett HASH technikával titkosítjuk, melyet egy </w:t>
       </w:r>
       <w:r>
         <w:t>modul generál, és azt tároljuk el</w:t>
@@ -1333,7 +1317,7 @@
               </wp:anchor>
             </w:drawing>
           </mc:Choice>
-          <mc:Fallback xmlns:a14="http://schemas.microsoft.com/office/drawing/2010/main" xmlns:pic="http://schemas.openxmlformats.org/drawingml/2006/picture" xmlns:a="http://schemas.openxmlformats.org/drawingml/2006/main">
+          <mc:Fallback xmlns:a="http://schemas.openxmlformats.org/drawingml/2006/main" xmlns:pic="http://schemas.openxmlformats.org/drawingml/2006/picture" xmlns:a14="http://schemas.microsoft.com/office/drawing/2010/main">
             <w:pict>
               <v:shape id="Derékszögű háromszög 7" style="position:absolute;margin-left:0;margin-top:-71.15pt;width:190.5pt;height:190.5pt;rotation:90;z-index:251664384;visibility:visible;mso-wrap-style:square;mso-width-percent:0;mso-wrap-distance-left:9pt;mso-wrap-distance-top:0;mso-wrap-distance-right:9pt;mso-wrap-distance-bottom:0;mso-position-horizontal:left;mso-position-horizontal-relative:page;mso-position-vertical:absolute;mso-position-vertical-relative:text;mso-width-percent:0;mso-width-relative:margin;v-text-anchor:middle" coordsize="2419350,2419350" o:spid="_x0000_s1026" fillcolor="#ed7d31 [3205]" stroked="f" strokeweight="1pt" path="m,2419350l,c806450,806450,-382154,2206666,2419350,2419350l,2419350xe" o:gfxdata="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" w14:anchorId="2E1CBD0A">
                 <v:stroke joinstyle="miter"/>
@@ -1423,15 +1407,7 @@
         <w:t>:</w:t>
       </w:r>
       <w:r>
-        <w:t xml:space="preserve"> 1–2 magos, 1 </w:t>
-      </w:r>
-      <w:proofErr w:type="spellStart"/>
-      <w:r>
-        <w:t>GHz</w:t>
-      </w:r>
-      <w:proofErr w:type="spellEnd"/>
-      <w:r>
-        <w:t>-es processzor</w:t>
+        <w:t xml:space="preserve"> 1–2 magos, 1 GHz-es processzor</w:t>
       </w:r>
     </w:p>
     <w:p>
@@ -1464,15 +1440,7 @@
         <w:t>:</w:t>
       </w:r>
       <w:r>
-        <w:t xml:space="preserve"> 2–4 magos, modern CPU (pl. Intel i3 vagy AMD </w:t>
-      </w:r>
-      <w:proofErr w:type="spellStart"/>
-      <w:r>
-        <w:t>Ryzen</w:t>
-      </w:r>
-      <w:proofErr w:type="spellEnd"/>
-      <w:r>
-        <w:t xml:space="preserve"> 3)</w:t>
+        <w:t xml:space="preserve"> 2–4 magos, modern CPU (pl. Intel i3 vagy AMD Ryzen 3)</w:t>
       </w:r>
     </w:p>
     <w:p>
@@ -1757,15 +1725,7 @@
         <w:t>B</w:t>
       </w:r>
       <w:r>
-        <w:t xml:space="preserve">öngésző (pl.: Chrome, </w:t>
-      </w:r>
-      <w:proofErr w:type="spellStart"/>
-      <w:r>
-        <w:t>FireFox</w:t>
-      </w:r>
-      <w:proofErr w:type="spellEnd"/>
-      <w:r>
-        <w:t>)</w:t>
+        <w:t>öngésző (pl.: Chrome, FireFox)</w:t>
       </w:r>
     </w:p>
     <w:p>
@@ -1798,15 +1758,7 @@
         <w:t xml:space="preserve">Egy weboldal futtatásához alapvetően nem kell túl erős hardver – különösen akkor, ha csak fejlesztésre vagy kisebb forgalmú kiszolgálásra használjuk. </w:t>
       </w:r>
       <w:r>
-        <w:t xml:space="preserve">Az operációs rendszer biztosítja azt az alapvető környezetet, ahol a webszerver, adatbázis és egyéb szoftverek futnak. Például Windows, Linux vagy </w:t>
-      </w:r>
-      <w:proofErr w:type="spellStart"/>
-      <w:r>
-        <w:t>macOS</w:t>
-      </w:r>
-      <w:proofErr w:type="spellEnd"/>
-      <w:r>
-        <w:t>. Ez futtatja a XAMPP-ot és kezeli a rendszer erőforrásait.</w:t>
+        <w:t>Az operációs rendszer biztosítja azt az alapvető környezetet, ahol a webszerver, adatbázis és egyéb szoftverek futnak. Például Windows, Linux vagy macOS. Ez futtatja a XAMPP-ot és kezeli a rendszer erőforrásait.</w:t>
       </w:r>
       <w:r>
         <w:t xml:space="preserve"> A XAMPP egy olyan csomag, amely tartalmazza a legfontosabb szerverkomponenseket, amik szükségesek a weboldal futtatásához, tehát lehetővé teszi, hogy helyben (lokálisan) futtassuk és teszteljük a weboldalt. A böngésző egy kliensprogram, am</w:t>
@@ -1821,15 +1773,7 @@
         <w:t>Maga a</w:t>
       </w:r>
       <w:r>
-        <w:t xml:space="preserve"> böngésző kérést küld a szervernek (pl. a XAMPP által futtatott </w:t>
-      </w:r>
-      <w:proofErr w:type="spellStart"/>
-      <w:r>
-        <w:t>Apache-nak</w:t>
-      </w:r>
-      <w:proofErr w:type="spellEnd"/>
-      <w:r>
-        <w:t>), majd megjeleníti a válaszként kapott HTML, CSS és JavaScript tartalmat.</w:t>
+        <w:t xml:space="preserve"> böngésző kérést küld a szervernek (pl. a XAMPP által futtatott Apache-nak), majd megjeleníti a válaszként kapott HTML, CSS és JavaScript tartalmat.</w:t>
       </w:r>
     </w:p>
     <w:p>
@@ -1985,7 +1929,7 @@
               </wp:anchor>
             </w:drawing>
           </mc:Choice>
-          <mc:Fallback xmlns:a14="http://schemas.microsoft.com/office/drawing/2010/main" xmlns:pic="http://schemas.openxmlformats.org/drawingml/2006/picture" xmlns:a="http://schemas.openxmlformats.org/drawingml/2006/main">
+          <mc:Fallback xmlns:a="http://schemas.openxmlformats.org/drawingml/2006/main" xmlns:pic="http://schemas.openxmlformats.org/drawingml/2006/picture" xmlns:a14="http://schemas.microsoft.com/office/drawing/2010/main">
             <w:pict>
               <v:shape id="Derékszögű háromszög 7" style="position:absolute;margin-left:0;margin-top:-71.1pt;width:190.5pt;height:190.5pt;rotation:90;z-index:251666432;visibility:visible;mso-wrap-style:square;mso-width-percent:0;mso-wrap-distance-left:9pt;mso-wrap-distance-top:0;mso-wrap-distance-right:9pt;mso-wrap-distance-bottom:0;mso-position-horizontal:left;mso-position-horizontal-relative:page;mso-position-vertical:absolute;mso-position-vertical-relative:text;mso-width-percent:0;mso-width-relative:margin;v-text-anchor:middle" coordsize="2419350,2419350" o:spid="_x0000_s1026" fillcolor="#ed7d31 [3205]" stroked="f" strokeweight="1pt" path="m,2419350l,c806450,806450,-382154,2206666,2419350,2419350l,2419350xe" o:gfxdata="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" w14:anchorId="2FA07425">
                 <v:stroke joinstyle="miter"/>
@@ -2149,7 +2093,6 @@
         </w:rPr>
         <w:t>(</w:t>
       </w:r>
-      <w:proofErr w:type="spellStart"/>
       <w:proofErr w:type="gramEnd"/>
       <w:r>
         <w:rPr>
@@ -2157,26 +2100,11 @@
         </w:rPr>
         <w:t>Fejlesztői</w:t>
       </w:r>
-      <w:proofErr w:type="spellEnd"/>
       <w:r>
         <w:rPr>
           <w:lang w:val="en-US"/>
         </w:rPr>
-        <w:t xml:space="preserve"> </w:t>
-      </w:r>
-      <w:proofErr w:type="spellStart"/>
-      <w:r>
-        <w:rPr>
-          <w:lang w:val="en-US"/>
-        </w:rPr>
-        <w:t>Környezet</w:t>
-      </w:r>
-      <w:proofErr w:type="spellEnd"/>
-      <w:r>
-        <w:rPr>
-          <w:lang w:val="en-US"/>
-        </w:rPr>
-        <w:t>)</w:t>
+        <w:t xml:space="preserve"> Környezet)</w:t>
       </w:r>
     </w:p>
     <w:p>
@@ -2205,43 +2133,17 @@
         <w:t xml:space="preserve">.1 </w:t>
       </w:r>
       <w:r>
-        <w:t xml:space="preserve">Visual </w:t>
-      </w:r>
-      <w:proofErr w:type="spellStart"/>
-      <w:r>
-        <w:t>Studio</w:t>
-      </w:r>
-      <w:proofErr w:type="spellEnd"/>
-      <w:r>
-        <w:t xml:space="preserve"> </w:t>
-      </w:r>
-      <w:proofErr w:type="spellStart"/>
-      <w:r>
-        <w:t>Code</w:t>
+        <w:t>Visual Studio Code</w:t>
       </w:r>
       <w:bookmarkEnd w:id="3"/>
-      <w:proofErr w:type="spellEnd"/>
-    </w:p>
-    <w:p>
-      <w:r>
-        <w:t xml:space="preserve">A Visual </w:t>
-      </w:r>
-      <w:proofErr w:type="spellStart"/>
-      <w:r>
-        <w:t>Studio</w:t>
-      </w:r>
-      <w:proofErr w:type="spellEnd"/>
-      <w:r>
-        <w:t xml:space="preserve"> </w:t>
-      </w:r>
-      <w:proofErr w:type="spellStart"/>
+    </w:p>
+    <w:p>
+      <w:r>
+        <w:t xml:space="preserve">A Visual Studio </w:t>
+      </w:r>
       <w:proofErr w:type="gramStart"/>
       <w:r>
-        <w:t>Code</w:t>
-      </w:r>
-      <w:proofErr w:type="spellEnd"/>
-      <w:r>
-        <w:t>(</w:t>
+        <w:t>Code(</w:t>
       </w:r>
       <w:proofErr w:type="gramEnd"/>
       <w:r>
@@ -2253,85 +2155,31 @@
       <w:r>
         <w:t>környezet(</w:t>
       </w:r>
-      <w:proofErr w:type="spellStart"/>
       <w:r>
         <w:rPr>
           <w:rFonts w:eastAsia="Times New Roman" w:cs="Times New Roman"/>
           <w:color w:val="0D0D0D" w:themeColor="text1" w:themeTint="F2"/>
           <w:szCs w:val="24"/>
         </w:rPr>
-        <w:t>Integrated</w:t>
-      </w:r>
-      <w:proofErr w:type="spellEnd"/>
-      <w:r>
-        <w:rPr>
-          <w:rFonts w:eastAsia="Times New Roman" w:cs="Times New Roman"/>
-          <w:color w:val="0D0D0D" w:themeColor="text1" w:themeTint="F2"/>
-          <w:szCs w:val="24"/>
-        </w:rPr>
+        <w:t>Integrated Development Environment (IDE)</w:t>
+      </w:r>
+      <w:r>
+        <w:t>)</w:t>
+      </w:r>
+      <w:r>
         <w:t xml:space="preserve"> </w:t>
       </w:r>
-      <w:proofErr w:type="spellStart"/>
-      <w:r>
-        <w:rPr>
-          <w:rFonts w:eastAsia="Times New Roman" w:cs="Times New Roman"/>
-          <w:color w:val="0D0D0D" w:themeColor="text1" w:themeTint="F2"/>
-          <w:szCs w:val="24"/>
-        </w:rPr>
-        <w:t>Development</w:t>
-      </w:r>
-      <w:proofErr w:type="spellEnd"/>
-      <w:r>
-        <w:rPr>
-          <w:rFonts w:eastAsia="Times New Roman" w:cs="Times New Roman"/>
-          <w:color w:val="0D0D0D" w:themeColor="text1" w:themeTint="F2"/>
-          <w:szCs w:val="24"/>
-        </w:rPr>
+      <w:r>
+        <w:t xml:space="preserve">mely sok programozási nyelvet tartalmaz, </w:t>
+      </w:r>
+      <w:r>
+        <w:t>amelyek közül</w:t>
+      </w:r>
+      <w:r>
         <w:t xml:space="preserve"> </w:t>
       </w:r>
-      <w:proofErr w:type="spellStart"/>
-      <w:r>
-        <w:rPr>
-          <w:rFonts w:eastAsia="Times New Roman" w:cs="Times New Roman"/>
-          <w:color w:val="0D0D0D" w:themeColor="text1" w:themeTint="F2"/>
-          <w:szCs w:val="24"/>
-        </w:rPr>
-        <w:t>Environment</w:t>
-      </w:r>
-      <w:proofErr w:type="spellEnd"/>
-      <w:r>
-        <w:rPr>
-          <w:rFonts w:eastAsia="Times New Roman" w:cs="Times New Roman"/>
-          <w:color w:val="0D0D0D" w:themeColor="text1" w:themeTint="F2"/>
-          <w:szCs w:val="24"/>
-        </w:rPr>
-        <w:t xml:space="preserve"> (IDE)</w:t>
-      </w:r>
-      <w:r>
-        <w:t>)</w:t>
-      </w:r>
-      <w:r>
-        <w:t xml:space="preserve"> </w:t>
-      </w:r>
-      <w:r>
-        <w:t xml:space="preserve">mely sok programozási nyelvet tartalmaz, </w:t>
-      </w:r>
-      <w:r>
-        <w:t>amelyek közül</w:t>
-      </w:r>
-      <w:r>
-        <w:t xml:space="preserve"> </w:t>
-      </w:r>
-      <w:r>
-        <w:t>mi a HTML5, CSS3, JavaScript-</w:t>
-      </w:r>
-      <w:proofErr w:type="spellStart"/>
-      <w:r>
-        <w:t>et</w:t>
-      </w:r>
-      <w:proofErr w:type="spellEnd"/>
-      <w:r>
-        <w:t xml:space="preserve"> használtuk, illetve az EJS-t. Ebben a környe</w:t>
+      <w:r>
+        <w:t>mi a HTML5, CSS3, JavaScript-et használtuk, illetve az EJS-t. Ebben a környe</w:t>
       </w:r>
       <w:r>
         <w:t>zetben használtuk, illetve fejlesztettünk.</w:t>
@@ -2429,23 +2277,7 @@
         <w:t>.</w:t>
       </w:r>
       <w:r>
-        <w:t xml:space="preserve"> Továbbá, fejlesztés alatt az </w:t>
-      </w:r>
-      <w:proofErr w:type="spellStart"/>
-      <w:r>
-        <w:t>Apache</w:t>
-      </w:r>
-      <w:proofErr w:type="spellEnd"/>
-      <w:r>
-        <w:t xml:space="preserve"> szervert is használtuk, amely a PHP </w:t>
-      </w:r>
-      <w:proofErr w:type="spellStart"/>
-      <w:r>
-        <w:t>MyAdmin</w:t>
-      </w:r>
-      <w:proofErr w:type="spellEnd"/>
-      <w:r>
-        <w:t xml:space="preserve"> felületet biztosította, mely grafikus adatbázis kezelő oldal.</w:t>
+        <w:t xml:space="preserve"> Továbbá, fejlesztés alatt az Apache szervert is használtuk, amely a PHP MyAdmin felületet biztosította, mely grafikus adatbázis kezelő oldal.</w:t>
       </w:r>
     </w:p>
     <w:p>
@@ -2656,7 +2488,7 @@
               </wp:anchor>
             </w:drawing>
           </mc:Choice>
-          <mc:Fallback xmlns:a14="http://schemas.microsoft.com/office/drawing/2010/main" xmlns:pic="http://schemas.openxmlformats.org/drawingml/2006/picture" xmlns:a="http://schemas.openxmlformats.org/drawingml/2006/main">
+          <mc:Fallback xmlns:a="http://schemas.openxmlformats.org/drawingml/2006/main" xmlns:pic="http://schemas.openxmlformats.org/drawingml/2006/picture" xmlns:a14="http://schemas.microsoft.com/office/drawing/2010/main">
             <w:pict>
               <v:shape id="Derékszögű háromszög 7" style="position:absolute;margin-left:0;margin-top:-71.35pt;width:190.5pt;height:190.5pt;rotation:90;z-index:251668480;visibility:visible;mso-wrap-style:square;mso-width-percent:0;mso-wrap-distance-left:9pt;mso-wrap-distance-top:0;mso-wrap-distance-right:9pt;mso-wrap-distance-bottom:0;mso-position-horizontal:left;mso-position-horizontal-relative:page;mso-position-vertical:absolute;mso-position-vertical-relative:text;mso-width-percent:0;mso-width-relative:margin;v-text-anchor:middle" coordsize="2419350,2419350" o:spid="_x0000_s1026" fillcolor="#ed7d31 [3205]" stroked="f" strokeweight="1pt" path="m,2419350l,c806450,806450,-382154,2206666,2419350,2419350l,2419350xe" o:gfxdata="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" w14:anchorId="09313364">
                 <v:stroke joinstyle="miter"/>
@@ -2800,13 +2632,8 @@
       <w:r>
         <w:t xml:space="preserve">, de egy rendelést tartalmaz </w:t>
       </w:r>
-      <w:proofErr w:type="spellStart"/>
-      <w:r>
-        <w:t>id</w:t>
-      </w:r>
-      <w:proofErr w:type="spellEnd"/>
-      <w:r>
-        <w:t xml:space="preserve">-k szerint. A Felhasználó meg egy felhasználó </w:t>
+      <w:r>
+        <w:t xml:space="preserve">id-k szerint. A Felhasználó meg egy felhasználó </w:t>
       </w:r>
       <w:r>
         <w:t>megadott információit, szerepkörét, és profiljának a helyzetét tartalmazza.</w:t>
@@ -2819,11 +2646,9 @@
       <w:r>
         <w:t xml:space="preserve"> adatbázis neve: </w:t>
       </w:r>
-      <w:proofErr w:type="spellStart"/>
       <w:r>
         <w:t>dozsa_csarda_adatbazis</w:t>
       </w:r>
-      <w:proofErr w:type="spellEnd"/>
     </w:p>
     <w:p>
       <w:pPr>
@@ -3025,19 +2850,11 @@
         </w:rPr>
         <w:tab/>
       </w:r>
-      <w:proofErr w:type="spellStart"/>
-      <w:r>
-        <w:rPr>
-          <w:rFonts w:eastAsia="Times New Roman" w:cs="Times New Roman"/>
-        </w:rPr>
-        <w:t>id</w:t>
-      </w:r>
-      <w:proofErr w:type="spellEnd"/>
-      <w:r>
-        <w:rPr>
-          <w:rFonts w:eastAsia="Times New Roman" w:cs="Times New Roman"/>
-        </w:rPr>
-        <w:t>: A felhasználó azonosítóját tartalmazza</w:t>
+      <w:r>
+        <w:rPr>
+          <w:rFonts w:eastAsia="Times New Roman" w:cs="Times New Roman"/>
+        </w:rPr>
+        <w:t>id: A felhasználó azonosítóját tartalmazza</w:t>
       </w:r>
       <w:r>
         <w:rPr>
@@ -3084,21 +2901,7 @@
           <w:rFonts w:eastAsia="Times New Roman" w:cs="Times New Roman"/>
         </w:rPr>
         <w:tab/>
-        <w:t xml:space="preserve">jelszó: A felhasználó jelszavát, </w:t>
-      </w:r>
-      <w:proofErr w:type="spellStart"/>
-      <w:r>
-        <w:rPr>
-          <w:rFonts w:eastAsia="Times New Roman" w:cs="Times New Roman"/>
-        </w:rPr>
-        <w:t>Hash</w:t>
-      </w:r>
-      <w:proofErr w:type="spellEnd"/>
-      <w:r>
-        <w:rPr>
-          <w:rFonts w:eastAsia="Times New Roman" w:cs="Times New Roman"/>
-        </w:rPr>
-        <w:t>-elve/titkosítva tartalmazza</w:t>
+        <w:t>jelszó: A felhasználó jelszavát, Hash-elve/titkosítva tartalmazza</w:t>
       </w:r>
     </w:p>
     <w:p>
@@ -3145,35 +2948,7 @@
         <w:rPr>
           <w:rFonts w:eastAsia="Times New Roman" w:cs="Times New Roman"/>
         </w:rPr>
-        <w:t>(</w:t>
-      </w:r>
-      <w:proofErr w:type="spellStart"/>
-      <w:r>
-        <w:rPr>
-          <w:rFonts w:eastAsia="Times New Roman" w:cs="Times New Roman"/>
-        </w:rPr>
-        <w:t>admin</w:t>
-      </w:r>
-      <w:proofErr w:type="spellEnd"/>
-      <w:r>
-        <w:rPr>
-          <w:rFonts w:eastAsia="Times New Roman" w:cs="Times New Roman"/>
-        </w:rPr>
-        <w:t xml:space="preserve">, </w:t>
-      </w:r>
-      <w:proofErr w:type="spellStart"/>
-      <w:r>
-        <w:rPr>
-          <w:rFonts w:eastAsia="Times New Roman" w:cs="Times New Roman"/>
-        </w:rPr>
-        <w:t>user</w:t>
-      </w:r>
-      <w:proofErr w:type="spellEnd"/>
-      <w:r>
-        <w:rPr>
-          <w:rFonts w:eastAsia="Times New Roman" w:cs="Times New Roman"/>
-        </w:rPr>
-        <w:t>)</w:t>
+        <w:t>(admin, user)</w:t>
       </w:r>
     </w:p>
     <w:p>
@@ -3269,19 +3044,11 @@
         </w:rPr>
         <w:tab/>
       </w:r>
-      <w:proofErr w:type="spellStart"/>
-      <w:r>
-        <w:rPr>
-          <w:rFonts w:eastAsia="Times New Roman" w:cs="Times New Roman"/>
-        </w:rPr>
-        <w:t>id</w:t>
-      </w:r>
-      <w:proofErr w:type="spellEnd"/>
-      <w:r>
-        <w:rPr>
-          <w:rFonts w:eastAsia="Times New Roman" w:cs="Times New Roman"/>
-        </w:rPr>
-        <w:t>: A rendelés azonosítóját tartalmazza</w:t>
+      <w:r>
+        <w:rPr>
+          <w:rFonts w:eastAsia="Times New Roman" w:cs="Times New Roman"/>
+        </w:rPr>
+        <w:t>id: A rendelés azonosítóját tartalmazza</w:t>
       </w:r>
       <w:r>
         <w:rPr>
@@ -3303,19 +3070,11 @@
         </w:rPr>
         <w:tab/>
       </w:r>
-      <w:proofErr w:type="spellStart"/>
-      <w:r>
-        <w:rPr>
-          <w:rFonts w:eastAsia="Times New Roman" w:cs="Times New Roman"/>
-        </w:rPr>
-        <w:t>főétel_id</w:t>
-      </w:r>
-      <w:proofErr w:type="spellEnd"/>
-      <w:r>
-        <w:rPr>
-          <w:rFonts w:eastAsia="Times New Roman" w:cs="Times New Roman"/>
-        </w:rPr>
-        <w:t>: A Főétel azonosítóját tartalmazza</w:t>
+      <w:r>
+        <w:rPr>
+          <w:rFonts w:eastAsia="Times New Roman" w:cs="Times New Roman"/>
+        </w:rPr>
+        <w:t>főétel_id: A Főétel azonosítóját tartalmazza</w:t>
       </w:r>
       <w:r>
         <w:rPr>
@@ -3336,20 +3095,7 @@
           <w:rFonts w:eastAsia="Times New Roman" w:cs="Times New Roman"/>
         </w:rPr>
         <w:tab/>
-      </w:r>
-      <w:proofErr w:type="spellStart"/>
-      <w:r>
-        <w:rPr>
-          <w:rFonts w:eastAsia="Times New Roman" w:cs="Times New Roman"/>
-        </w:rPr>
-        <w:t>köret_id</w:t>
-      </w:r>
-      <w:proofErr w:type="spellEnd"/>
-      <w:r>
-        <w:rPr>
-          <w:rFonts w:eastAsia="Times New Roman" w:cs="Times New Roman"/>
-        </w:rPr>
-        <w:t>: A Köret azonosítóját tartalmazza</w:t>
+        <w:t>köret_id: A Köret azonosítóját tartalmazza</w:t>
       </w:r>
       <w:r>
         <w:rPr>
@@ -3371,19 +3117,11 @@
         </w:rPr>
         <w:tab/>
       </w:r>
-      <w:proofErr w:type="spellStart"/>
-      <w:r>
-        <w:rPr>
-          <w:rFonts w:eastAsia="Times New Roman" w:cs="Times New Roman"/>
-        </w:rPr>
-        <w:t>szosz_id</w:t>
-      </w:r>
-      <w:proofErr w:type="spellEnd"/>
-      <w:r>
-        <w:rPr>
-          <w:rFonts w:eastAsia="Times New Roman" w:cs="Times New Roman"/>
-        </w:rPr>
-        <w:t>: A Szósz azonosítóját tartalmazza</w:t>
+      <w:r>
+        <w:rPr>
+          <w:rFonts w:eastAsia="Times New Roman" w:cs="Times New Roman"/>
+        </w:rPr>
+        <w:t>szosz_id: A Szósz azonosítóját tartalmazza</w:t>
       </w:r>
       <w:r>
         <w:rPr>
@@ -3405,19 +3143,11 @@
         </w:rPr>
         <w:tab/>
       </w:r>
-      <w:proofErr w:type="spellStart"/>
-      <w:r>
-        <w:rPr>
-          <w:rFonts w:eastAsia="Times New Roman" w:cs="Times New Roman"/>
-        </w:rPr>
-        <w:t>üditő_id</w:t>
-      </w:r>
-      <w:proofErr w:type="spellEnd"/>
-      <w:r>
-        <w:rPr>
-          <w:rFonts w:eastAsia="Times New Roman" w:cs="Times New Roman"/>
-        </w:rPr>
-        <w:t>: Az Üdítő azonosítóját tartalmazza</w:t>
+      <w:r>
+        <w:rPr>
+          <w:rFonts w:eastAsia="Times New Roman" w:cs="Times New Roman"/>
+        </w:rPr>
+        <w:t>üditő_id: Az Üdítő azonosítóját tartalmazza</w:t>
       </w:r>
       <w:r>
         <w:rPr>
@@ -3439,19 +3169,11 @@
         </w:rPr>
         <w:tab/>
       </w:r>
-      <w:proofErr w:type="spellStart"/>
-      <w:r>
-        <w:rPr>
-          <w:rFonts w:eastAsia="Times New Roman" w:cs="Times New Roman"/>
-        </w:rPr>
-        <w:t>fel_id</w:t>
-      </w:r>
-      <w:proofErr w:type="spellEnd"/>
-      <w:r>
-        <w:rPr>
-          <w:rFonts w:eastAsia="Times New Roman" w:cs="Times New Roman"/>
-        </w:rPr>
-        <w:t>: A felhasználó azonosítóját tartalmazza</w:t>
+      <w:r>
+        <w:rPr>
+          <w:rFonts w:eastAsia="Times New Roman" w:cs="Times New Roman"/>
+        </w:rPr>
+        <w:t>fel_id: A felhasználó azonosítóját tartalmazza</w:t>
       </w:r>
       <w:r>
         <w:rPr>
@@ -3472,20 +3194,7 @@
           <w:rFonts w:eastAsia="Times New Roman" w:cs="Times New Roman"/>
         </w:rPr>
         <w:tab/>
-      </w:r>
-      <w:proofErr w:type="spellStart"/>
-      <w:r>
-        <w:rPr>
-          <w:rFonts w:eastAsia="Times New Roman" w:cs="Times New Roman"/>
-        </w:rPr>
-        <w:t>desszert_id</w:t>
-      </w:r>
-      <w:proofErr w:type="spellEnd"/>
-      <w:r>
-        <w:rPr>
-          <w:rFonts w:eastAsia="Times New Roman" w:cs="Times New Roman"/>
-        </w:rPr>
-        <w:t>: A Desszert azonosítóját tartalmazza</w:t>
+        <w:t>desszert_id: A Desszert azonosítóját tartalmazza</w:t>
       </w:r>
       <w:r>
         <w:rPr>
@@ -3529,19 +3238,11 @@
         </w:rPr>
         <w:tab/>
       </w:r>
-      <w:proofErr w:type="spellStart"/>
-      <w:r>
-        <w:rPr>
-          <w:rFonts w:eastAsia="Times New Roman" w:cs="Times New Roman"/>
-        </w:rPr>
-        <w:t>id</w:t>
-      </w:r>
-      <w:proofErr w:type="spellEnd"/>
-      <w:r>
-        <w:rPr>
-          <w:rFonts w:eastAsia="Times New Roman" w:cs="Times New Roman"/>
-        </w:rPr>
-        <w:t>: A Főétel azonosítóját tartalmazza</w:t>
+      <w:r>
+        <w:rPr>
+          <w:rFonts w:eastAsia="Times New Roman" w:cs="Times New Roman"/>
+        </w:rPr>
+        <w:t>id: A Főétel azonosítóját tartalmazza</w:t>
       </w:r>
       <w:r>
         <w:rPr>
@@ -3651,20 +3352,7 @@
           <w:rFonts w:eastAsia="Times New Roman" w:cs="Times New Roman"/>
         </w:rPr>
         <w:tab/>
-      </w:r>
-      <w:proofErr w:type="spellStart"/>
-      <w:r>
-        <w:rPr>
-          <w:rFonts w:eastAsia="Times New Roman" w:cs="Times New Roman"/>
-        </w:rPr>
-        <w:t>id</w:t>
-      </w:r>
-      <w:proofErr w:type="spellEnd"/>
-      <w:r>
-        <w:rPr>
-          <w:rFonts w:eastAsia="Times New Roman" w:cs="Times New Roman"/>
-        </w:rPr>
-        <w:t>: A Köret azonosítóját tartalmazza</w:t>
+        <w:t>id: A Köret azonosítóját tartalmazza</w:t>
       </w:r>
       <w:r>
         <w:rPr>
@@ -3947,20 +3635,7 @@
           <w:rFonts w:eastAsia="Times New Roman" w:cs="Times New Roman"/>
         </w:rPr>
         <w:tab/>
-      </w:r>
-      <w:proofErr w:type="spellStart"/>
-      <w:r>
-        <w:rPr>
-          <w:rFonts w:eastAsia="Times New Roman" w:cs="Times New Roman"/>
-        </w:rPr>
-        <w:t>id</w:t>
-      </w:r>
-      <w:proofErr w:type="spellEnd"/>
-      <w:r>
-        <w:rPr>
-          <w:rFonts w:eastAsia="Times New Roman" w:cs="Times New Roman"/>
-        </w:rPr>
-        <w:t xml:space="preserve">: A </w:t>
+        <w:t xml:space="preserve">id: A </w:t>
       </w:r>
       <w:r>
         <w:rPr>
@@ -4092,20 +3767,7 @@
           <w:rFonts w:eastAsia="Times New Roman" w:cs="Times New Roman"/>
         </w:rPr>
         <w:tab/>
-      </w:r>
-      <w:proofErr w:type="spellStart"/>
-      <w:r>
-        <w:rPr>
-          <w:rFonts w:eastAsia="Times New Roman" w:cs="Times New Roman"/>
-        </w:rPr>
-        <w:t>id</w:t>
-      </w:r>
-      <w:proofErr w:type="spellEnd"/>
-      <w:r>
-        <w:rPr>
-          <w:rFonts w:eastAsia="Times New Roman" w:cs="Times New Roman"/>
-        </w:rPr>
-        <w:t>: A</w:t>
+        <w:t>id: A</w:t>
       </w:r>
       <w:r>
         <w:rPr>
@@ -4264,20 +3926,7 @@
           <w:rFonts w:eastAsia="Times New Roman" w:cs="Times New Roman"/>
         </w:rPr>
         <w:tab/>
-      </w:r>
-      <w:proofErr w:type="spellStart"/>
-      <w:r>
-        <w:rPr>
-          <w:rFonts w:eastAsia="Times New Roman" w:cs="Times New Roman"/>
-        </w:rPr>
-        <w:t>id</w:t>
-      </w:r>
-      <w:proofErr w:type="spellEnd"/>
-      <w:r>
-        <w:rPr>
-          <w:rFonts w:eastAsia="Times New Roman" w:cs="Times New Roman"/>
-        </w:rPr>
-        <w:t>: A Desszert azonosítóját tartalmazza</w:t>
+        <w:t>id: A Desszert azonosítóját tartalmazza</w:t>
       </w:r>
       <w:r>
         <w:rPr>
@@ -4664,21 +4313,7 @@
         <w:rPr>
           <w:rFonts w:eastAsia="Times New Roman" w:cs="Times New Roman"/>
         </w:rPr>
-        <w:t xml:space="preserve">- Server.js - A szerver indítója fájlja (Indító parancs: </w:t>
-      </w:r>
-      <w:proofErr w:type="spellStart"/>
-      <w:r>
-        <w:rPr>
-          <w:rFonts w:eastAsia="Times New Roman" w:cs="Times New Roman"/>
-        </w:rPr>
-        <w:t>Node</w:t>
-      </w:r>
-      <w:proofErr w:type="spellEnd"/>
-      <w:r>
-        <w:rPr>
-          <w:rFonts w:eastAsia="Times New Roman" w:cs="Times New Roman"/>
-        </w:rPr>
-        <w:t xml:space="preserve"> Server.js)</w:t>
+        <w:t>- Server.js - A szerver indítója fájlja (Indító parancs: Node Server.js)</w:t>
       </w:r>
     </w:p>
     <w:p>
@@ -4692,41 +4327,13 @@
         <w:rPr>
           <w:rFonts w:eastAsia="Times New Roman" w:cs="Times New Roman"/>
         </w:rPr>
-        <w:t xml:space="preserve">- </w:t>
-      </w:r>
-      <w:proofErr w:type="spellStart"/>
-      <w:r>
-        <w:rPr>
-          <w:rFonts w:eastAsia="Times New Roman" w:cs="Times New Roman"/>
-        </w:rPr>
-        <w:t>routes</w:t>
-      </w:r>
-      <w:proofErr w:type="spellEnd"/>
-      <w:r>
-        <w:rPr>
-          <w:rFonts w:eastAsia="Times New Roman" w:cs="Times New Roman"/>
-        </w:rPr>
-        <w:t xml:space="preserve">/apiRoutes.js - A szerver végpontjait, (API) tartalmazza, </w:t>
-      </w:r>
-      <w:r>
-        <w:rPr>
-          <w:rFonts w:eastAsia="Times New Roman" w:cs="Times New Roman"/>
-        </w:rPr>
-        <w:t xml:space="preserve">az </w:t>
-      </w:r>
-      <w:proofErr w:type="spellStart"/>
-      <w:r>
-        <w:rPr>
-          <w:rFonts w:eastAsia="Times New Roman" w:cs="Times New Roman"/>
-        </w:rPr>
-        <w:t>express</w:t>
-      </w:r>
-      <w:proofErr w:type="spellEnd"/>
-      <w:r>
-        <w:rPr>
-          <w:rFonts w:eastAsia="Times New Roman" w:cs="Times New Roman"/>
-        </w:rPr>
-        <w:t xml:space="preserve"> </w:t>
+        <w:t xml:space="preserve">- routes/apiRoutes.js - A szerver végpontjait, (API) tartalmazza, </w:t>
+      </w:r>
+      <w:r>
+        <w:rPr>
+          <w:rFonts w:eastAsia="Times New Roman" w:cs="Times New Roman"/>
+        </w:rPr>
+        <w:t xml:space="preserve">az express </w:t>
       </w:r>
       <w:r>
         <w:tab/>
@@ -4761,21 +4368,7 @@
         <w:rPr>
           <w:rFonts w:eastAsia="Times New Roman" w:cs="Times New Roman"/>
         </w:rPr>
-        <w:t xml:space="preserve"> a </w:t>
-      </w:r>
-      <w:proofErr w:type="spellStart"/>
-      <w:r>
-        <w:rPr>
-          <w:rFonts w:eastAsia="Times New Roman" w:cs="Times New Roman"/>
-        </w:rPr>
-        <w:t>controllerek</w:t>
-      </w:r>
-      <w:proofErr w:type="spellEnd"/>
-      <w:r>
-        <w:rPr>
-          <w:rFonts w:eastAsia="Times New Roman" w:cs="Times New Roman"/>
-        </w:rPr>
-        <w:t xml:space="preserve"> felhasználásával</w:t>
+        <w:t xml:space="preserve"> a controllerek felhasználásával</w:t>
       </w:r>
     </w:p>
     <w:p>
@@ -4823,21 +4416,7 @@
         <w:rPr>
           <w:rFonts w:eastAsia="Times New Roman" w:cs="Times New Roman"/>
         </w:rPr>
-        <w:t xml:space="preserve"> – A Profilhoz </w:t>
-      </w:r>
-      <w:proofErr w:type="spellStart"/>
-      <w:r>
-        <w:rPr>
-          <w:rFonts w:eastAsia="Times New Roman" w:cs="Times New Roman"/>
-        </w:rPr>
-        <w:t>kapcsodó</w:t>
-      </w:r>
-      <w:proofErr w:type="spellEnd"/>
-      <w:r>
-        <w:rPr>
-          <w:rFonts w:eastAsia="Times New Roman" w:cs="Times New Roman"/>
-        </w:rPr>
-        <w:t xml:space="preserve"> API-k útvonalát tartalmazza</w:t>
+        <w:t xml:space="preserve"> – A Profilhoz kapcsodó API-k útvonalát tartalmazza</w:t>
       </w:r>
     </w:p>
     <w:p>
@@ -4851,21 +4430,7 @@
         <w:rPr>
           <w:rFonts w:eastAsia="Times New Roman" w:cs="Times New Roman"/>
         </w:rPr>
-        <w:t xml:space="preserve">- </w:t>
-      </w:r>
-      <w:proofErr w:type="spellStart"/>
-      <w:r>
-        <w:rPr>
-          <w:rFonts w:eastAsia="Times New Roman" w:cs="Times New Roman"/>
-        </w:rPr>
-        <w:t>models</w:t>
-      </w:r>
-      <w:proofErr w:type="spellEnd"/>
-      <w:r>
-        <w:rPr>
-          <w:rFonts w:eastAsia="Times New Roman" w:cs="Times New Roman"/>
-        </w:rPr>
-        <w:t xml:space="preserve">/foodModel.js - A szerver adatait tartalmazza, később adatbázissal </w:t>
+        <w:t xml:space="preserve">- models/foodModel.js - A szerver adatait tartalmazza, később adatbázissal </w:t>
       </w:r>
       <w:r>
         <w:tab/>
@@ -4926,21 +4491,7 @@
         <w:rPr>
           <w:rFonts w:eastAsia="Times New Roman" w:cs="Times New Roman"/>
         </w:rPr>
-        <w:t xml:space="preserve">- </w:t>
-      </w:r>
-      <w:proofErr w:type="spellStart"/>
-      <w:r>
-        <w:rPr>
-          <w:rFonts w:eastAsia="Times New Roman" w:cs="Times New Roman"/>
-        </w:rPr>
-        <w:t>controllers</w:t>
-      </w:r>
-      <w:proofErr w:type="spellEnd"/>
-      <w:r>
-        <w:rPr>
-          <w:rFonts w:eastAsia="Times New Roman" w:cs="Times New Roman"/>
-        </w:rPr>
-        <w:t xml:space="preserve">/foodController.js - A szerver vezérlője, tartalmazza a </w:t>
+        <w:t xml:space="preserve">- controllers/foodController.js - A szerver vezérlője, tartalmazza a </w:t>
       </w:r>
       <w:r>
         <w:tab/>
@@ -5005,35 +4556,7 @@
         <w:rPr>
           <w:rFonts w:eastAsia="Times New Roman" w:cs="Times New Roman"/>
         </w:rPr>
-        <w:t xml:space="preserve">pageController.js – A </w:t>
-      </w:r>
-      <w:proofErr w:type="spellStart"/>
-      <w:r>
-        <w:rPr>
-          <w:rFonts w:eastAsia="Times New Roman" w:cs="Times New Roman"/>
-        </w:rPr>
-        <w:t>pageRoutes</w:t>
-      </w:r>
-      <w:proofErr w:type="spellEnd"/>
-      <w:r>
-        <w:rPr>
-          <w:rFonts w:eastAsia="Times New Roman" w:cs="Times New Roman"/>
-        </w:rPr>
-        <w:t xml:space="preserve"> – hoz a </w:t>
-      </w:r>
-      <w:proofErr w:type="spellStart"/>
-      <w:r>
-        <w:rPr>
-          <w:rFonts w:eastAsia="Times New Roman" w:cs="Times New Roman"/>
-        </w:rPr>
-        <w:t>controller</w:t>
-      </w:r>
-      <w:proofErr w:type="spellEnd"/>
-      <w:r>
-        <w:rPr>
-          <w:rFonts w:eastAsia="Times New Roman" w:cs="Times New Roman"/>
-        </w:rPr>
-        <w:t>, az oldalak közötti</w:t>
+        <w:t>pageController.js – A pageRoutes – hoz a controller, az oldalak közötti</w:t>
       </w:r>
       <w:r>
         <w:rPr>
@@ -5053,35 +4576,7 @@
         <w:rPr>
           <w:rFonts w:eastAsia="Times New Roman" w:cs="Times New Roman"/>
         </w:rPr>
-        <w:t xml:space="preserve">/userController.js – A </w:t>
-      </w:r>
-      <w:proofErr w:type="spellStart"/>
-      <w:r>
-        <w:rPr>
-          <w:rFonts w:eastAsia="Times New Roman" w:cs="Times New Roman"/>
-        </w:rPr>
-        <w:t>userRoutes</w:t>
-      </w:r>
-      <w:proofErr w:type="spellEnd"/>
-      <w:r>
-        <w:rPr>
-          <w:rFonts w:eastAsia="Times New Roman" w:cs="Times New Roman"/>
-        </w:rPr>
-        <w:t xml:space="preserve"> és a </w:t>
-      </w:r>
-      <w:proofErr w:type="spellStart"/>
-      <w:r>
-        <w:rPr>
-          <w:rFonts w:eastAsia="Times New Roman" w:cs="Times New Roman"/>
-        </w:rPr>
-        <w:t>userModel-hez</w:t>
-      </w:r>
-      <w:proofErr w:type="spellEnd"/>
-      <w:r>
-        <w:rPr>
-          <w:rFonts w:eastAsia="Times New Roman" w:cs="Times New Roman"/>
-        </w:rPr>
-        <w:t xml:space="preserve"> tartozó kontroller, ami a feltöltést, illetve a profilhoz tartozó lekérdezéseket biztosítja</w:t>
+        <w:t>/userController.js – A userRoutes és a userModel-hez tartozó kontroller, ami a feltöltést, illetve a profilhoz tartozó lekérdezéseket biztosítja</w:t>
       </w:r>
     </w:p>
     <w:p>
@@ -5095,21 +4590,7 @@
         <w:rPr>
           <w:rFonts w:eastAsia="Times New Roman" w:cs="Times New Roman"/>
         </w:rPr>
-        <w:t xml:space="preserve">- </w:t>
-      </w:r>
-      <w:proofErr w:type="spellStart"/>
-      <w:r>
-        <w:rPr>
-          <w:rFonts w:eastAsia="Times New Roman" w:cs="Times New Roman"/>
-        </w:rPr>
-        <w:t>config</w:t>
-      </w:r>
-      <w:proofErr w:type="spellEnd"/>
-      <w:r>
-        <w:rPr>
-          <w:rFonts w:eastAsia="Times New Roman" w:cs="Times New Roman"/>
-        </w:rPr>
-        <w:t>/db.js – A</w:t>
+        <w:t>- config/db.js – A</w:t>
       </w:r>
       <w:r>
         <w:rPr>
@@ -5135,21 +4616,7 @@
         <w:rPr>
           <w:rFonts w:eastAsia="Times New Roman" w:cs="Times New Roman"/>
         </w:rPr>
-        <w:t xml:space="preserve"> kezelését tartalmazza, amit az </w:t>
-      </w:r>
-      <w:proofErr w:type="spellStart"/>
-      <w:r>
-        <w:rPr>
-          <w:rFonts w:eastAsia="Times New Roman" w:cs="Times New Roman"/>
-        </w:rPr>
-        <w:t>npm</w:t>
-      </w:r>
-      <w:proofErr w:type="spellEnd"/>
-      <w:r>
-        <w:rPr>
-          <w:rFonts w:eastAsia="Times New Roman" w:cs="Times New Roman"/>
-        </w:rPr>
-        <w:t xml:space="preserve"> </w:t>
+        <w:t xml:space="preserve"> kezelését tartalmazza, amit az npm </w:t>
       </w:r>
     </w:p>
     <w:p>
@@ -5163,21 +4630,7 @@
           <w:rFonts w:eastAsia="Times New Roman" w:cs="Times New Roman"/>
         </w:rPr>
         <w:tab/>
-        <w:t xml:space="preserve">mysql2 </w:t>
-      </w:r>
-      <w:proofErr w:type="spellStart"/>
-      <w:r>
-        <w:rPr>
-          <w:rFonts w:eastAsia="Times New Roman" w:cs="Times New Roman"/>
-        </w:rPr>
-        <w:t>module</w:t>
-      </w:r>
-      <w:proofErr w:type="spellEnd"/>
-      <w:r>
-        <w:rPr>
-          <w:rFonts w:eastAsia="Times New Roman" w:cs="Times New Roman"/>
-        </w:rPr>
-        <w:t xml:space="preserve"> biztosít.</w:t>
+        <w:t>mysql2 module biztosít.</w:t>
       </w:r>
     </w:p>
     <w:p>
@@ -5193,33 +4646,17 @@
         <w:tab/>
         <w:t xml:space="preserve">- </w:t>
       </w:r>
-      <w:proofErr w:type="spellStart"/>
       <w:r>
         <w:rPr>
           <w:rFonts w:eastAsia="Times New Roman" w:cs="Times New Roman"/>
         </w:rPr>
         <w:t>config</w:t>
       </w:r>
-      <w:proofErr w:type="spellEnd"/>
-      <w:r>
-        <w:rPr>
-          <w:rFonts w:eastAsia="Times New Roman" w:cs="Times New Roman"/>
-        </w:rPr>
-        <w:t>/</w:t>
-      </w:r>
-      <w:proofErr w:type="spellStart"/>
-      <w:r>
-        <w:rPr>
-          <w:rFonts w:eastAsia="Times New Roman" w:cs="Times New Roman"/>
-        </w:rPr>
-        <w:t>database.sql</w:t>
-      </w:r>
-      <w:proofErr w:type="spellEnd"/>
-      <w:r>
-        <w:rPr>
-          <w:rFonts w:eastAsia="Times New Roman" w:cs="Times New Roman"/>
-        </w:rPr>
-        <w:t xml:space="preserve"> – Az adatbázis leírását, kódját tartalmazza.</w:t>
+      <w:r>
+        <w:rPr>
+          <w:rFonts w:eastAsia="Times New Roman" w:cs="Times New Roman"/>
+        </w:rPr>
+        <w:t>/database.sql – Az adatbázis leírását, kódját tartalmazza.</w:t>
       </w:r>
     </w:p>
     <w:p>
@@ -5235,19 +4672,11 @@
         <w:tab/>
         <w:t xml:space="preserve">- </w:t>
       </w:r>
-      <w:proofErr w:type="spellStart"/>
-      <w:r>
-        <w:rPr>
-          <w:rFonts w:eastAsia="Times New Roman" w:cs="Times New Roman"/>
-        </w:rPr>
-        <w:t>seed</w:t>
-      </w:r>
-      <w:proofErr w:type="spellEnd"/>
-      <w:r>
-        <w:rPr>
-          <w:rFonts w:eastAsia="Times New Roman" w:cs="Times New Roman"/>
-        </w:rPr>
-        <w:t>/</w:t>
+      <w:r>
+        <w:rPr>
+          <w:rFonts w:eastAsia="Times New Roman" w:cs="Times New Roman"/>
+        </w:rPr>
+        <w:t>seed/</w:t>
       </w:r>
       <w:r>
         <w:rPr>
@@ -5287,16 +4716,8 @@
         <w:rPr>
           <w:rFonts w:eastAsia="Times New Roman" w:cs="Times New Roman"/>
         </w:rPr>
-        <w:t>.</w:t>
-      </w:r>
-      <w:proofErr w:type="spellStart"/>
-      <w:r>
-        <w:rPr>
-          <w:rFonts w:eastAsia="Times New Roman" w:cs="Times New Roman"/>
-        </w:rPr>
-        <w:t>env</w:t>
-      </w:r>
-      <w:proofErr w:type="spellEnd"/>
+        <w:t>.env</w:t>
+      </w:r>
       <w:proofErr w:type="gramEnd"/>
       <w:r>
         <w:rPr>
@@ -5329,91 +4750,7 @@
           <w:rFonts w:eastAsia="Times New Roman" w:cs="Times New Roman"/>
         </w:rPr>
         <w:tab/>
-        <w:t>-</w:t>
-      </w:r>
-      <w:proofErr w:type="spellStart"/>
-      <w:r>
-        <w:rPr>
-          <w:rFonts w:eastAsia="Times New Roman" w:cs="Times New Roman"/>
-        </w:rPr>
-        <w:t>node_modules</w:t>
-      </w:r>
-      <w:proofErr w:type="spellEnd"/>
-      <w:r>
-        <w:rPr>
-          <w:rFonts w:eastAsia="Times New Roman" w:cs="Times New Roman"/>
-        </w:rPr>
-        <w:t xml:space="preserve"> – az </w:t>
-      </w:r>
-      <w:proofErr w:type="spellStart"/>
-      <w:r>
-        <w:rPr>
-          <w:rFonts w:eastAsia="Times New Roman" w:cs="Times New Roman"/>
-        </w:rPr>
-        <w:t>npm</w:t>
-      </w:r>
-      <w:proofErr w:type="spellEnd"/>
-      <w:r>
-        <w:rPr>
-          <w:rFonts w:eastAsia="Times New Roman" w:cs="Times New Roman"/>
-        </w:rPr>
-        <w:t xml:space="preserve"> csomagkezelő-</w:t>
-      </w:r>
-      <w:proofErr w:type="spellStart"/>
-      <w:r>
-        <w:rPr>
-          <w:rFonts w:eastAsia="Times New Roman" w:cs="Times New Roman"/>
-        </w:rPr>
-        <w:t>höz</w:t>
-      </w:r>
-      <w:proofErr w:type="spellEnd"/>
-      <w:r>
-        <w:rPr>
-          <w:rFonts w:eastAsia="Times New Roman" w:cs="Times New Roman"/>
-        </w:rPr>
-        <w:t xml:space="preserve"> szükséges, az </w:t>
-      </w:r>
-      <w:proofErr w:type="spellStart"/>
-      <w:r>
-        <w:rPr>
-          <w:rFonts w:eastAsia="Times New Roman" w:cs="Times New Roman"/>
-        </w:rPr>
-        <w:t>npm</w:t>
-      </w:r>
-      <w:proofErr w:type="spellEnd"/>
-      <w:r>
-        <w:rPr>
-          <w:rFonts w:eastAsia="Times New Roman" w:cs="Times New Roman"/>
-        </w:rPr>
-        <w:t xml:space="preserve"> </w:t>
-      </w:r>
-      <w:proofErr w:type="spellStart"/>
-      <w:r>
-        <w:rPr>
-          <w:rFonts w:eastAsia="Times New Roman" w:cs="Times New Roman"/>
-        </w:rPr>
-        <w:t>init</w:t>
-      </w:r>
-      <w:proofErr w:type="spellEnd"/>
-      <w:r>
-        <w:rPr>
-          <w:rFonts w:eastAsia="Times New Roman" w:cs="Times New Roman"/>
-        </w:rPr>
-        <w:t xml:space="preserve"> </w:t>
-      </w:r>
-      <w:proofErr w:type="spellStart"/>
-      <w:r>
-        <w:rPr>
-          <w:rFonts w:eastAsia="Times New Roman" w:cs="Times New Roman"/>
-        </w:rPr>
-        <w:t>parancsal</w:t>
-      </w:r>
-      <w:proofErr w:type="spellEnd"/>
-      <w:r>
-        <w:rPr>
-          <w:rFonts w:eastAsia="Times New Roman" w:cs="Times New Roman"/>
-        </w:rPr>
-        <w:t>, automatikusan legenerálja</w:t>
+        <w:t>-node_modules – az npm csomagkezelő-höz szükséges, az npm init parancsal, automatikusan legenerálja</w:t>
       </w:r>
     </w:p>
     <w:p>
@@ -5656,12 +4993,10 @@
       <w:r>
         <w:t xml:space="preserve">(A </w:t>
       </w:r>
-      <w:proofErr w:type="spellStart"/>
       <w:proofErr w:type="gramStart"/>
       <w:r>
         <w:t>Views</w:t>
       </w:r>
-      <w:proofErr w:type="spellEnd"/>
       <w:proofErr w:type="gramEnd"/>
       <w:r>
         <w:t xml:space="preserve"> illetve a Public mappák nem a Backend részei)</w:t>
@@ -5818,15 +5153,7 @@
         <w:t>-</w:t>
       </w:r>
       <w:r>
-        <w:t xml:space="preserve"> </w:t>
-      </w:r>
-      <w:proofErr w:type="spellStart"/>
-      <w:r>
-        <w:t>apiRoutes</w:t>
-      </w:r>
-      <w:proofErr w:type="spellEnd"/>
-      <w:r>
-        <w:t>:</w:t>
+        <w:t xml:space="preserve"> apiRoutes:</w:t>
       </w:r>
     </w:p>
     <w:p>
@@ -5836,14 +5163,9 @@
       <w:r>
         <w:t xml:space="preserve">- </w:t>
       </w:r>
-      <w:proofErr w:type="spellStart"/>
       <w:proofErr w:type="gramStart"/>
       <w:r>
-        <w:t>get</w:t>
-      </w:r>
-      <w:proofErr w:type="spellEnd"/>
-      <w:r>
-        <w:t>(</w:t>
+        <w:t>get(</w:t>
       </w:r>
       <w:proofErr w:type="gramEnd"/>
       <w:r>
@@ -5855,15 +5177,7 @@
         <w:ind w:left="1843"/>
       </w:pPr>
       <w:r>
-        <w:t xml:space="preserve">- </w:t>
-      </w:r>
-      <w:proofErr w:type="spellStart"/>
-      <w:r>
-        <w:t>get</w:t>
-      </w:r>
-      <w:proofErr w:type="spellEnd"/>
-      <w:r>
-        <w:t>(’/login’)</w:t>
+        <w:t>- get(’/login’)</w:t>
       </w:r>
     </w:p>
     <w:p>
@@ -5871,23 +5185,7 @@
         <w:ind w:left="1843"/>
       </w:pPr>
       <w:r>
-        <w:t xml:space="preserve">- </w:t>
-      </w:r>
-      <w:proofErr w:type="spellStart"/>
-      <w:r>
-        <w:t>get</w:t>
-      </w:r>
-      <w:proofErr w:type="spellEnd"/>
-      <w:r>
-        <w:t>(’/</w:t>
-      </w:r>
-      <w:proofErr w:type="spellStart"/>
-      <w:r>
-        <w:t>registration</w:t>
-      </w:r>
-      <w:proofErr w:type="spellEnd"/>
-      <w:r>
-        <w:t>’)</w:t>
+        <w:t>- get(’/registration’)</w:t>
       </w:r>
     </w:p>
     <w:p>
@@ -5895,15 +5193,7 @@
         <w:ind w:left="1843"/>
       </w:pPr>
       <w:r>
-        <w:t>- post(’</w:t>
-      </w:r>
-      <w:proofErr w:type="spellStart"/>
-      <w:r>
-        <w:t>order</w:t>
-      </w:r>
-      <w:proofErr w:type="spellEnd"/>
-      <w:r>
-        <w:t>’)</w:t>
+        <w:t>- post(’order’)</w:t>
       </w:r>
     </w:p>
     <w:p>
@@ -5911,13 +5201,8 @@
         <w:tab/>
         <w:t xml:space="preserve">- </w:t>
       </w:r>
-      <w:proofErr w:type="spellStart"/>
-      <w:r>
-        <w:t>pageRoutes</w:t>
-      </w:r>
-      <w:proofErr w:type="spellEnd"/>
-      <w:r>
-        <w:t>:</w:t>
+      <w:r>
+        <w:t>pageRoutes:</w:t>
       </w:r>
     </w:p>
     <w:p>
@@ -5927,14 +5212,9 @@
       <w:r>
         <w:t xml:space="preserve">- </w:t>
       </w:r>
-      <w:proofErr w:type="spellStart"/>
       <w:proofErr w:type="gramStart"/>
       <w:r>
-        <w:t>get</w:t>
-      </w:r>
-      <w:proofErr w:type="spellEnd"/>
-      <w:r>
-        <w:t>(</w:t>
+        <w:t>get(</w:t>
       </w:r>
       <w:proofErr w:type="gramEnd"/>
       <w:r>
@@ -5946,37 +5226,13 @@
         <w:ind w:left="1843"/>
       </w:pPr>
       <w:r>
-        <w:t xml:space="preserve">- </w:t>
-      </w:r>
-      <w:proofErr w:type="spellStart"/>
-      <w:r>
-        <w:t>get</w:t>
-      </w:r>
-      <w:proofErr w:type="spellEnd"/>
-      <w:r>
-        <w:t>(’/</w:t>
-      </w:r>
-      <w:proofErr w:type="spellStart"/>
-      <w:r>
-        <w:t>profile</w:t>
-      </w:r>
-      <w:proofErr w:type="spellEnd"/>
-      <w:r>
-        <w:t>’)</w:t>
+        <w:t>- get(’/profile’)</w:t>
       </w:r>
     </w:p>
     <w:p>
       <w:r>
         <w:tab/>
-        <w:t xml:space="preserve">- </w:t>
-      </w:r>
-      <w:proofErr w:type="spellStart"/>
-      <w:r>
-        <w:t>userRoutes</w:t>
-      </w:r>
-      <w:proofErr w:type="spellEnd"/>
-      <w:r>
-        <w:t>:</w:t>
+        <w:t>- userRoutes:</w:t>
       </w:r>
     </w:p>
     <w:p>
@@ -5984,15 +5240,7 @@
         <w:ind w:left="1843"/>
       </w:pPr>
       <w:r>
-        <w:t>- post(’/</w:t>
-      </w:r>
-      <w:proofErr w:type="spellStart"/>
-      <w:r>
-        <w:t>feltoltes</w:t>
-      </w:r>
-      <w:proofErr w:type="spellEnd"/>
-      <w:r>
-        <w:t>’)</w:t>
+        <w:t>- post(’/feltoltes’)</w:t>
       </w:r>
     </w:p>
     <w:p>
@@ -6008,23 +5256,7 @@
         <w:ind w:left="1843"/>
       </w:pPr>
       <w:r>
-        <w:t xml:space="preserve">- </w:t>
-      </w:r>
-      <w:proofErr w:type="spellStart"/>
-      <w:r>
-        <w:t>delete</w:t>
-      </w:r>
-      <w:proofErr w:type="spellEnd"/>
-      <w:r>
-        <w:t>(’/</w:t>
-      </w:r>
-      <w:proofErr w:type="spellStart"/>
-      <w:r>
-        <w:t>delete</w:t>
-      </w:r>
-      <w:proofErr w:type="spellEnd"/>
-      <w:r>
-        <w:t>’)</w:t>
+        <w:t>- delete(’/delete’)</w:t>
       </w:r>
     </w:p>
     <w:p/>
@@ -6042,23 +5274,10 @@
         <w:t>API) tesztelésére a</w:t>
       </w:r>
       <w:r>
-        <w:t xml:space="preserve"> </w:t>
-      </w:r>
-      <w:proofErr w:type="spellStart"/>
-      <w:r>
-        <w:t>Jest</w:t>
-      </w:r>
-      <w:proofErr w:type="spellEnd"/>
-      <w:r>
-        <w:t xml:space="preserve"> </w:t>
-      </w:r>
-      <w:proofErr w:type="spellStart"/>
-      <w:r>
-        <w:t>SuperTest-et</w:t>
-      </w:r>
-      <w:proofErr w:type="spellEnd"/>
-      <w:r>
-        <w:t xml:space="preserve"> használtuk,</w:t>
+        <w:t xml:space="preserve"> Jest</w:t>
+      </w:r>
+      <w:r>
+        <w:t xml:space="preserve"> SuperTest-et használtuk,</w:t>
       </w:r>
       <w:r>
         <w:t xml:space="preserve"> illetve a manuális teszt során, a Postman programban teszteltük, amíg a frontend nem lett hozzá készen.</w:t>
@@ -6594,7 +5813,6 @@
           <w:szCs w:val="24"/>
         </w:rPr>
       </w:pPr>
-      <w:proofErr w:type="spellStart"/>
       <w:r>
         <w:rPr>
           <w:rFonts w:eastAsia="Times New Roman" w:cs="Times New Roman"/>
@@ -6602,9 +5820,8 @@
           <w:bCs/>
           <w:szCs w:val="24"/>
         </w:rPr>
-        <w:t>SuperTest</w:t>
-      </w:r>
-      <w:proofErr w:type="spellEnd"/>
+        <w:t>SuperTest:</w:t>
+      </w:r>
       <w:r>
         <w:rPr>
           <w:rFonts w:eastAsia="Times New Roman" w:cs="Times New Roman"/>
@@ -6612,97 +5829,72 @@
           <w:bCs/>
           <w:szCs w:val="24"/>
         </w:rPr>
-        <w:t>:</w:t>
-      </w:r>
-      <w:r>
-        <w:rPr>
-          <w:rFonts w:eastAsia="Times New Roman" w:cs="Times New Roman"/>
-          <w:b/>
-          <w:bCs/>
+        <w:t xml:space="preserve"> </w:t>
+      </w:r>
+      <w:r>
+        <w:rPr>
+          <w:rFonts w:eastAsia="Times New Roman" w:cs="Times New Roman"/>
           <w:szCs w:val="24"/>
         </w:rPr>
+        <w:t>A</w:t>
+      </w:r>
+      <w:r>
+        <w:rPr>
+          <w:rFonts w:eastAsia="Times New Roman" w:cs="Times New Roman"/>
+          <w:szCs w:val="24"/>
+        </w:rPr>
+        <w:t xml:space="preserve"> JEST</w:t>
+      </w:r>
+      <w:r>
+        <w:rPr>
+          <w:rFonts w:eastAsia="Times New Roman" w:cs="Times New Roman"/>
+          <w:szCs w:val="24"/>
+        </w:rPr>
         <w:t xml:space="preserve"> </w:t>
       </w:r>
+      <w:proofErr w:type="gramStart"/>
       <w:r>
         <w:rPr>
           <w:rFonts w:eastAsia="Times New Roman" w:cs="Times New Roman"/>
           <w:szCs w:val="24"/>
         </w:rPr>
-        <w:t>A</w:t>
+        <w:t>tartalmazza</w:t>
       </w:r>
       <w:r>
         <w:rPr>
           <w:rFonts w:eastAsia="Times New Roman" w:cs="Times New Roman"/>
           <w:szCs w:val="24"/>
         </w:rPr>
-        <w:t xml:space="preserve"> JEST</w:t>
+        <w:t xml:space="preserve"> </w:t>
       </w:r>
       <w:r>
         <w:rPr>
           <w:rFonts w:eastAsia="Times New Roman" w:cs="Times New Roman"/>
           <w:szCs w:val="24"/>
         </w:rPr>
-        <w:t xml:space="preserve"> </w:t>
-      </w:r>
-      <w:proofErr w:type="gramStart"/>
+        <w:t>.</w:t>
+      </w:r>
       <w:r>
         <w:rPr>
           <w:rFonts w:eastAsia="Times New Roman" w:cs="Times New Roman"/>
           <w:szCs w:val="24"/>
         </w:rPr>
-        <w:t>tartalmazza</w:t>
+        <w:t>Eg</w:t>
       </w:r>
       <w:r>
         <w:rPr>
           <w:rFonts w:eastAsia="Times New Roman" w:cs="Times New Roman"/>
           <w:szCs w:val="24"/>
         </w:rPr>
-        <w:t xml:space="preserve"> </w:t>
-      </w:r>
+        <w:t>y</w:t>
+      </w:r>
+      <w:proofErr w:type="gramEnd"/>
       <w:r>
         <w:rPr>
           <w:rFonts w:eastAsia="Times New Roman" w:cs="Times New Roman"/>
           <w:szCs w:val="24"/>
         </w:rPr>
-        <w:t>.</w:t>
-      </w:r>
-      <w:r>
-        <w:rPr>
-          <w:rFonts w:eastAsia="Times New Roman" w:cs="Times New Roman"/>
-          <w:szCs w:val="24"/>
-        </w:rPr>
-        <w:t>Eg</w:t>
-      </w:r>
-      <w:r>
-        <w:rPr>
-          <w:rFonts w:eastAsia="Times New Roman" w:cs="Times New Roman"/>
-          <w:szCs w:val="24"/>
-        </w:rPr>
-        <w:t>y</w:t>
-      </w:r>
-      <w:proofErr w:type="gramEnd"/>
-      <w:r>
-        <w:rPr>
-          <w:rFonts w:eastAsia="Times New Roman" w:cs="Times New Roman"/>
-          <w:szCs w:val="24"/>
-        </w:rPr>
-        <w:t xml:space="preserve"> csomag, amit az </w:t>
-      </w:r>
-      <w:proofErr w:type="spellStart"/>
-      <w:r>
-        <w:rPr>
-          <w:rFonts w:eastAsia="Times New Roman" w:cs="Times New Roman"/>
-          <w:szCs w:val="24"/>
-        </w:rPr>
-        <w:t>npm</w:t>
-      </w:r>
-      <w:proofErr w:type="spellEnd"/>
-      <w:r>
-        <w:rPr>
-          <w:rFonts w:eastAsia="Times New Roman" w:cs="Times New Roman"/>
-          <w:szCs w:val="24"/>
-        </w:rPr>
-        <w:t xml:space="preserve"> csomagkezelővel lehet feltelepíteni, mely lehetővé teszi az API-k automatikus tesztelését, úgynevezett Unit teszteket lehet </w:t>
+        <w:t xml:space="preserve"> csomag, amit az npm csomagkezelővel lehet feltelepíteni, mely lehetővé teszi az API-k automatikus tesztelését, úgynevezett Unit teszteket lehet </w:t>
       </w:r>
       <w:r>
         <w:rPr>
@@ -6823,6 +6015,7 @@
           <w:rFonts w:eastAsia="Times New Roman" w:cs="Times New Roman"/>
           <w:b/>
           <w:bCs/>
+          <w:noProof/>
           <w:szCs w:val="24"/>
         </w:rPr>
         <w:drawing>
@@ -6881,134 +6074,38 @@
           <w:rFonts w:eastAsia="Times New Roman" w:cs="Times New Roman"/>
           <w:szCs w:val="24"/>
         </w:rPr>
-        <w:t>az /</w:t>
-      </w:r>
-      <w:proofErr w:type="spellStart"/>
+        <w:t xml:space="preserve">az /api végpontot, egy get kérést tesztelünk le. A describe egy api tesztet mutat, a test, a teszteset, </w:t>
+      </w:r>
+      <w:proofErr w:type="gramStart"/>
       <w:r>
         <w:rPr>
           <w:rFonts w:eastAsia="Times New Roman" w:cs="Times New Roman"/>
           <w:szCs w:val="24"/>
         </w:rPr>
-        <w:t>api</w:t>
-      </w:r>
-      <w:proofErr w:type="spellEnd"/>
+        <w:t>illetve</w:t>
+      </w:r>
+      <w:proofErr w:type="gramEnd"/>
       <w:r>
         <w:rPr>
           <w:rFonts w:eastAsia="Times New Roman" w:cs="Times New Roman"/>
           <w:szCs w:val="24"/>
         </w:rPr>
-        <w:t xml:space="preserve"> végpontot, egy </w:t>
-      </w:r>
-      <w:proofErr w:type="spellStart"/>
+        <w:t xml:space="preserve"> hogy mit várunk vissza. </w:t>
+      </w:r>
       <w:r>
         <w:rPr>
           <w:rFonts w:eastAsia="Times New Roman" w:cs="Times New Roman"/>
           <w:szCs w:val="24"/>
         </w:rPr>
-        <w:t>get</w:t>
-      </w:r>
-      <w:proofErr w:type="spellEnd"/>
+        <w:t xml:space="preserve">Egy valós függvény adatait, Mock-oljuk, tehát nem </w:t>
+      </w:r>
       <w:r>
         <w:rPr>
           <w:rFonts w:eastAsia="Times New Roman" w:cs="Times New Roman"/>
           <w:szCs w:val="24"/>
         </w:rPr>
-        <w:t xml:space="preserve"> kérést tesztelünk le. A </w:t>
-      </w:r>
-      <w:proofErr w:type="spellStart"/>
-      <w:r>
-        <w:rPr>
-          <w:rFonts w:eastAsia="Times New Roman" w:cs="Times New Roman"/>
-          <w:szCs w:val="24"/>
-        </w:rPr>
-        <w:t>describe</w:t>
-      </w:r>
-      <w:proofErr w:type="spellEnd"/>
-      <w:r>
-        <w:rPr>
-          <w:rFonts w:eastAsia="Times New Roman" w:cs="Times New Roman"/>
-          <w:szCs w:val="24"/>
-        </w:rPr>
-        <w:t xml:space="preserve"> egy </w:t>
-      </w:r>
-      <w:proofErr w:type="spellStart"/>
-      <w:r>
-        <w:rPr>
-          <w:rFonts w:eastAsia="Times New Roman" w:cs="Times New Roman"/>
-          <w:szCs w:val="24"/>
-        </w:rPr>
-        <w:t>api</w:t>
-      </w:r>
-      <w:proofErr w:type="spellEnd"/>
-      <w:r>
-        <w:rPr>
-          <w:rFonts w:eastAsia="Times New Roman" w:cs="Times New Roman"/>
-          <w:szCs w:val="24"/>
-        </w:rPr>
-        <w:t xml:space="preserve"> tesztet mutat, a test, a teszteset, </w:t>
-      </w:r>
-      <w:proofErr w:type="gramStart"/>
-      <w:r>
-        <w:rPr>
-          <w:rFonts w:eastAsia="Times New Roman" w:cs="Times New Roman"/>
-          <w:szCs w:val="24"/>
-        </w:rPr>
-        <w:t>illetve</w:t>
-      </w:r>
-      <w:proofErr w:type="gramEnd"/>
-      <w:r>
-        <w:rPr>
-          <w:rFonts w:eastAsia="Times New Roman" w:cs="Times New Roman"/>
-          <w:szCs w:val="24"/>
-        </w:rPr>
-        <w:t xml:space="preserve"> hogy mit várunk vissza. </w:t>
-      </w:r>
-      <w:r>
-        <w:rPr>
-          <w:rFonts w:eastAsia="Times New Roman" w:cs="Times New Roman"/>
-          <w:szCs w:val="24"/>
-        </w:rPr>
-        <w:t xml:space="preserve">Egy valós függvény adatait, </w:t>
-      </w:r>
-      <w:proofErr w:type="spellStart"/>
-      <w:r>
-        <w:rPr>
-          <w:rFonts w:eastAsia="Times New Roman" w:cs="Times New Roman"/>
-          <w:szCs w:val="24"/>
-        </w:rPr>
-        <w:t>Mock-oljuk</w:t>
-      </w:r>
-      <w:proofErr w:type="spellEnd"/>
-      <w:r>
-        <w:rPr>
-          <w:rFonts w:eastAsia="Times New Roman" w:cs="Times New Roman"/>
-          <w:szCs w:val="24"/>
-        </w:rPr>
-        <w:t xml:space="preserve">, tehát nem </w:t>
-      </w:r>
-      <w:r>
-        <w:rPr>
-          <w:rFonts w:eastAsia="Times New Roman" w:cs="Times New Roman"/>
-          <w:szCs w:val="24"/>
-        </w:rPr>
         <w:lastRenderedPageBreak/>
-        <w:t xml:space="preserve">valós adatbázis kapcsolat, nem valós adatokkal dolgozunk a tesztelés során. Az </w:t>
-      </w:r>
-      <w:proofErr w:type="spellStart"/>
-      <w:r>
-        <w:rPr>
-          <w:rFonts w:eastAsia="Times New Roman" w:cs="Times New Roman"/>
-          <w:szCs w:val="24"/>
-        </w:rPr>
-        <w:t>except</w:t>
-      </w:r>
-      <w:proofErr w:type="spellEnd"/>
-      <w:r>
-        <w:rPr>
-          <w:rFonts w:eastAsia="Times New Roman" w:cs="Times New Roman"/>
-          <w:szCs w:val="24"/>
-        </w:rPr>
-        <w:t xml:space="preserve">-ek, azok, amiket vissza </w:t>
+        <w:t xml:space="preserve">valós adatbázis kapcsolat, nem valós adatokkal dolgozunk a tesztelés során. Az except-ek, azok, amiket vissza </w:t>
       </w:r>
       <w:proofErr w:type="gramStart"/>
       <w:r>
@@ -7168,240 +6265,116 @@
         </w:rPr>
         <w:t>szemben(</w:t>
       </w:r>
-      <w:proofErr w:type="spellStart"/>
       <w:proofErr w:type="gramEnd"/>
       <w:r>
         <w:rPr>
           <w:rFonts w:eastAsia="Times New Roman" w:cs="Times New Roman"/>
           <w:szCs w:val="24"/>
         </w:rPr>
-        <w:t>node</w:t>
-      </w:r>
-      <w:proofErr w:type="spellEnd"/>
-      <w:r>
+        <w:t>node server) ezt, az npx(Node Package Executor)-al kell elindítani.</w:t>
+      </w:r>
+    </w:p>
+    <w:p>
+      <w:pPr>
         <w:rPr>
           <w:rFonts w:eastAsia="Times New Roman" w:cs="Times New Roman"/>
           <w:szCs w:val="24"/>
         </w:rPr>
-        <w:t xml:space="preserve"> server) ezt, az </w:t>
-      </w:r>
-      <w:proofErr w:type="spellStart"/>
+      </w:pPr>
       <w:r>
         <w:rPr>
           <w:rFonts w:eastAsia="Times New Roman" w:cs="Times New Roman"/>
           <w:szCs w:val="24"/>
         </w:rPr>
-        <w:t>npx</w:t>
-      </w:r>
-      <w:proofErr w:type="spellEnd"/>
+        <w:t xml:space="preserve">parancs: </w:t>
+      </w:r>
       <w:r>
         <w:rPr>
           <w:rFonts w:eastAsia="Times New Roman" w:cs="Times New Roman"/>
           <w:szCs w:val="24"/>
         </w:rPr>
-        <w:t>(</w:t>
-      </w:r>
-      <w:proofErr w:type="spellStart"/>
+        <w:t xml:space="preserve">npx jest </w:t>
+      </w:r>
       <w:r>
         <w:rPr>
           <w:rFonts w:eastAsia="Times New Roman" w:cs="Times New Roman"/>
           <w:szCs w:val="24"/>
         </w:rPr>
-        <w:t>Node</w:t>
-      </w:r>
-      <w:proofErr w:type="spellEnd"/>
+        <w:t>--</w:t>
+      </w:r>
       <w:r>
         <w:rPr>
           <w:rFonts w:eastAsia="Times New Roman" w:cs="Times New Roman"/>
           <w:szCs w:val="24"/>
         </w:rPr>
+        <w:t>detectOpenHandles</w:t>
+      </w:r>
+    </w:p>
+    <w:p>
+      <w:pPr>
+        <w:rPr>
+          <w:noProof/>
+        </w:rPr>
+      </w:pPr>
+      <w:r>
+        <w:rPr>
+          <w:rFonts w:eastAsia="Times New Roman" w:cs="Times New Roman"/>
+          <w:szCs w:val="24"/>
+        </w:rPr>
+        <w:t>A -- detectOpenHandles, azért szükséges, mert ha esetleg, a tesztelés nem állna le magától, a parancsra, akkor ez leállítja, miután a teszt visszaadta az eredményt.</w:t>
+      </w:r>
+      <w:r>
+        <w:rPr>
+          <w:noProof/>
+        </w:rPr>
         <w:t xml:space="preserve"> </w:t>
       </w:r>
-      <w:proofErr w:type="spellStart"/>
-      <w:r>
+    </w:p>
+    <w:p>
+      <w:pPr>
+        <w:rPr>
+          <w:noProof/>
+        </w:rPr>
+      </w:pPr>
+    </w:p>
+    <w:p>
+      <w:pPr>
+        <w:rPr>
+          <w:noProof/>
+        </w:rPr>
+      </w:pPr>
+      <w:r>
+        <w:rPr>
+          <w:noProof/>
+        </w:rPr>
+        <w:t>Tesztelési Eredmény:</w:t>
+      </w:r>
+    </w:p>
+    <w:p>
+      <w:pPr>
         <w:rPr>
           <w:rFonts w:eastAsia="Times New Roman" w:cs="Times New Roman"/>
           <w:szCs w:val="24"/>
         </w:rPr>
-        <w:t>Package</w:t>
-      </w:r>
-      <w:proofErr w:type="spellEnd"/>
-      <w:r>
+      </w:pPr>
+    </w:p>
+    <w:p>
+      <w:pPr>
         <w:rPr>
           <w:rFonts w:eastAsia="Times New Roman" w:cs="Times New Roman"/>
           <w:szCs w:val="24"/>
         </w:rPr>
-        <w:t xml:space="preserve"> </w:t>
-      </w:r>
-      <w:proofErr w:type="spellStart"/>
+      </w:pPr>
       <w:r>
         <w:rPr>
           <w:rFonts w:eastAsia="Times New Roman" w:cs="Times New Roman"/>
           <w:szCs w:val="24"/>
         </w:rPr>
-        <w:t>Executor</w:t>
-      </w:r>
-      <w:proofErr w:type="spellEnd"/>
-      <w:r>
-        <w:rPr>
-          <w:rFonts w:eastAsia="Times New Roman" w:cs="Times New Roman"/>
-          <w:szCs w:val="24"/>
-        </w:rPr>
-        <w:t>)-</w:t>
-      </w:r>
-      <w:proofErr w:type="spellStart"/>
-      <w:r>
-        <w:rPr>
-          <w:rFonts w:eastAsia="Times New Roman" w:cs="Times New Roman"/>
-          <w:szCs w:val="24"/>
-        </w:rPr>
-        <w:t>al</w:t>
-      </w:r>
-      <w:proofErr w:type="spellEnd"/>
-      <w:r>
-        <w:rPr>
-          <w:rFonts w:eastAsia="Times New Roman" w:cs="Times New Roman"/>
-          <w:szCs w:val="24"/>
-        </w:rPr>
-        <w:t xml:space="preserve"> kell elindítani.</w:t>
-      </w:r>
-    </w:p>
-    <w:p>
-      <w:pPr>
-        <w:rPr>
-          <w:rFonts w:eastAsia="Times New Roman" w:cs="Times New Roman"/>
-          <w:szCs w:val="24"/>
-        </w:rPr>
-      </w:pPr>
-      <w:r>
-        <w:rPr>
-          <w:rFonts w:eastAsia="Times New Roman" w:cs="Times New Roman"/>
-          <w:szCs w:val="24"/>
-        </w:rPr>
-        <w:t xml:space="preserve">parancs: </w:t>
-      </w:r>
-      <w:proofErr w:type="spellStart"/>
-      <w:r>
-        <w:rPr>
-          <w:rFonts w:eastAsia="Times New Roman" w:cs="Times New Roman"/>
-          <w:szCs w:val="24"/>
-        </w:rPr>
-        <w:t>npx</w:t>
-      </w:r>
-      <w:proofErr w:type="spellEnd"/>
-      <w:r>
-        <w:rPr>
-          <w:rFonts w:eastAsia="Times New Roman" w:cs="Times New Roman"/>
-          <w:szCs w:val="24"/>
-        </w:rPr>
-        <w:t xml:space="preserve"> </w:t>
-      </w:r>
-      <w:proofErr w:type="spellStart"/>
-      <w:r>
-        <w:rPr>
-          <w:rFonts w:eastAsia="Times New Roman" w:cs="Times New Roman"/>
-          <w:szCs w:val="24"/>
-        </w:rPr>
-        <w:t>jest</w:t>
-      </w:r>
-      <w:proofErr w:type="spellEnd"/>
-      <w:r>
-        <w:rPr>
-          <w:rFonts w:eastAsia="Times New Roman" w:cs="Times New Roman"/>
-          <w:szCs w:val="24"/>
-        </w:rPr>
-        <w:t xml:space="preserve"> </w:t>
-      </w:r>
-      <w:r>
-        <w:rPr>
-          <w:rFonts w:eastAsia="Times New Roman" w:cs="Times New Roman"/>
-          <w:szCs w:val="24"/>
-        </w:rPr>
-        <w:t>--</w:t>
-      </w:r>
-      <w:proofErr w:type="spellStart"/>
-      <w:r>
-        <w:rPr>
-          <w:rFonts w:eastAsia="Times New Roman" w:cs="Times New Roman"/>
-          <w:szCs w:val="24"/>
-        </w:rPr>
-        <w:t>detectOpenHandles</w:t>
-      </w:r>
-      <w:proofErr w:type="spellEnd"/>
-    </w:p>
-    <w:p>
-      <w:pPr>
-        <w:rPr>
-          <w:noProof/>
-        </w:rPr>
-      </w:pPr>
-      <w:r>
-        <w:rPr>
-          <w:rFonts w:eastAsia="Times New Roman" w:cs="Times New Roman"/>
-          <w:szCs w:val="24"/>
-        </w:rPr>
-        <w:t xml:space="preserve">A -- </w:t>
-      </w:r>
-      <w:proofErr w:type="spellStart"/>
-      <w:r>
-        <w:rPr>
-          <w:rFonts w:eastAsia="Times New Roman" w:cs="Times New Roman"/>
-          <w:szCs w:val="24"/>
-        </w:rPr>
-        <w:t>detectOpenHandles</w:t>
-      </w:r>
-      <w:proofErr w:type="spellEnd"/>
-      <w:r>
-        <w:rPr>
-          <w:rFonts w:eastAsia="Times New Roman" w:cs="Times New Roman"/>
-          <w:szCs w:val="24"/>
-        </w:rPr>
-        <w:t>, azért szükséges, mert ha esetleg, a tesztelés nem állna le magától, a parancsra, akkor ez leállítja, miután a teszt visszaadta az eredményt.</w:t>
-      </w:r>
-      <w:r>
-        <w:rPr>
-          <w:noProof/>
-        </w:rPr>
-        <w:t xml:space="preserve"> </w:t>
-      </w:r>
-    </w:p>
-    <w:p>
-      <w:pPr>
-        <w:rPr>
-          <w:noProof/>
-        </w:rPr>
-      </w:pPr>
-    </w:p>
-    <w:p>
-      <w:pPr>
-        <w:rPr>
-          <w:noProof/>
-        </w:rPr>
-      </w:pPr>
-      <w:r>
-        <w:rPr>
-          <w:noProof/>
-        </w:rPr>
-        <w:t>Tesztelési Eredmény:</w:t>
-      </w:r>
-    </w:p>
-    <w:p>
-      <w:pPr>
-        <w:rPr>
-          <w:rFonts w:eastAsia="Times New Roman" w:cs="Times New Roman"/>
-          <w:szCs w:val="24"/>
-        </w:rPr>
-      </w:pPr>
-      <w:r>
-        <w:rPr>
-          <w:rFonts w:eastAsia="Times New Roman" w:cs="Times New Roman"/>
-          <w:szCs w:val="24"/>
-        </w:rPr>
         <w:drawing>
-          <wp:inline distT="0" distB="0" distL="0" distR="0" wp14:anchorId="74E39104" wp14:editId="593F2A08">
-            <wp:extent cx="4544059" cy="1543265"/>
-            <wp:effectExtent l="0" t="0" r="9525" b="0"/>
-            <wp:docPr id="44" name="Kép 44"/>
+          <wp:inline distT="0" distB="0" distL="0" distR="0" wp14:anchorId="0837B379" wp14:editId="2F9342C3">
+            <wp:extent cx="5255813" cy="2708427"/>
+            <wp:effectExtent l="0" t="0" r="2540" b="0"/>
+            <wp:docPr id="46" name="Kép 46"/>
             <wp:cNvGraphicFramePr>
               <a:graphicFrameLocks xmlns:a="http://schemas.openxmlformats.org/drawingml/2006/main" noChangeAspect="1"/>
             </wp:cNvGraphicFramePr>
@@ -7421,7 +6394,7 @@
                   <pic:spPr>
                     <a:xfrm>
                       <a:off x="0" y="0"/>
-                      <a:ext cx="4544059" cy="1543265"/>
+                      <a:ext cx="5270155" cy="2715817"/>
                     </a:xfrm>
                     <a:prstGeom prst="rect">
                       <a:avLst/>
@@ -7441,6 +6414,29 @@
           <w:szCs w:val="24"/>
         </w:rPr>
       </w:pPr>
+      <w:r>
+        <w:rPr>
+          <w:rFonts w:eastAsia="Times New Roman" w:cs="Times New Roman"/>
+          <w:szCs w:val="24"/>
+        </w:rPr>
+        <w:t xml:space="preserve">Itt a </w:t>
+      </w:r>
+      <w:proofErr w:type="gramStart"/>
+      <w:r>
+        <w:rPr>
+          <w:rFonts w:eastAsia="Times New Roman" w:cs="Times New Roman"/>
+          <w:szCs w:val="24"/>
+        </w:rPr>
+        <w:t>GET</w:t>
+      </w:r>
+      <w:proofErr w:type="gramEnd"/>
+      <w:r>
+        <w:rPr>
+          <w:rFonts w:eastAsia="Times New Roman" w:cs="Times New Roman"/>
+          <w:szCs w:val="24"/>
+        </w:rPr>
+        <w:t xml:space="preserve"> illetve a POST is sikeres eredményt adott vissza</w:t>
+      </w:r>
     </w:p>
     <w:p>
       <w:pPr>
@@ -7654,21 +6650,7 @@
         <w:rPr>
           <w:rFonts w:eastAsia="Times New Roman" w:cs="Times New Roman"/>
         </w:rPr>
-        <w:t xml:space="preserve"> Backend Szerver kezeli, mikor megváltozik az </w:t>
-      </w:r>
-      <w:proofErr w:type="spellStart"/>
-      <w:r>
-        <w:rPr>
-          <w:rFonts w:eastAsia="Times New Roman" w:cs="Times New Roman"/>
-        </w:rPr>
-        <w:t>id</w:t>
-      </w:r>
-      <w:proofErr w:type="spellEnd"/>
-      <w:r>
-        <w:rPr>
-          <w:rFonts w:eastAsia="Times New Roman" w:cs="Times New Roman"/>
-        </w:rPr>
-        <w:t xml:space="preserve"> egy külön met</w:t>
+        <w:t xml:space="preserve"> Backend Szerver kezeli, mikor megváltozik az id egy külön met</w:t>
       </w:r>
       <w:r>
         <w:rPr>
@@ -7706,63 +6688,7 @@
         <w:rPr>
           <w:rFonts w:eastAsia="Times New Roman" w:cs="Times New Roman"/>
         </w:rPr>
-        <w:t xml:space="preserve"> </w:t>
-      </w:r>
-      <w:proofErr w:type="spellStart"/>
-      <w:r>
-        <w:rPr>
-          <w:rFonts w:eastAsia="Times New Roman" w:cs="Times New Roman"/>
-        </w:rPr>
-        <w:t>idHandler</w:t>
-      </w:r>
-      <w:proofErr w:type="spellEnd"/>
-      <w:r>
-        <w:rPr>
-          <w:rFonts w:eastAsia="Times New Roman" w:cs="Times New Roman"/>
-        </w:rPr>
-        <w:t xml:space="preserve"> metódus, </w:t>
-      </w:r>
-      <w:proofErr w:type="spellStart"/>
-      <w:r>
-        <w:rPr>
-          <w:rFonts w:eastAsia="Times New Roman" w:cs="Times New Roman"/>
-        </w:rPr>
-        <w:t>újraosztja</w:t>
-      </w:r>
-      <w:proofErr w:type="spellEnd"/>
-      <w:r>
-        <w:rPr>
-          <w:rFonts w:eastAsia="Times New Roman" w:cs="Times New Roman"/>
-        </w:rPr>
-        <w:t xml:space="preserve"> az </w:t>
-      </w:r>
-      <w:proofErr w:type="spellStart"/>
-      <w:r>
-        <w:rPr>
-          <w:rFonts w:eastAsia="Times New Roman" w:cs="Times New Roman"/>
-        </w:rPr>
-        <w:t>id</w:t>
-      </w:r>
-      <w:proofErr w:type="spellEnd"/>
-      <w:r>
-        <w:rPr>
-          <w:rFonts w:eastAsia="Times New Roman" w:cs="Times New Roman"/>
-        </w:rPr>
-        <w:t xml:space="preserve">-t, így, mindig a valós </w:t>
-      </w:r>
-      <w:proofErr w:type="spellStart"/>
-      <w:r>
-        <w:rPr>
-          <w:rFonts w:eastAsia="Times New Roman" w:cs="Times New Roman"/>
-        </w:rPr>
-        <w:t>id</w:t>
-      </w:r>
-      <w:proofErr w:type="spellEnd"/>
-      <w:r>
-        <w:rPr>
-          <w:rFonts w:eastAsia="Times New Roman" w:cs="Times New Roman"/>
-        </w:rPr>
-        <w:t xml:space="preserve"> számát kapjuk az adott terméknek</w:t>
+        <w:t xml:space="preserve"> idHandler metódus, újraosztja az id-t, így, mindig a valós id számát kapjuk az adott terméknek</w:t>
       </w:r>
       <w:r>
         <w:rPr>
@@ -7795,15 +6721,7 @@
         <w:jc w:val="left"/>
       </w:pPr>
       <w:r>
-        <w:t xml:space="preserve">A Frontend azon része egy weboldalnak vagy alkalmazásnak, amit a felhasználó tud látni és </w:t>
-      </w:r>
-      <w:proofErr w:type="spellStart"/>
-      <w:r>
-        <w:t>interaktálni</w:t>
-      </w:r>
-      <w:proofErr w:type="spellEnd"/>
-      <w:r>
-        <w:t xml:space="preserve"> vele, bele értve a megjelenés, a gombok és maga a tartalom. A weboldal elkészítéséhez</w:t>
+        <w:t>A Frontend azon része egy weboldalnak vagy alkalmazásnak, amit a felhasználó tud látni és interaktálni vele, bele értve a megjelenés, a gombok és maga a tartalom. A weboldal elkészítéséhez</w:t>
       </w:r>
       <w:r>
         <w:t xml:space="preserve"> a HTML, CSS és JavaScript </w:t>
@@ -7896,15 +6814,7 @@
         <w:t>A frontend, több hónapos munkája után, a kinézetet elkészítettük, és véglegessé formáltuk.</w:t>
       </w:r>
       <w:r>
-        <w:t xml:space="preserve"> A </w:t>
-      </w:r>
-      <w:proofErr w:type="spellStart"/>
-      <w:r>
-        <w:t>logo</w:t>
-      </w:r>
-      <w:proofErr w:type="spellEnd"/>
-      <w:r>
-        <w:t>-t az egyik csapat tag készítette, az alsó képeket, AI generálta.</w:t>
+        <w:t xml:space="preserve"> A logo-t az egyik csapat tag készítette, az alsó képeket, AI generálta.</w:t>
       </w:r>
     </w:p>
     <w:p>
@@ -8617,14 +7527,9 @@
       <w:r>
         <w:t>(</w:t>
       </w:r>
-      <w:proofErr w:type="spellStart"/>
       <w:proofErr w:type="gramEnd"/>
       <w:r>
-        <w:t>Embedded</w:t>
-      </w:r>
-      <w:proofErr w:type="spellEnd"/>
-      <w:r>
-        <w:t xml:space="preserve"> JavaScript)</w:t>
+        <w:t>Embedded JavaScript)</w:t>
       </w:r>
       <w:r>
         <w:t>: Az adatbázisból érkező értékek beágyazását segítette elő.</w:t>
@@ -8787,23 +7692,7 @@
           <w:b/>
           <w:bCs/>
         </w:rPr>
-        <w:t xml:space="preserve">(EJS értékadás: &lt;%= </w:t>
-      </w:r>
-      <w:proofErr w:type="spellStart"/>
-      <w:r>
-        <w:rPr>
-          <w:b/>
-          <w:bCs/>
-        </w:rPr>
-        <w:t>foodName</w:t>
-      </w:r>
-      <w:proofErr w:type="spellEnd"/>
-      <w:r>
-        <w:rPr>
-          <w:b/>
-          <w:bCs/>
-        </w:rPr>
-        <w:t xml:space="preserve"> %&gt;)</w:t>
+        <w:t>(EJS értékadás: &lt;%= foodName %&gt;)</w:t>
       </w:r>
     </w:p>
     <w:p>
@@ -8822,49 +7711,27 @@
         <w:spacing w:line="259" w:lineRule="auto"/>
         <w:jc w:val="left"/>
       </w:pPr>
-      <w:proofErr w:type="spellStart"/>
       <w:r>
         <w:rPr>
           <w:b/>
           <w:bCs/>
         </w:rPr>
         <w:lastRenderedPageBreak/>
-        <w:t>Admin</w:t>
-      </w:r>
-      <w:proofErr w:type="spellEnd"/>
+        <w:t>Admin Applikáció</w:t>
+      </w:r>
       <w:r>
         <w:rPr>
           <w:b/>
           <w:bCs/>
         </w:rPr>
-        <w:t xml:space="preserve"> Applikáció</w:t>
-      </w:r>
-      <w:r>
-        <w:rPr>
-          <w:b/>
-          <w:bCs/>
-        </w:rPr>
         <w:t xml:space="preserve">: </w:t>
       </w:r>
       <w:r>
-        <w:t xml:space="preserve">Az </w:t>
-      </w:r>
-      <w:proofErr w:type="spellStart"/>
-      <w:r>
-        <w:t>admin</w:t>
-      </w:r>
-      <w:proofErr w:type="spellEnd"/>
-      <w:r>
-        <w:t xml:space="preserve"> applikáció, Visual </w:t>
-      </w:r>
-      <w:proofErr w:type="spellStart"/>
+        <w:t xml:space="preserve">Az admin applikáció, Visual </w:t>
+      </w:r>
       <w:proofErr w:type="gramStart"/>
       <w:r>
-        <w:t>Studio</w:t>
-      </w:r>
-      <w:proofErr w:type="spellEnd"/>
-      <w:r>
-        <w:t>(</w:t>
+        <w:t>Studio(</w:t>
       </w:r>
       <w:proofErr w:type="gramEnd"/>
       <w:r>
@@ -8881,14 +7748,7 @@
       </w:r>
       <w:r>
         <w:br/>
-      </w:r>
-      <w:proofErr w:type="spellStart"/>
-      <w:r>
-        <w:t>Admin</w:t>
-      </w:r>
-      <w:proofErr w:type="spellEnd"/>
-      <w:r>
-        <w:t xml:space="preserve"> applikációnak a feladata, hogy egy újonnan felregisztrált felhasználó fiókját aktiválni lehessen, ez egyfajta moderálási jogkört ad, hogyha </w:t>
+        <w:t xml:space="preserve">Admin applikációnak a feladata, hogy egy újonnan felregisztrált felhasználó fiókját aktiválni lehessen, ez egyfajta moderálási jogkört ad, hogyha </w:t>
       </w:r>
       <w:r>
         <w:t xml:space="preserve">valaki </w:t>
@@ -9056,7 +7916,7 @@
               </wp:anchor>
             </w:drawing>
           </mc:Choice>
-          <mc:Fallback xmlns:a14="http://schemas.microsoft.com/office/drawing/2010/main" xmlns:pic="http://schemas.openxmlformats.org/drawingml/2006/picture" xmlns:a="http://schemas.openxmlformats.org/drawingml/2006/main">
+          <mc:Fallback xmlns:a="http://schemas.openxmlformats.org/drawingml/2006/main" xmlns:pic="http://schemas.openxmlformats.org/drawingml/2006/picture" xmlns:a14="http://schemas.microsoft.com/office/drawing/2010/main">
             <w:pict>
               <v:shape id="Derékszögű háromszög 7" style="position:absolute;margin-left:0;margin-top:-71pt;width:190.5pt;height:190.5pt;rotation:90;z-index:251670528;visibility:visible;mso-wrap-style:square;mso-width-percent:0;mso-wrap-distance-left:9pt;mso-wrap-distance-top:0;mso-wrap-distance-right:9pt;mso-wrap-distance-bottom:0;mso-position-horizontal:left;mso-position-horizontal-relative:page;mso-position-vertical:absolute;mso-position-vertical-relative:text;mso-width-percent:0;mso-width-relative:margin;v-text-anchor:middle" coordsize="2419350,2419350" o:spid="_x0000_s1026" fillcolor="#ed7d31 [3205]" stroked="f" strokeweight="1pt" path="m,2419350l,c806450,806450,-382154,2206666,2419350,2419350l,2419350xe" o:gfxdata="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" w14:anchorId="3D992DA4">
                 <v:stroke joinstyle="miter"/>
@@ -9141,15 +8001,7 @@
         <w:t>(</w:t>
       </w:r>
       <w:r>
-        <w:t xml:space="preserve">A JEST </w:t>
-      </w:r>
-      <w:proofErr w:type="spellStart"/>
-      <w:r>
-        <w:t>SuperTest</w:t>
-      </w:r>
-      <w:proofErr w:type="spellEnd"/>
-      <w:r>
-        <w:t xml:space="preserve"> csomagját felhasználva</w:t>
+        <w:t>A JEST SuperTest csomagját felhasználva</w:t>
       </w:r>
       <w:r>
         <w:t>, pársoros kódrészeket írtunk, a végpontok automatikus tesztelésére. Ezt egy külön indítási módszerrel kell elindítani, és akkor fog lefutni a teszt.</w:t>
@@ -9326,7 +8178,7 @@
               </wp:anchor>
             </w:drawing>
           </mc:Choice>
-          <mc:Fallback xmlns:a14="http://schemas.microsoft.com/office/drawing/2010/main" xmlns:pic="http://schemas.openxmlformats.org/drawingml/2006/picture" xmlns:a="http://schemas.openxmlformats.org/drawingml/2006/main">
+          <mc:Fallback xmlns:a="http://schemas.openxmlformats.org/drawingml/2006/main" xmlns:pic="http://schemas.openxmlformats.org/drawingml/2006/picture" xmlns:a14="http://schemas.microsoft.com/office/drawing/2010/main">
             <w:pict>
               <v:shape id="Derékszögű háromszög 7" style="position:absolute;margin-left:0;margin-top:-71.35pt;width:190.5pt;height:190.5pt;rotation:90;z-index:251672576;visibility:visible;mso-wrap-style:square;mso-width-percent:0;mso-wrap-distance-left:9pt;mso-wrap-distance-top:0;mso-wrap-distance-right:9pt;mso-wrap-distance-bottom:0;mso-position-horizontal:left;mso-position-horizontal-relative:page;mso-position-vertical:absolute;mso-position-vertical-relative:text;mso-width-percent:0;mso-width-relative:margin;v-text-anchor:middle" coordsize="2419350,2419350" o:spid="_x0000_s1026" fillcolor="#ed7d31 [3205]" stroked="f" strokeweight="1pt" path="m,2419350l,c806450,806450,-382154,2206666,2419350,2419350l,2419350xe" o:gfxdata="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" w14:anchorId="0AF53019">
                 <v:stroke joinstyle="miter"/>
@@ -9362,13 +8214,8 @@
     </w:p>
     <w:p/>
     <w:p>
-      <w:proofErr w:type="spellStart"/>
-      <w:r>
-        <w:t>Admin</w:t>
-      </w:r>
-      <w:proofErr w:type="spellEnd"/>
-      <w:r>
-        <w:t xml:space="preserve"> felületen nagyobb jogkör, illetve szebb kinézet</w:t>
+      <w:r>
+        <w:t>Admin felületen nagyobb jogkör, illetve szebb kinézet</w:t>
       </w:r>
     </w:p>
     <w:sectPr>

</xml_diff>